<commit_message>
Paper: replace descriptive tables with prose, add results figure, keep references on one page
- Fold the model-pool and routing-policy tables into the text; drop the
  evaluation-design diagram and the Algorithm 1 box (it repeated Eqs. 3-5).
- Add a results figure (cumulative reward per policy; accuracy vs. cost)
  drawn from results/gsm8k_pilot_models_4090/results.json.
- Add an error analysis of the GSM8K outcomes and a System Implementation
  section (router package, FastAPI /route, /feedback, /stats, audit log, web UI).
- Keep the REFERENCES heading with the list; all 24 references are on page 6.

Co-Authored-By: Claude Opus 5.5 <noreply@anthropic.com>
Claude-Session: https://claude.ai/code/session_01AcTDn63VcP6Nv3uyNpnTqr
</commit_message>
<xml_diff>
--- a/paper/Adaptive_LLM_Model_Routing_IEEE_Paper.docx
+++ b/paper/Adaptive_LLM_Model_Routing_IEEE_Paper.docx
@@ -533,721 +533,8 @@
           <w:rFonts w:ascii="Times New Roman" w:hAnsi="Times New Roman"/>
           <w:sz w:val="20"/>
         </w:rPr>
-        <w:t xml:space="preserve">The pool contains three Qwen3 models of different sizes [21] (Table I). One family keeps tokenizer, prompt format, and training recipe fixed, so differences are driven mainly by scale. All three are served with vLLM [22] through one OpenAI-compatible interface on a single NVIDIA RTX 4090 (24 GB). Because bf16 Qwen3-14B does not fit in 24 GB, Qwen's official FP8 checkpoints are used for all three models so precision is identical across the pool. Decoding is greedy (temperature 0, seed 0) with at most 1,024 output tokens, a 120 s timeout, and thinking mode disabled [21]. The models are served one at a time. Cost is a compute proxy: the per-1k-token rate in Table I times the request's input plus output tokens.</w:t>
+        <w:t xml:space="preserve">The pool contains three Qwen3 models of different sizes [21]: Qwen3-4B as the small model, Qwen3-8B as the medium model, and Qwen3-14B as the large model, loaded from the official checkpoints Qwen/Qwen3-4B-FP8, Qwen/Qwen3-8B-FP8, and Qwen/Qwen3-14B-FP8. One family keeps tokenizer, prompt format, and training recipe fixed, so differences are driven mainly by scale. All three are served with vLLM [22] through one OpenAI-compatible interface on a single NVIDIA RTX 4090 (24 GB). Because bf16 Qwen3-14B does not fit in 24 GB, Qwen's official FP8 checkpoints are used for all three models so precision is identical across the pool. Decoding is greedy (temperature 0, seed 0) with at most 1,024 output tokens, a 120 s timeout, and thinking mode disabled [21]. The models are served one at a time. Cost is a compute proxy: the per-1k-token rate (4.0, 8.0, and 14.0 units per 1,000 tokens for the three sizes) times the request's input plus output tokens, so larger models cost more for the same answer and longer answers cost more on any model.</w:t>
       </w:r>
-    </w:p>
-    <w:p>
-      <w:pPr>
-        <w:sectPr>
-          <w:type w:val="continuous"/>
-          <w:pgSz w:w="11909" w:h="16834"/>
-          <w:pgMar w:top="778" w:right="893" w:bottom="1440" w:left="893" w:header="288" w:footer="360" w:gutter="0"/>
-          <w:cols w:space="360" w:num="2"/>
-          <w:docGrid w:linePitch="360"/>
-        </w:sectPr>
-      </w:pPr>
-    </w:p>
-    <w:p>
-      <w:pPr>
-        <w:keepNext/>
-        <w:spacing w:before="60" w:after="40"/>
-        <w:jc w:val="center"/>
-      </w:pPr>
-      <w:r>
-        <w:rPr>
-          <w:rFonts w:ascii="Times New Roman" w:hAnsi="Times New Roman"/>
-          <w:b/>
-          <w:sz w:val="16"/>
-        </w:rPr>
-        <w:t>TABLE I</w:t>
-        <w:br/>
-        <w:t xml:space="preserve">CANDIDATE MODEL POOL AS RUN IN THE PILOT</w:t>
-      </w:r>
-    </w:p>
-    <w:tbl>
-      <w:tblPr>
-        <w:tblW w:type="dxa" w:w="10123"/>
-        <w:jc w:val="center"/>
-        <w:tblBorders>
-          <w:top w:val="single" w:sz="4" w:color="808080"/>
-          <w:left w:val="single" w:sz="4" w:color="808080"/>
-          <w:bottom w:val="single" w:sz="4" w:color="808080"/>
-          <w:right w:val="single" w:sz="4" w:color="808080"/>
-          <w:insideH w:val="single" w:sz="4" w:color="808080"/>
-          <w:insideV w:val="single" w:sz="4" w:color="808080"/>
-        </w:tblBorders>
-        <w:tblLayout w:type="fixed"/>
-        <w:tblLook w:val="04A0" w:firstRow="1" w:lastRow="0" w:firstColumn="1" w:lastColumn="0" w:noHBand="0" w:noVBand="1"/>
-      </w:tblPr>
-      <w:tblGrid>
-        <w:gridCol w:w="900"/>
-        <w:gridCol w:w="2100"/>
-        <w:gridCol w:w="1000"/>
-        <w:gridCol w:w="1900"/>
-        <w:gridCol w:w="1500"/>
-        <w:gridCol w:w="2723"/>
-      </w:tblGrid>
-      <w:tr>
-        <w:trPr>
-          <w:tblHeader/>
-        </w:trPr>
-        <w:tc>
-          <w:tcPr>
-            <w:tcW w:type="dxa" w:w="900"/>
-            <w:shd w:val="clear" w:color="auto" w:fill="E7E6E6"/>
-            <w:tcMar>
-              <w:top w:w="40" w:type="dxa"/>
-              <w:start w:w="50" w:type="dxa"/>
-              <w:bottom w:w="40" w:type="dxa"/>
-              <w:end w:w="50" w:type="dxa"/>
-            </w:tcMar>
-            <w:vAlign w:val="center"/>
-          </w:tcPr>
-          <w:p>
-            <w:pPr>
-              <w:spacing w:before="0" w:after="0" w:line="240" w:lineRule="auto"/>
-              <w:jc w:val="center"/>
-            </w:pPr>
-            <w:r>
-              <w:rPr>
-                <w:rFonts w:ascii="Times New Roman" w:hAnsi="Times New Roman"/>
-                <w:b/>
-                <w:sz w:val="14"/>
-              </w:rPr>
-              <w:t xml:space="preserve">Role</w:t>
-            </w:r>
-          </w:p>
-        </w:tc>
-        <w:tc>
-          <w:tcPr>
-            <w:tcW w:type="dxa" w:w="2100"/>
-            <w:shd w:val="clear" w:color="auto" w:fill="E7E6E6"/>
-            <w:tcMar>
-              <w:top w:w="40" w:type="dxa"/>
-              <w:start w:w="50" w:type="dxa"/>
-              <w:bottom w:w="40" w:type="dxa"/>
-              <w:end w:w="50" w:type="dxa"/>
-            </w:tcMar>
-            <w:vAlign w:val="center"/>
-          </w:tcPr>
-          <w:p>
-            <w:pPr>
-              <w:spacing w:before="0" w:after="0" w:line="240" w:lineRule="auto"/>
-              <w:jc w:val="center"/>
-            </w:pPr>
-            <w:r>
-              <w:rPr>
-                <w:rFonts w:ascii="Times New Roman" w:hAnsi="Times New Roman"/>
-                <w:b/>
-                <w:sz w:val="14"/>
-              </w:rPr>
-              <w:t xml:space="preserve">Checkpoint</w:t>
-            </w:r>
-          </w:p>
-        </w:tc>
-        <w:tc>
-          <w:tcPr>
-            <w:tcW w:type="dxa" w:w="1000"/>
-            <w:shd w:val="clear" w:color="auto" w:fill="E7E6E6"/>
-            <w:tcMar>
-              <w:top w:w="40" w:type="dxa"/>
-              <w:start w:w="50" w:type="dxa"/>
-              <w:bottom w:w="40" w:type="dxa"/>
-              <w:end w:w="50" w:type="dxa"/>
-            </w:tcMar>
-            <w:vAlign w:val="center"/>
-          </w:tcPr>
-          <w:p>
-            <w:pPr>
-              <w:spacing w:before="0" w:after="0" w:line="240" w:lineRule="auto"/>
-              <w:jc w:val="center"/>
-            </w:pPr>
-            <w:r>
-              <w:rPr>
-                <w:rFonts w:ascii="Times New Roman" w:hAnsi="Times New Roman"/>
-                <w:b/>
-                <w:sz w:val="14"/>
-              </w:rPr>
-              <w:t xml:space="preserve">Precision</w:t>
-            </w:r>
-          </w:p>
-        </w:tc>
-        <w:tc>
-          <w:tcPr>
-            <w:tcW w:type="dxa" w:w="1900"/>
-            <w:shd w:val="clear" w:color="auto" w:fill="E7E6E6"/>
-            <w:tcMar>
-              <w:top w:w="40" w:type="dxa"/>
-              <w:start w:w="50" w:type="dxa"/>
-              <w:bottom w:w="40" w:type="dxa"/>
-              <w:end w:w="50" w:type="dxa"/>
-            </w:tcMar>
-            <w:vAlign w:val="center"/>
-          </w:tcPr>
-          <w:p>
-            <w:pPr>
-              <w:spacing w:before="0" w:after="0" w:line="240" w:lineRule="auto"/>
-              <w:jc w:val="center"/>
-            </w:pPr>
-            <w:r>
-              <w:rPr>
-                <w:rFonts w:ascii="Times New Roman" w:hAnsi="Times New Roman"/>
-                <w:b/>
-                <w:sz w:val="14"/>
-              </w:rPr>
-              <w:t xml:space="preserve">Serving / Hardware</w:t>
-            </w:r>
-          </w:p>
-        </w:tc>
-        <w:tc>
-          <w:tcPr>
-            <w:tcW w:type="dxa" w:w="1500"/>
-            <w:shd w:val="clear" w:color="auto" w:fill="E7E6E6"/>
-            <w:tcMar>
-              <w:top w:w="40" w:type="dxa"/>
-              <w:start w:w="50" w:type="dxa"/>
-              <w:bottom w:w="40" w:type="dxa"/>
-              <w:end w:w="50" w:type="dxa"/>
-            </w:tcMar>
-            <w:vAlign w:val="center"/>
-          </w:tcPr>
-          <w:p>
-            <w:pPr>
-              <w:spacing w:before="0" w:after="0" w:line="240" w:lineRule="auto"/>
-              <w:jc w:val="center"/>
-            </w:pPr>
-            <w:r>
-              <w:rPr>
-                <w:rFonts w:ascii="Times New Roman" w:hAnsi="Times New Roman"/>
-                <w:b/>
-                <w:sz w:val="14"/>
-              </w:rPr>
-              <w:t xml:space="preserve">Cost Rate (per 1k tokens)</w:t>
-            </w:r>
-          </w:p>
-        </w:tc>
-        <w:tc>
-          <w:tcPr>
-            <w:tcW w:type="dxa" w:w="2723"/>
-            <w:shd w:val="clear" w:color="auto" w:fill="E7E6E6"/>
-            <w:tcMar>
-              <w:top w:w="40" w:type="dxa"/>
-              <w:start w:w="50" w:type="dxa"/>
-              <w:bottom w:w="40" w:type="dxa"/>
-              <w:end w:w="50" w:type="dxa"/>
-            </w:tcMar>
-            <w:vAlign w:val="center"/>
-          </w:tcPr>
-          <w:p>
-            <w:pPr>
-              <w:spacing w:before="0" w:after="0" w:line="240" w:lineRule="auto"/>
-              <w:jc w:val="center"/>
-            </w:pPr>
-            <w:r>
-              <w:rPr>
-                <w:rFonts w:ascii="Times New Roman" w:hAnsi="Times New Roman"/>
-                <w:b/>
-                <w:sz w:val="14"/>
-              </w:rPr>
-              <w:t xml:space="preserve">Decoding</w:t>
-            </w:r>
-          </w:p>
-        </w:tc>
-      </w:tr>
-      <w:tr>
-        <w:trPr>
-          <w:cantSplit/>
-        </w:trPr>
-        <w:tc>
-          <w:tcPr>
-            <w:tcW w:type="dxa" w:w="900"/>
-            <w:tcMar>
-              <w:top w:w="40" w:type="dxa"/>
-              <w:start w:w="50" w:type="dxa"/>
-              <w:bottom w:w="40" w:type="dxa"/>
-              <w:end w:w="50" w:type="dxa"/>
-            </w:tcMar>
-            <w:vAlign w:val="center"/>
-          </w:tcPr>
-          <w:p>
-            <w:pPr>
-              <w:spacing w:before="0" w:after="0" w:line="240" w:lineRule="auto"/>
-              <w:jc w:val="left"/>
-            </w:pPr>
-            <w:r>
-              <w:rPr>
-                <w:rFonts w:ascii="Times New Roman" w:hAnsi="Times New Roman"/>
-                <w:b w:val="0"/>
-                <w:sz w:val="14"/>
-              </w:rPr>
-              <w:t xml:space="preserve">Small</w:t>
-            </w:r>
-          </w:p>
-        </w:tc>
-        <w:tc>
-          <w:tcPr>
-            <w:tcW w:type="dxa" w:w="2100"/>
-            <w:tcMar>
-              <w:top w:w="40" w:type="dxa"/>
-              <w:start w:w="50" w:type="dxa"/>
-              <w:bottom w:w="40" w:type="dxa"/>
-              <w:end w:w="50" w:type="dxa"/>
-            </w:tcMar>
-            <w:vAlign w:val="center"/>
-          </w:tcPr>
-          <w:p>
-            <w:pPr>
-              <w:spacing w:before="0" w:after="0" w:line="240" w:lineRule="auto"/>
-              <w:jc w:val="left"/>
-            </w:pPr>
-            <w:r>
-              <w:rPr>
-                <w:rFonts w:ascii="Times New Roman" w:hAnsi="Times New Roman"/>
-                <w:b w:val="0"/>
-                <w:sz w:val="14"/>
-              </w:rPr>
-              <w:t xml:space="preserve">Qwen/Qwen3-4B-FP8</w:t>
-            </w:r>
-          </w:p>
-        </w:tc>
-        <w:tc>
-          <w:tcPr>
-            <w:tcW w:type="dxa" w:w="1000"/>
-            <w:tcMar>
-              <w:top w:w="40" w:type="dxa"/>
-              <w:start w:w="50" w:type="dxa"/>
-              <w:bottom w:w="40" w:type="dxa"/>
-              <w:end w:w="50" w:type="dxa"/>
-            </w:tcMar>
-            <w:vAlign w:val="center"/>
-          </w:tcPr>
-          <w:p>
-            <w:pPr>
-              <w:spacing w:before="0" w:after="0" w:line="240" w:lineRule="auto"/>
-              <w:jc w:val="center"/>
-            </w:pPr>
-            <w:r>
-              <w:rPr>
-                <w:rFonts w:ascii="Times New Roman" w:hAnsi="Times New Roman"/>
-                <w:b w:val="0"/>
-                <w:sz w:val="14"/>
-              </w:rPr>
-              <w:t xml:space="preserve">FP8</w:t>
-            </w:r>
-          </w:p>
-        </w:tc>
-        <w:tc>
-          <w:tcPr>
-            <w:tcW w:type="dxa" w:w="1900"/>
-            <w:tcMar>
-              <w:top w:w="40" w:type="dxa"/>
-              <w:start w:w="50" w:type="dxa"/>
-              <w:bottom w:w="40" w:type="dxa"/>
-              <w:end w:w="50" w:type="dxa"/>
-            </w:tcMar>
-            <w:vAlign w:val="center"/>
-          </w:tcPr>
-          <w:p>
-            <w:pPr>
-              <w:spacing w:before="0" w:after="0" w:line="240" w:lineRule="auto"/>
-              <w:jc w:val="left"/>
-            </w:pPr>
-            <w:r>
-              <w:rPr>
-                <w:rFonts w:ascii="Times New Roman" w:hAnsi="Times New Roman"/>
-                <w:b w:val="0"/>
-                <w:sz w:val="14"/>
-              </w:rPr>
-              <w:t xml:space="preserve">vLLM, 1× RTX 4090</w:t>
-            </w:r>
-          </w:p>
-        </w:tc>
-        <w:tc>
-          <w:tcPr>
-            <w:tcW w:type="dxa" w:w="1500"/>
-            <w:tcMar>
-              <w:top w:w="40" w:type="dxa"/>
-              <w:start w:w="50" w:type="dxa"/>
-              <w:bottom w:w="40" w:type="dxa"/>
-              <w:end w:w="50" w:type="dxa"/>
-            </w:tcMar>
-            <w:vAlign w:val="center"/>
-          </w:tcPr>
-          <w:p>
-            <w:pPr>
-              <w:spacing w:before="0" w:after="0" w:line="240" w:lineRule="auto"/>
-              <w:jc w:val="center"/>
-            </w:pPr>
-            <w:r>
-              <w:rPr>
-                <w:rFonts w:ascii="Times New Roman" w:hAnsi="Times New Roman"/>
-                <w:b w:val="0"/>
-                <w:sz w:val="14"/>
-              </w:rPr>
-              <w:t xml:space="preserve">4.0</w:t>
-            </w:r>
-          </w:p>
-        </w:tc>
-        <w:tc>
-          <w:tcPr>
-            <w:tcW w:type="dxa" w:w="2723"/>
-            <w:tcMar>
-              <w:top w:w="40" w:type="dxa"/>
-              <w:start w:w="50" w:type="dxa"/>
-              <w:bottom w:w="40" w:type="dxa"/>
-              <w:end w:w="50" w:type="dxa"/>
-            </w:tcMar>
-            <w:vAlign w:val="center"/>
-          </w:tcPr>
-          <w:p>
-            <w:pPr>
-              <w:spacing w:before="0" w:after="0" w:line="240" w:lineRule="auto"/>
-              <w:jc w:val="left"/>
-            </w:pPr>
-            <w:r>
-              <w:rPr>
-                <w:rFonts w:ascii="Times New Roman" w:hAnsi="Times New Roman"/>
-                <w:b w:val="0"/>
-                <w:sz w:val="14"/>
-              </w:rPr>
-              <w:t xml:space="preserve">T = 0, ≤1,024 tokens, no thinking</w:t>
-            </w:r>
-          </w:p>
-        </w:tc>
-      </w:tr>
-      <w:tr>
-        <w:trPr>
-          <w:cantSplit/>
-        </w:trPr>
-        <w:tc>
-          <w:tcPr>
-            <w:tcW w:type="dxa" w:w="900"/>
-            <w:tcMar>
-              <w:top w:w="40" w:type="dxa"/>
-              <w:start w:w="50" w:type="dxa"/>
-              <w:bottom w:w="40" w:type="dxa"/>
-              <w:end w:w="50" w:type="dxa"/>
-            </w:tcMar>
-            <w:vAlign w:val="center"/>
-          </w:tcPr>
-          <w:p>
-            <w:pPr>
-              <w:spacing w:before="0" w:after="0" w:line="240" w:lineRule="auto"/>
-              <w:jc w:val="left"/>
-            </w:pPr>
-            <w:r>
-              <w:rPr>
-                <w:rFonts w:ascii="Times New Roman" w:hAnsi="Times New Roman"/>
-                <w:b w:val="0"/>
-                <w:sz w:val="14"/>
-              </w:rPr>
-              <w:t xml:space="preserve">Medium</w:t>
-            </w:r>
-          </w:p>
-        </w:tc>
-        <w:tc>
-          <w:tcPr>
-            <w:tcW w:type="dxa" w:w="2100"/>
-            <w:tcMar>
-              <w:top w:w="40" w:type="dxa"/>
-              <w:start w:w="50" w:type="dxa"/>
-              <w:bottom w:w="40" w:type="dxa"/>
-              <w:end w:w="50" w:type="dxa"/>
-            </w:tcMar>
-            <w:vAlign w:val="center"/>
-          </w:tcPr>
-          <w:p>
-            <w:pPr>
-              <w:spacing w:before="0" w:after="0" w:line="240" w:lineRule="auto"/>
-              <w:jc w:val="left"/>
-            </w:pPr>
-            <w:r>
-              <w:rPr>
-                <w:rFonts w:ascii="Times New Roman" w:hAnsi="Times New Roman"/>
-                <w:b w:val="0"/>
-                <w:sz w:val="14"/>
-              </w:rPr>
-              <w:t xml:space="preserve">Qwen/Qwen3-8B-FP8</w:t>
-            </w:r>
-          </w:p>
-        </w:tc>
-        <w:tc>
-          <w:tcPr>
-            <w:tcW w:type="dxa" w:w="1000"/>
-            <w:tcMar>
-              <w:top w:w="40" w:type="dxa"/>
-              <w:start w:w="50" w:type="dxa"/>
-              <w:bottom w:w="40" w:type="dxa"/>
-              <w:end w:w="50" w:type="dxa"/>
-            </w:tcMar>
-            <w:vAlign w:val="center"/>
-          </w:tcPr>
-          <w:p>
-            <w:pPr>
-              <w:spacing w:before="0" w:after="0" w:line="240" w:lineRule="auto"/>
-              <w:jc w:val="center"/>
-            </w:pPr>
-            <w:r>
-              <w:rPr>
-                <w:rFonts w:ascii="Times New Roman" w:hAnsi="Times New Roman"/>
-                <w:b w:val="0"/>
-                <w:sz w:val="14"/>
-              </w:rPr>
-              <w:t xml:space="preserve">FP8</w:t>
-            </w:r>
-          </w:p>
-        </w:tc>
-        <w:tc>
-          <w:tcPr>
-            <w:tcW w:type="dxa" w:w="1900"/>
-            <w:tcMar>
-              <w:top w:w="40" w:type="dxa"/>
-              <w:start w:w="50" w:type="dxa"/>
-              <w:bottom w:w="40" w:type="dxa"/>
-              <w:end w:w="50" w:type="dxa"/>
-            </w:tcMar>
-            <w:vAlign w:val="center"/>
-          </w:tcPr>
-          <w:p>
-            <w:pPr>
-              <w:spacing w:before="0" w:after="0" w:line="240" w:lineRule="auto"/>
-              <w:jc w:val="left"/>
-            </w:pPr>
-            <w:r>
-              <w:rPr>
-                <w:rFonts w:ascii="Times New Roman" w:hAnsi="Times New Roman"/>
-                <w:b w:val="0"/>
-                <w:sz w:val="14"/>
-              </w:rPr>
-              <w:t xml:space="preserve">vLLM, 1× RTX 4090</w:t>
-            </w:r>
-          </w:p>
-        </w:tc>
-        <w:tc>
-          <w:tcPr>
-            <w:tcW w:type="dxa" w:w="1500"/>
-            <w:tcMar>
-              <w:top w:w="40" w:type="dxa"/>
-              <w:start w:w="50" w:type="dxa"/>
-              <w:bottom w:w="40" w:type="dxa"/>
-              <w:end w:w="50" w:type="dxa"/>
-            </w:tcMar>
-            <w:vAlign w:val="center"/>
-          </w:tcPr>
-          <w:p>
-            <w:pPr>
-              <w:spacing w:before="0" w:after="0" w:line="240" w:lineRule="auto"/>
-              <w:jc w:val="center"/>
-            </w:pPr>
-            <w:r>
-              <w:rPr>
-                <w:rFonts w:ascii="Times New Roman" w:hAnsi="Times New Roman"/>
-                <w:b w:val="0"/>
-                <w:sz w:val="14"/>
-              </w:rPr>
-              <w:t xml:space="preserve">8.0</w:t>
-            </w:r>
-          </w:p>
-        </w:tc>
-        <w:tc>
-          <w:tcPr>
-            <w:tcW w:type="dxa" w:w="2723"/>
-            <w:tcMar>
-              <w:top w:w="40" w:type="dxa"/>
-              <w:start w:w="50" w:type="dxa"/>
-              <w:bottom w:w="40" w:type="dxa"/>
-              <w:end w:w="50" w:type="dxa"/>
-            </w:tcMar>
-            <w:vAlign w:val="center"/>
-          </w:tcPr>
-          <w:p>
-            <w:pPr>
-              <w:spacing w:before="0" w:after="0" w:line="240" w:lineRule="auto"/>
-              <w:jc w:val="left"/>
-            </w:pPr>
-            <w:r>
-              <w:rPr>
-                <w:rFonts w:ascii="Times New Roman" w:hAnsi="Times New Roman"/>
-                <w:b w:val="0"/>
-                <w:sz w:val="14"/>
-              </w:rPr>
-              <w:t xml:space="preserve">T = 0, ≤1,024 tokens, no thinking</w:t>
-            </w:r>
-          </w:p>
-        </w:tc>
-      </w:tr>
-      <w:tr>
-        <w:trPr>
-          <w:cantSplit/>
-        </w:trPr>
-        <w:tc>
-          <w:tcPr>
-            <w:tcW w:type="dxa" w:w="900"/>
-            <w:tcMar>
-              <w:top w:w="40" w:type="dxa"/>
-              <w:start w:w="50" w:type="dxa"/>
-              <w:bottom w:w="40" w:type="dxa"/>
-              <w:end w:w="50" w:type="dxa"/>
-            </w:tcMar>
-            <w:vAlign w:val="center"/>
-          </w:tcPr>
-          <w:p>
-            <w:pPr>
-              <w:spacing w:before="0" w:after="0" w:line="240" w:lineRule="auto"/>
-              <w:jc w:val="left"/>
-            </w:pPr>
-            <w:r>
-              <w:rPr>
-                <w:rFonts w:ascii="Times New Roman" w:hAnsi="Times New Roman"/>
-                <w:b w:val="0"/>
-                <w:sz w:val="14"/>
-              </w:rPr>
-              <w:t xml:space="preserve">Large</w:t>
-            </w:r>
-          </w:p>
-        </w:tc>
-        <w:tc>
-          <w:tcPr>
-            <w:tcW w:type="dxa" w:w="2100"/>
-            <w:tcMar>
-              <w:top w:w="40" w:type="dxa"/>
-              <w:start w:w="50" w:type="dxa"/>
-              <w:bottom w:w="40" w:type="dxa"/>
-              <w:end w:w="50" w:type="dxa"/>
-            </w:tcMar>
-            <w:vAlign w:val="center"/>
-          </w:tcPr>
-          <w:p>
-            <w:pPr>
-              <w:spacing w:before="0" w:after="0" w:line="240" w:lineRule="auto"/>
-              <w:jc w:val="left"/>
-            </w:pPr>
-            <w:r>
-              <w:rPr>
-                <w:rFonts w:ascii="Times New Roman" w:hAnsi="Times New Roman"/>
-                <w:b w:val="0"/>
-                <w:sz w:val="14"/>
-              </w:rPr>
-              <w:t xml:space="preserve">Qwen/Qwen3-14B-FP8</w:t>
-            </w:r>
-          </w:p>
-        </w:tc>
-        <w:tc>
-          <w:tcPr>
-            <w:tcW w:type="dxa" w:w="1000"/>
-            <w:tcMar>
-              <w:top w:w="40" w:type="dxa"/>
-              <w:start w:w="50" w:type="dxa"/>
-              <w:bottom w:w="40" w:type="dxa"/>
-              <w:end w:w="50" w:type="dxa"/>
-            </w:tcMar>
-            <w:vAlign w:val="center"/>
-          </w:tcPr>
-          <w:p>
-            <w:pPr>
-              <w:spacing w:before="0" w:after="0" w:line="240" w:lineRule="auto"/>
-              <w:jc w:val="center"/>
-            </w:pPr>
-            <w:r>
-              <w:rPr>
-                <w:rFonts w:ascii="Times New Roman" w:hAnsi="Times New Roman"/>
-                <w:b w:val="0"/>
-                <w:sz w:val="14"/>
-              </w:rPr>
-              <w:t xml:space="preserve">FP8</w:t>
-            </w:r>
-          </w:p>
-        </w:tc>
-        <w:tc>
-          <w:tcPr>
-            <w:tcW w:type="dxa" w:w="1900"/>
-            <w:tcMar>
-              <w:top w:w="40" w:type="dxa"/>
-              <w:start w:w="50" w:type="dxa"/>
-              <w:bottom w:w="40" w:type="dxa"/>
-              <w:end w:w="50" w:type="dxa"/>
-            </w:tcMar>
-            <w:vAlign w:val="center"/>
-          </w:tcPr>
-          <w:p>
-            <w:pPr>
-              <w:spacing w:before="0" w:after="0" w:line="240" w:lineRule="auto"/>
-              <w:jc w:val="left"/>
-            </w:pPr>
-            <w:r>
-              <w:rPr>
-                <w:rFonts w:ascii="Times New Roman" w:hAnsi="Times New Roman"/>
-                <w:b w:val="0"/>
-                <w:sz w:val="14"/>
-              </w:rPr>
-              <w:t xml:space="preserve">vLLM, 1× RTX 4090</w:t>
-            </w:r>
-          </w:p>
-        </w:tc>
-        <w:tc>
-          <w:tcPr>
-            <w:tcW w:type="dxa" w:w="1500"/>
-            <w:tcMar>
-              <w:top w:w="40" w:type="dxa"/>
-              <w:start w:w="50" w:type="dxa"/>
-              <w:bottom w:w="40" w:type="dxa"/>
-              <w:end w:w="50" w:type="dxa"/>
-            </w:tcMar>
-            <w:vAlign w:val="center"/>
-          </w:tcPr>
-          <w:p>
-            <w:pPr>
-              <w:spacing w:before="0" w:after="0" w:line="240" w:lineRule="auto"/>
-              <w:jc w:val="center"/>
-            </w:pPr>
-            <w:r>
-              <w:rPr>
-                <w:rFonts w:ascii="Times New Roman" w:hAnsi="Times New Roman"/>
-                <w:b w:val="0"/>
-                <w:sz w:val="14"/>
-              </w:rPr>
-              <w:t xml:space="preserve">14.0</w:t>
-            </w:r>
-          </w:p>
-        </w:tc>
-        <w:tc>
-          <w:tcPr>
-            <w:tcW w:type="dxa" w:w="2723"/>
-            <w:tcMar>
-              <w:top w:w="40" w:type="dxa"/>
-              <w:start w:w="50" w:type="dxa"/>
-              <w:bottom w:w="40" w:type="dxa"/>
-              <w:end w:w="50" w:type="dxa"/>
-            </w:tcMar>
-            <w:vAlign w:val="center"/>
-          </w:tcPr>
-          <w:p>
-            <w:pPr>
-              <w:spacing w:before="0" w:after="0" w:line="240" w:lineRule="auto"/>
-              <w:jc w:val="left"/>
-            </w:pPr>
-            <w:r>
-              <w:rPr>
-                <w:rFonts w:ascii="Times New Roman" w:hAnsi="Times New Roman"/>
-                <w:b w:val="0"/>
-                <w:sz w:val="14"/>
-              </w:rPr>
-              <w:t xml:space="preserve">T = 0, ≤1,024 tokens, no thinking</w:t>
-            </w:r>
-          </w:p>
-        </w:tc>
-      </w:tr>
-    </w:tbl>
-    <w:p>
-      <w:pPr>
-        <w:sectPr>
-          <w:type w:val="continuous"/>
-          <w:pgSz w:w="11909" w:h="16834"/>
-          <w:pgMar w:top="778" w:right="893" w:bottom="1440" w:left="893" w:header="288" w:footer="360" w:gutter="0"/>
-          <w:cols w:space="360" w:num="1"/>
-          <w:docGrid w:linePitch="360"/>
-        </w:sectPr>
-      </w:pPr>
     </w:p>
     <w:p>
       <w:pPr>
@@ -1310,81 +597,6 @@
         </w:rPr>
         <w:t xml:space="preserve">Fig. 1 shows the loop: the query is converted into features, LinUCB scores each candidate, one model generates the response, the response is evaluated, a reward is computed, and the chosen model's statistics are updated before the next query.</w:t>
       </w:r>
-    </w:p>
-    <w:p>
-      <w:pPr>
-        <w:sectPr>
-          <w:type w:val="continuous"/>
-          <w:pgSz w:w="11909" w:h="16834"/>
-          <w:pgMar w:top="778" w:right="893" w:bottom="1440" w:left="893" w:header="288" w:footer="360" w:gutter="0"/>
-          <w:cols w:space="360" w:num="2"/>
-          <w:docGrid w:linePitch="360"/>
-        </w:sectPr>
-      </w:pPr>
-    </w:p>
-    <w:p>
-      <w:pPr>
-        <w:jc w:val="center"/>
-      </w:pPr>
-      <w:r>
-        <w:drawing>
-          <wp:inline xmlns:a="http://schemas.openxmlformats.org/drawingml/2006/main" xmlns:pic="http://schemas.openxmlformats.org/drawingml/2006/picture">
-            <wp:extent cx="6309360" cy="3575304"/>
-            <wp:docPr id="1" name="Picture 1"/>
-            <wp:cNvGraphicFramePr>
-              <a:graphicFrameLocks noChangeAspect="1"/>
-            </wp:cNvGraphicFramePr>
-            <a:graphic>
-              <a:graphicData uri="http://schemas.openxmlformats.org/drawingml/2006/picture">
-                <pic:pic>
-                  <pic:nvPicPr>
-                    <pic:cNvPr id="0" name="fig1.png"/>
-                    <pic:cNvPicPr/>
-                  </pic:nvPicPr>
-                  <pic:blipFill>
-                    <a:blip r:embed="rId9"/>
-                    <a:stretch>
-                      <a:fillRect/>
-                    </a:stretch>
-                  </pic:blipFill>
-                  <pic:spPr>
-                    <a:xfrm>
-                      <a:off x="0" y="0"/>
-                      <a:ext cx="6309360" cy="3575304"/>
-                    </a:xfrm>
-                    <a:prstGeom prst="rect"/>
-                  </pic:spPr>
-                </pic:pic>
-              </a:graphicData>
-            </a:graphic>
-          </wp:inline>
-        </w:drawing>
-      </w:r>
-    </w:p>
-    <w:p>
-      <w:pPr>
-        <w:keepNext w:val="0"/>
-        <w:spacing w:before="20" w:after="60"/>
-        <w:jc w:val="center"/>
-      </w:pPr>
-      <w:r>
-        <w:rPr>
-          <w:rFonts w:ascii="Times New Roman" w:hAnsi="Times New Roman"/>
-          <w:sz w:val="16"/>
-        </w:rPr>
-        <w:t xml:space="preserve">Fig. 1. Proposed adaptive LLM routing loop with contextual-bandit feedback.</w:t>
-      </w:r>
-    </w:p>
-    <w:p>
-      <w:pPr>
-        <w:sectPr>
-          <w:type w:val="continuous"/>
-          <w:pgSz w:w="11909" w:h="16834"/>
-          <w:pgMar w:top="778" w:right="893" w:bottom="1440" w:left="893" w:header="288" w:footer="360" w:gutter="0"/>
-          <w:cols w:space="360" w:num="1"/>
-          <w:docGrid w:linePitch="360"/>
-        </w:sectPr>
-      </w:pPr>
     </w:p>
     <w:p>
       <w:pPr>
@@ -1537,6 +749,81 @@
     </w:p>
     <w:p>
       <w:pPr>
+        <w:sectPr>
+          <w:type w:val="continuous"/>
+          <w:pgSz w:w="11909" w:h="16834"/>
+          <w:pgMar w:top="778" w:right="893" w:bottom="1440" w:left="893" w:header="288" w:footer="360" w:gutter="0"/>
+          <w:cols w:space="360" w:num="2"/>
+          <w:docGrid w:linePitch="360"/>
+        </w:sectPr>
+      </w:pPr>
+    </w:p>
+    <w:p>
+      <w:pPr>
+        <w:jc w:val="center"/>
+      </w:pPr>
+      <w:r>
+        <w:drawing>
+          <wp:inline xmlns:a="http://schemas.openxmlformats.org/drawingml/2006/main" xmlns:pic="http://schemas.openxmlformats.org/drawingml/2006/picture">
+            <wp:extent cx="6309360" cy="3575304"/>
+            <wp:docPr id="1" name="Picture 1"/>
+            <wp:cNvGraphicFramePr>
+              <a:graphicFrameLocks noChangeAspect="1"/>
+            </wp:cNvGraphicFramePr>
+            <a:graphic>
+              <a:graphicData uri="http://schemas.openxmlformats.org/drawingml/2006/picture">
+                <pic:pic>
+                  <pic:nvPicPr>
+                    <pic:cNvPr id="0" name="fig1.png"/>
+                    <pic:cNvPicPr/>
+                  </pic:nvPicPr>
+                  <pic:blipFill>
+                    <a:blip r:embed="rId9"/>
+                    <a:stretch>
+                      <a:fillRect/>
+                    </a:stretch>
+                  </pic:blipFill>
+                  <pic:spPr>
+                    <a:xfrm>
+                      <a:off x="0" y="0"/>
+                      <a:ext cx="6309360" cy="3575304"/>
+                    </a:xfrm>
+                    <a:prstGeom prst="rect"/>
+                  </pic:spPr>
+                </pic:pic>
+              </a:graphicData>
+            </a:graphic>
+          </wp:inline>
+        </w:drawing>
+      </w:r>
+    </w:p>
+    <w:p>
+      <w:pPr>
+        <w:keepNext w:val="0"/>
+        <w:spacing w:before="20" w:after="60"/>
+        <w:jc w:val="center"/>
+      </w:pPr>
+      <w:r>
+        <w:rPr>
+          <w:rFonts w:ascii="Times New Roman" w:hAnsi="Times New Roman"/>
+          <w:sz w:val="16"/>
+        </w:rPr>
+        <w:t xml:space="preserve">Fig. 1. Proposed adaptive LLM routing loop with contextual-bandit feedback.</w:t>
+      </w:r>
+    </w:p>
+    <w:p>
+      <w:pPr>
+        <w:sectPr>
+          <w:type w:val="continuous"/>
+          <w:pgSz w:w="11909" w:h="16834"/>
+          <w:pgMar w:top="778" w:right="893" w:bottom="1440" w:left="893" w:header="288" w:footer="360" w:gutter="0"/>
+          <w:cols w:space="360" w:num="1"/>
+          <w:docGrid w:linePitch="360"/>
+        </w:sectPr>
+      </w:pPr>
+    </w:p>
+    <w:p>
+      <w:pPr>
         <w:keepNext/>
         <w:spacing w:before="60" w:after="20"/>
         <w:jc w:val="left"/>
@@ -1603,180 +890,6 @@
     <w:p>
       <w:pPr>
         <w:keepNext/>
-        <w:spacing w:before="60" w:after="20"/>
-        <w:jc w:val="left"/>
-      </w:pPr>
-      <w:r>
-        <w:rPr>
-          <w:rFonts w:ascii="Times New Roman" w:hAnsi="Times New Roman"/>
-          <w:b w:val="0"/>
-          <w:i/>
-          <w:sz w:val="20"/>
-        </w:rPr>
-        <w:t xml:space="preserve">D. Operational Safeguards</w:t>
-      </w:r>
-    </w:p>
-    <w:p>
-      <w:pPr>
-        <w:keepNext w:val="0"/>
-        <w:spacing w:before="0" w:after="20" w:line="240" w:lineRule="auto"/>
-        <w:ind w:firstLine="216"/>
-        <w:jc w:val="both"/>
-      </w:pPr>
-      <w:r>
-        <w:rPr>
-          <w:rFonts w:ascii="Times New Roman" w:hAnsi="Times New Roman"/>
-          <w:sz w:val="20"/>
-        </w:rPr>
-        <w:t xml:space="preserve">The router service handles timeouts, unavailable models, and malformed outputs explicitly, and writes every decision (context, selected model, outcome, reward, update) to an audit log so that runs can be replayed. Any fallback policy, such as retrying with a larger model, is evaluated and documented rather than silently changing the experiment. Algorithm 1 summarizes the procedure.</w:t>
-      </w:r>
-    </w:p>
-    <w:p>
-      <w:pPr>
-        <w:keepNext/>
-        <w:spacing w:before="60" w:after="20"/>
-        <w:jc w:val="center"/>
-      </w:pPr>
-      <w:r>
-        <w:rPr>
-          <w:rFonts w:ascii="Times New Roman" w:hAnsi="Times New Roman"/>
-          <w:b/>
-          <w:sz w:val="16"/>
-        </w:rPr>
-        <w:t xml:space="preserve">Algorithm 1. LinUCB-Based Adaptive LLM Routing</w:t>
-      </w:r>
-    </w:p>
-    <w:tbl>
-      <w:tblPr>
-        <w:tblW w:type="dxa" w:w="4824"/>
-        <w:jc w:val="center"/>
-        <w:tblBorders>
-          <w:top w:val="single" w:sz="4" w:color="808080"/>
-          <w:left w:val="single" w:sz="4" w:color="808080"/>
-          <w:bottom w:val="single" w:sz="4" w:color="808080"/>
-          <w:right w:val="single" w:sz="4" w:color="808080"/>
-          <w:insideH w:val="single" w:sz="4" w:color="808080"/>
-          <w:insideV w:val="single" w:sz="4" w:color="808080"/>
-        </w:tblBorders>
-        <w:tblLayout w:type="fixed"/>
-        <w:tblLook w:val="04A0" w:firstRow="0" w:lastRow="0" w:firstColumn="0" w:lastColumn="0" w:noHBand="0" w:noVBand="1"/>
-      </w:tblPr>
-      <w:tblGrid>
-        <w:gridCol w:w="4824"/>
-      </w:tblGrid>
-      <w:tr>
-        <w:tc>
-          <w:tcPr>
-            <w:tcW w:type="dxa" w:w="4824"/>
-            <w:tcMar>
-              <w:top w:w="40" w:type="dxa"/>
-              <w:start w:w="50" w:type="dxa"/>
-              <w:bottom w:w="40" w:type="dxa"/>
-              <w:end w:w="50" w:type="dxa"/>
-            </w:tcMar>
-          </w:tcPr>
-          <w:p>
-            <w:pPr>
-              <w:spacing w:before="0" w:after="10" w:line="240" w:lineRule="auto"/>
-              <w:ind w:left="230" w:hanging="230"/>
-            </w:pPr>
-            <w:r>
-              <w:rPr>
-                <w:rFonts w:ascii="Times New Roman" w:hAnsi="Times New Roman"/>
-                <w:sz w:val="15"/>
-              </w:rPr>
-              <w:t xml:space="preserve">1) For every candidate model a: initialize A_a = λI_d and b_a = 0_d.</w:t>
-            </w:r>
-          </w:p>
-          <w:p>
-            <w:pPr>
-              <w:spacing w:before="0" w:after="10" w:line="240" w:lineRule="auto"/>
-              <w:ind w:left="230" w:hanging="230"/>
-            </w:pPr>
-            <w:r>
-              <w:rPr>
-                <w:rFonts w:ascii="Times New Roman" w:hAnsi="Times New Roman"/>
-                <w:sz w:val="15"/>
-              </w:rPr>
-              <w:t xml:space="preserve">2) For each incoming query q_t:</w:t>
-            </w:r>
-          </w:p>
-          <w:p>
-            <w:pPr>
-              <w:spacing w:before="0" w:after="10" w:line="240" w:lineRule="auto"/>
-              <w:ind w:left="460" w:hanging="230"/>
-            </w:pPr>
-            <w:r>
-              <w:rPr>
-                <w:rFonts w:ascii="Times New Roman" w:hAnsi="Times New Roman"/>
-                <w:sz w:val="15"/>
-              </w:rPr>
-              <w:t xml:space="preserve">3) Extract the context vector x_t = extract_features(q_t).</w:t>
-            </w:r>
-          </w:p>
-          <w:p>
-            <w:pPr>
-              <w:spacing w:before="0" w:after="10" w:line="240" w:lineRule="auto"/>
-              <w:ind w:left="460" w:hanging="230"/>
-            </w:pPr>
-            <w:r>
-              <w:rPr>
-                <w:rFonts w:ascii="Times New Roman" w:hAnsi="Times New Roman"/>
-                <w:sz w:val="15"/>
-              </w:rPr>
-              <w:t xml:space="preserve">4) For each model a: compute θ_a = A_a⁻¹b_a and p_a = θ_aᵀx_t + α√(x_tᵀA_a⁻¹x_t).</w:t>
-            </w:r>
-          </w:p>
-          <w:p>
-            <w:pPr>
-              <w:spacing w:before="0" w:after="10" w:line="240" w:lineRule="auto"/>
-              <w:ind w:left="460" w:hanging="230"/>
-            </w:pPr>
-            <w:r>
-              <w:rPr>
-                <w:rFonts w:ascii="Times New Roman" w:hAnsi="Times New Roman"/>
-                <w:sz w:val="15"/>
-              </w:rPr>
-              <w:t xml:space="preserve">5) Select a_t = argmax_a p_a; call model a_t; record latency, tokens, cost, and errors.</w:t>
-            </w:r>
-          </w:p>
-          <w:p>
-            <w:pPr>
-              <w:spacing w:before="0" w:after="10" w:line="240" w:lineRule="auto"/>
-              <w:ind w:left="460" w:hanging="230"/>
-            </w:pPr>
-            <w:r>
-              <w:rPr>
-                <w:rFonts w:ascii="Times New Roman" w:hAnsi="Times New Roman"/>
-                <w:sz w:val="15"/>
-              </w:rPr>
-              <w:t xml:space="preserve">6) Evaluate the response to obtain Q; compute r_t = α_q·Q − β_c·C̃ − γ_l·L̃ (failures: Q = 0).</w:t>
-            </w:r>
-          </w:p>
-          <w:p>
-            <w:pPr>
-              <w:spacing w:before="0" w:after="10" w:line="240" w:lineRule="auto"/>
-              <w:ind w:left="460" w:hanging="230"/>
-            </w:pPr>
-            <w:r>
-              <w:rPr>
-                <w:rFonts w:ascii="Times New Roman" w:hAnsi="Times New Roman"/>
-                <w:sz w:val="15"/>
-              </w:rPr>
-              <w:t xml:space="preserve">7) For a = a_t only: A_a ← A_a + x_t x_tᵀ and b_a ← b_a + r_t x_t; log the decision.</w:t>
-            </w:r>
-          </w:p>
-        </w:tc>
-      </w:tr>
-    </w:tbl>
-    <w:p>
-      <w:pPr>
-        <w:spacing w:before="0" w:after="60"/>
-      </w:pPr>
-    </w:p>
-    <w:p>
-      <w:pPr>
-        <w:keepNext/>
         <w:spacing w:before="100" w:after="40"/>
         <w:jc w:val="center"/>
       </w:pPr>
@@ -1802,569 +915,8 @@
           <w:rFonts w:ascii="Times New Roman" w:hAnsi="Times New Roman"/>
           <w:sz w:val="20"/>
         </w:rPr>
-        <w:t xml:space="preserve">LinUCB is compared with four policies that use the same pool, prompts, and reward (Table II). The rule-based policy maps each task category to the model with the highest mean development reward.</w:t>
+        <w:t xml:space="preserve">LinUCB is compared with four non-learning policies that share its pool, prompts, and reward. Small-only always calls Qwen3-4B and large-only always calls Qwen3-14B; together they bracket the cheapest and the most capable fixed choice. Random routing picks one of the three models uniformly with a seeded generator and shows what an uninformed mix costs. The rule-based policy maps each task category to the model with the highest mean development reward, which is the strongest simple policy a practitioner could write by hand. None of these policies updates from feedback; LinUCB selects with Eq. (4) and updates with Eq. (5).</w:t>
       </w:r>
-    </w:p>
-    <w:p>
-      <w:pPr>
-        <w:sectPr>
-          <w:type w:val="continuous"/>
-          <w:pgSz w:w="11909" w:h="16834"/>
-          <w:pgMar w:top="778" w:right="893" w:bottom="1440" w:left="893" w:header="288" w:footer="360" w:gutter="0"/>
-          <w:cols w:space="360" w:num="2"/>
-          <w:docGrid w:linePitch="360"/>
-        </w:sectPr>
-      </w:pPr>
-    </w:p>
-    <w:p>
-      <w:pPr>
-        <w:keepNext/>
-        <w:spacing w:before="60" w:after="40"/>
-        <w:jc w:val="center"/>
-      </w:pPr>
-      <w:r>
-        <w:rPr>
-          <w:rFonts w:ascii="Times New Roman" w:hAnsi="Times New Roman"/>
-          <w:b/>
-          <w:sz w:val="16"/>
-        </w:rPr>
-        <w:t>TABLE II</w:t>
-        <w:br/>
-        <w:t xml:space="preserve">ROUTING POLICIES COMPARED</w:t>
-      </w:r>
-    </w:p>
-    <w:tbl>
-      <w:tblPr>
-        <w:tblW w:type="dxa" w:w="10123"/>
-        <w:jc w:val="center"/>
-        <w:tblBorders>
-          <w:top w:val="single" w:sz="4" w:color="808080"/>
-          <w:left w:val="single" w:sz="4" w:color="808080"/>
-          <w:bottom w:val="single" w:sz="4" w:color="808080"/>
-          <w:right w:val="single" w:sz="4" w:color="808080"/>
-          <w:insideH w:val="single" w:sz="4" w:color="808080"/>
-          <w:insideV w:val="single" w:sz="4" w:color="808080"/>
-        </w:tblBorders>
-        <w:tblLayout w:type="fixed"/>
-        <w:tblLook w:val="04A0" w:firstRow="1" w:lastRow="0" w:firstColumn="1" w:lastColumn="0" w:noHBand="0" w:noVBand="1"/>
-      </w:tblPr>
-      <w:tblGrid>
-        <w:gridCol w:w="2400"/>
-        <w:gridCol w:w="5523"/>
-        <w:gridCol w:w="2200"/>
-      </w:tblGrid>
-      <w:tr>
-        <w:trPr>
-          <w:tblHeader/>
-        </w:trPr>
-        <w:tc>
-          <w:tcPr>
-            <w:tcW w:type="dxa" w:w="2400"/>
-            <w:shd w:val="clear" w:color="auto" w:fill="E7E6E6"/>
-            <w:tcMar>
-              <w:top w:w="40" w:type="dxa"/>
-              <w:start w:w="50" w:type="dxa"/>
-              <w:bottom w:w="40" w:type="dxa"/>
-              <w:end w:w="50" w:type="dxa"/>
-            </w:tcMar>
-            <w:vAlign w:val="center"/>
-          </w:tcPr>
-          <w:p>
-            <w:pPr>
-              <w:spacing w:before="0" w:after="0" w:line="240" w:lineRule="auto"/>
-              <w:jc w:val="center"/>
-            </w:pPr>
-            <w:r>
-              <w:rPr>
-                <w:rFonts w:ascii="Times New Roman" w:hAnsi="Times New Roman"/>
-                <w:b/>
-                <w:sz w:val="14"/>
-              </w:rPr>
-              <w:t xml:space="preserve">Policy</w:t>
-            </w:r>
-          </w:p>
-        </w:tc>
-        <w:tc>
-          <w:tcPr>
-            <w:tcW w:type="dxa" w:w="5523"/>
-            <w:shd w:val="clear" w:color="auto" w:fill="E7E6E6"/>
-            <w:tcMar>
-              <w:top w:w="40" w:type="dxa"/>
-              <w:start w:w="50" w:type="dxa"/>
-              <w:bottom w:w="40" w:type="dxa"/>
-              <w:end w:w="50" w:type="dxa"/>
-            </w:tcMar>
-            <w:vAlign w:val="center"/>
-          </w:tcPr>
-          <w:p>
-            <w:pPr>
-              <w:spacing w:before="0" w:after="0" w:line="240" w:lineRule="auto"/>
-              <w:jc w:val="center"/>
-            </w:pPr>
-            <w:r>
-              <w:rPr>
-                <w:rFonts w:ascii="Times New Roman" w:hAnsi="Times New Roman"/>
-                <w:b/>
-                <w:sz w:val="14"/>
-              </w:rPr>
-              <w:t xml:space="preserve">Decision Rule</w:t>
-            </w:r>
-          </w:p>
-        </w:tc>
-        <w:tc>
-          <w:tcPr>
-            <w:tcW w:type="dxa" w:w="2200"/>
-            <w:shd w:val="clear" w:color="auto" w:fill="E7E6E6"/>
-            <w:tcMar>
-              <w:top w:w="40" w:type="dxa"/>
-              <w:start w:w="50" w:type="dxa"/>
-              <w:bottom w:w="40" w:type="dxa"/>
-              <w:end w:w="50" w:type="dxa"/>
-            </w:tcMar>
-            <w:vAlign w:val="center"/>
-          </w:tcPr>
-          <w:p>
-            <w:pPr>
-              <w:spacing w:before="0" w:after="0" w:line="240" w:lineRule="auto"/>
-              <w:jc w:val="center"/>
-            </w:pPr>
-            <w:r>
-              <w:rPr>
-                <w:rFonts w:ascii="Times New Roman" w:hAnsi="Times New Roman"/>
-                <w:b/>
-                <w:sz w:val="14"/>
-              </w:rPr>
-              <w:t xml:space="preserve">Learns from Feedback</w:t>
-            </w:r>
-          </w:p>
-        </w:tc>
-      </w:tr>
-      <w:tr>
-        <w:trPr>
-          <w:cantSplit/>
-        </w:trPr>
-        <w:tc>
-          <w:tcPr>
-            <w:tcW w:type="dxa" w:w="2400"/>
-            <w:tcMar>
-              <w:top w:w="40" w:type="dxa"/>
-              <w:start w:w="50" w:type="dxa"/>
-              <w:bottom w:w="40" w:type="dxa"/>
-              <w:end w:w="50" w:type="dxa"/>
-            </w:tcMar>
-            <w:vAlign w:val="center"/>
-          </w:tcPr>
-          <w:p>
-            <w:pPr>
-              <w:spacing w:before="0" w:after="0" w:line="240" w:lineRule="auto"/>
-              <w:jc w:val="left"/>
-            </w:pPr>
-            <w:r>
-              <w:rPr>
-                <w:rFonts w:ascii="Times New Roman" w:hAnsi="Times New Roman"/>
-                <w:b w:val="0"/>
-                <w:sz w:val="14"/>
-              </w:rPr>
-              <w:t xml:space="preserve">Small-only</w:t>
-            </w:r>
-          </w:p>
-        </w:tc>
-        <w:tc>
-          <w:tcPr>
-            <w:tcW w:type="dxa" w:w="5523"/>
-            <w:tcMar>
-              <w:top w:w="40" w:type="dxa"/>
-              <w:start w:w="50" w:type="dxa"/>
-              <w:bottom w:w="40" w:type="dxa"/>
-              <w:end w:w="50" w:type="dxa"/>
-            </w:tcMar>
-            <w:vAlign w:val="center"/>
-          </w:tcPr>
-          <w:p>
-            <w:pPr>
-              <w:spacing w:before="0" w:after="0" w:line="240" w:lineRule="auto"/>
-              <w:jc w:val="left"/>
-            </w:pPr>
-            <w:r>
-              <w:rPr>
-                <w:rFonts w:ascii="Times New Roman" w:hAnsi="Times New Roman"/>
-                <w:b w:val="0"/>
-                <w:sz w:val="14"/>
-              </w:rPr>
-              <w:t xml:space="preserve">Always select Qwen3-4B</w:t>
-            </w:r>
-          </w:p>
-        </w:tc>
-        <w:tc>
-          <w:tcPr>
-            <w:tcW w:type="dxa" w:w="2200"/>
-            <w:tcMar>
-              <w:top w:w="40" w:type="dxa"/>
-              <w:start w:w="50" w:type="dxa"/>
-              <w:bottom w:w="40" w:type="dxa"/>
-              <w:end w:w="50" w:type="dxa"/>
-            </w:tcMar>
-            <w:vAlign w:val="center"/>
-          </w:tcPr>
-          <w:p>
-            <w:pPr>
-              <w:spacing w:before="0" w:after="0" w:line="240" w:lineRule="auto"/>
-              <w:jc w:val="center"/>
-            </w:pPr>
-            <w:r>
-              <w:rPr>
-                <w:rFonts w:ascii="Times New Roman" w:hAnsi="Times New Roman"/>
-                <w:b w:val="0"/>
-                <w:sz w:val="14"/>
-              </w:rPr>
-              <w:t xml:space="preserve">No</w:t>
-            </w:r>
-          </w:p>
-        </w:tc>
-      </w:tr>
-      <w:tr>
-        <w:trPr>
-          <w:cantSplit/>
-        </w:trPr>
-        <w:tc>
-          <w:tcPr>
-            <w:tcW w:type="dxa" w:w="2400"/>
-            <w:tcMar>
-              <w:top w:w="40" w:type="dxa"/>
-              <w:start w:w="50" w:type="dxa"/>
-              <w:bottom w:w="40" w:type="dxa"/>
-              <w:end w:w="50" w:type="dxa"/>
-            </w:tcMar>
-            <w:vAlign w:val="center"/>
-          </w:tcPr>
-          <w:p>
-            <w:pPr>
-              <w:spacing w:before="0" w:after="0" w:line="240" w:lineRule="auto"/>
-              <w:jc w:val="left"/>
-            </w:pPr>
-            <w:r>
-              <w:rPr>
-                <w:rFonts w:ascii="Times New Roman" w:hAnsi="Times New Roman"/>
-                <w:b w:val="0"/>
-                <w:sz w:val="14"/>
-              </w:rPr>
-              <w:t xml:space="preserve">Large-only</w:t>
-            </w:r>
-          </w:p>
-        </w:tc>
-        <w:tc>
-          <w:tcPr>
-            <w:tcW w:type="dxa" w:w="5523"/>
-            <w:tcMar>
-              <w:top w:w="40" w:type="dxa"/>
-              <w:start w:w="50" w:type="dxa"/>
-              <w:bottom w:w="40" w:type="dxa"/>
-              <w:end w:w="50" w:type="dxa"/>
-            </w:tcMar>
-            <w:vAlign w:val="center"/>
-          </w:tcPr>
-          <w:p>
-            <w:pPr>
-              <w:spacing w:before="0" w:after="0" w:line="240" w:lineRule="auto"/>
-              <w:jc w:val="left"/>
-            </w:pPr>
-            <w:r>
-              <w:rPr>
-                <w:rFonts w:ascii="Times New Roman" w:hAnsi="Times New Roman"/>
-                <w:b w:val="0"/>
-                <w:sz w:val="14"/>
-              </w:rPr>
-              <w:t xml:space="preserve">Always select Qwen3-14B</w:t>
-            </w:r>
-          </w:p>
-        </w:tc>
-        <w:tc>
-          <w:tcPr>
-            <w:tcW w:type="dxa" w:w="2200"/>
-            <w:tcMar>
-              <w:top w:w="40" w:type="dxa"/>
-              <w:start w:w="50" w:type="dxa"/>
-              <w:bottom w:w="40" w:type="dxa"/>
-              <w:end w:w="50" w:type="dxa"/>
-            </w:tcMar>
-            <w:vAlign w:val="center"/>
-          </w:tcPr>
-          <w:p>
-            <w:pPr>
-              <w:spacing w:before="0" w:after="0" w:line="240" w:lineRule="auto"/>
-              <w:jc w:val="center"/>
-            </w:pPr>
-            <w:r>
-              <w:rPr>
-                <w:rFonts w:ascii="Times New Roman" w:hAnsi="Times New Roman"/>
-                <w:b w:val="0"/>
-                <w:sz w:val="14"/>
-              </w:rPr>
-              <w:t xml:space="preserve">No</w:t>
-            </w:r>
-          </w:p>
-        </w:tc>
-      </w:tr>
-      <w:tr>
-        <w:trPr>
-          <w:cantSplit/>
-        </w:trPr>
-        <w:tc>
-          <w:tcPr>
-            <w:tcW w:type="dxa" w:w="2400"/>
-            <w:tcMar>
-              <w:top w:w="40" w:type="dxa"/>
-              <w:start w:w="50" w:type="dxa"/>
-              <w:bottom w:w="40" w:type="dxa"/>
-              <w:end w:w="50" w:type="dxa"/>
-            </w:tcMar>
-            <w:vAlign w:val="center"/>
-          </w:tcPr>
-          <w:p>
-            <w:pPr>
-              <w:spacing w:before="0" w:after="0" w:line="240" w:lineRule="auto"/>
-              <w:jc w:val="left"/>
-            </w:pPr>
-            <w:r>
-              <w:rPr>
-                <w:rFonts w:ascii="Times New Roman" w:hAnsi="Times New Roman"/>
-                <w:b w:val="0"/>
-                <w:sz w:val="14"/>
-              </w:rPr>
-              <w:t xml:space="preserve">Random</w:t>
-            </w:r>
-          </w:p>
-        </w:tc>
-        <w:tc>
-          <w:tcPr>
-            <w:tcW w:type="dxa" w:w="5523"/>
-            <w:tcMar>
-              <w:top w:w="40" w:type="dxa"/>
-              <w:start w:w="50" w:type="dxa"/>
-              <w:bottom w:w="40" w:type="dxa"/>
-              <w:end w:w="50" w:type="dxa"/>
-            </w:tcMar>
-            <w:vAlign w:val="center"/>
-          </w:tcPr>
-          <w:p>
-            <w:pPr>
-              <w:spacing w:before="0" w:after="0" w:line="240" w:lineRule="auto"/>
-              <w:jc w:val="left"/>
-            </w:pPr>
-            <w:r>
-              <w:rPr>
-                <w:rFonts w:ascii="Times New Roman" w:hAnsi="Times New Roman"/>
-                <w:b w:val="0"/>
-                <w:sz w:val="14"/>
-              </w:rPr>
-              <w:t xml:space="preserve">Select a model uniformly at random (seeded)</w:t>
-            </w:r>
-          </w:p>
-        </w:tc>
-        <w:tc>
-          <w:tcPr>
-            <w:tcW w:type="dxa" w:w="2200"/>
-            <w:tcMar>
-              <w:top w:w="40" w:type="dxa"/>
-              <w:start w:w="50" w:type="dxa"/>
-              <w:bottom w:w="40" w:type="dxa"/>
-              <w:end w:w="50" w:type="dxa"/>
-            </w:tcMar>
-            <w:vAlign w:val="center"/>
-          </w:tcPr>
-          <w:p>
-            <w:pPr>
-              <w:spacing w:before="0" w:after="0" w:line="240" w:lineRule="auto"/>
-              <w:jc w:val="center"/>
-            </w:pPr>
-            <w:r>
-              <w:rPr>
-                <w:rFonts w:ascii="Times New Roman" w:hAnsi="Times New Roman"/>
-                <w:b w:val="0"/>
-                <w:sz w:val="14"/>
-              </w:rPr>
-              <w:t xml:space="preserve">No</w:t>
-            </w:r>
-          </w:p>
-        </w:tc>
-      </w:tr>
-      <w:tr>
-        <w:trPr>
-          <w:cantSplit/>
-        </w:trPr>
-        <w:tc>
-          <w:tcPr>
-            <w:tcW w:type="dxa" w:w="2400"/>
-            <w:tcMar>
-              <w:top w:w="40" w:type="dxa"/>
-              <w:start w:w="50" w:type="dxa"/>
-              <w:bottom w:w="40" w:type="dxa"/>
-              <w:end w:w="50" w:type="dxa"/>
-            </w:tcMar>
-            <w:vAlign w:val="center"/>
-          </w:tcPr>
-          <w:p>
-            <w:pPr>
-              <w:spacing w:before="0" w:after="0" w:line="240" w:lineRule="auto"/>
-              <w:jc w:val="left"/>
-            </w:pPr>
-            <w:r>
-              <w:rPr>
-                <w:rFonts w:ascii="Times New Roman" w:hAnsi="Times New Roman"/>
-                <w:b w:val="0"/>
-                <w:sz w:val="14"/>
-              </w:rPr>
-              <w:t xml:space="preserve">Rule-based</w:t>
-            </w:r>
-          </w:p>
-        </w:tc>
-        <w:tc>
-          <w:tcPr>
-            <w:tcW w:type="dxa" w:w="5523"/>
-            <w:tcMar>
-              <w:top w:w="40" w:type="dxa"/>
-              <w:start w:w="50" w:type="dxa"/>
-              <w:bottom w:w="40" w:type="dxa"/>
-              <w:end w:w="50" w:type="dxa"/>
-            </w:tcMar>
-            <w:vAlign w:val="center"/>
-          </w:tcPr>
-          <w:p>
-            <w:pPr>
-              <w:spacing w:before="0" w:after="0" w:line="240" w:lineRule="auto"/>
-              <w:jc w:val="left"/>
-            </w:pPr>
-            <w:r>
-              <w:rPr>
-                <w:rFonts w:ascii="Times New Roman" w:hAnsi="Times New Roman"/>
-                <w:b w:val="0"/>
-                <w:sz w:val="14"/>
-              </w:rPr>
-              <w:t xml:space="preserve">Category → best model on the development split</w:t>
-            </w:r>
-          </w:p>
-        </w:tc>
-        <w:tc>
-          <w:tcPr>
-            <w:tcW w:type="dxa" w:w="2200"/>
-            <w:tcMar>
-              <w:top w:w="40" w:type="dxa"/>
-              <w:start w:w="50" w:type="dxa"/>
-              <w:bottom w:w="40" w:type="dxa"/>
-              <w:end w:w="50" w:type="dxa"/>
-            </w:tcMar>
-            <w:vAlign w:val="center"/>
-          </w:tcPr>
-          <w:p>
-            <w:pPr>
-              <w:spacing w:before="0" w:after="0" w:line="240" w:lineRule="auto"/>
-              <w:jc w:val="center"/>
-            </w:pPr>
-            <w:r>
-              <w:rPr>
-                <w:rFonts w:ascii="Times New Roman" w:hAnsi="Times New Roman"/>
-                <w:b w:val="0"/>
-                <w:sz w:val="14"/>
-              </w:rPr>
-              <w:t xml:space="preserve">No</w:t>
-            </w:r>
-          </w:p>
-        </w:tc>
-      </w:tr>
-      <w:tr>
-        <w:trPr>
-          <w:cantSplit/>
-        </w:trPr>
-        <w:tc>
-          <w:tcPr>
-            <w:tcW w:type="dxa" w:w="2400"/>
-            <w:tcMar>
-              <w:top w:w="40" w:type="dxa"/>
-              <w:start w:w="50" w:type="dxa"/>
-              <w:bottom w:w="40" w:type="dxa"/>
-              <w:end w:w="50" w:type="dxa"/>
-            </w:tcMar>
-            <w:vAlign w:val="center"/>
-          </w:tcPr>
-          <w:p>
-            <w:pPr>
-              <w:spacing w:before="0" w:after="0" w:line="240" w:lineRule="auto"/>
-              <w:jc w:val="left"/>
-            </w:pPr>
-            <w:r>
-              <w:rPr>
-                <w:rFonts w:ascii="Times New Roman" w:hAnsi="Times New Roman"/>
-                <w:b w:val="0"/>
-                <w:sz w:val="14"/>
-              </w:rPr>
-              <w:t xml:space="preserve">LinUCB (proposed)</w:t>
-            </w:r>
-          </w:p>
-        </w:tc>
-        <w:tc>
-          <w:tcPr>
-            <w:tcW w:type="dxa" w:w="5523"/>
-            <w:tcMar>
-              <w:top w:w="40" w:type="dxa"/>
-              <w:start w:w="50" w:type="dxa"/>
-              <w:bottom w:w="40" w:type="dxa"/>
-              <w:end w:w="50" w:type="dxa"/>
-            </w:tcMar>
-            <w:vAlign w:val="center"/>
-          </w:tcPr>
-          <w:p>
-            <w:pPr>
-              <w:spacing w:before="0" w:after="0" w:line="240" w:lineRule="auto"/>
-              <w:jc w:val="left"/>
-            </w:pPr>
-            <w:r>
-              <w:rPr>
-                <w:rFonts w:ascii="Times New Roman" w:hAnsi="Times New Roman"/>
-                <w:b w:val="0"/>
-                <w:sz w:val="14"/>
-              </w:rPr>
-              <w:t xml:space="preserve">Select argmax of Eq. (4); update with Eq. (5)</w:t>
-            </w:r>
-          </w:p>
-        </w:tc>
-        <w:tc>
-          <w:tcPr>
-            <w:tcW w:type="dxa" w:w="2200"/>
-            <w:tcMar>
-              <w:top w:w="40" w:type="dxa"/>
-              <w:start w:w="50" w:type="dxa"/>
-              <w:bottom w:w="40" w:type="dxa"/>
-              <w:end w:w="50" w:type="dxa"/>
-            </w:tcMar>
-            <w:vAlign w:val="center"/>
-          </w:tcPr>
-          <w:p>
-            <w:pPr>
-              <w:spacing w:before="0" w:after="0" w:line="240" w:lineRule="auto"/>
-              <w:jc w:val="center"/>
-            </w:pPr>
-            <w:r>
-              <w:rPr>
-                <w:rFonts w:ascii="Times New Roman" w:hAnsi="Times New Roman"/>
-                <w:b w:val="0"/>
-                <w:sz w:val="14"/>
-              </w:rPr>
-              <w:t xml:space="preserve">Yes</w:t>
-            </w:r>
-          </w:p>
-        </w:tc>
-      </w:tr>
-    </w:tbl>
-    <w:p>
-      <w:pPr>
-        <w:sectPr>
-          <w:type w:val="continuous"/>
-          <w:pgSz w:w="11909" w:h="16834"/>
-          <w:pgMar w:top="778" w:right="893" w:bottom="1440" w:left="893" w:header="288" w:footer="360" w:gutter="0"/>
-          <w:cols w:space="360" w:num="1"/>
-          <w:docGrid w:linePitch="360"/>
-        </w:sectPr>
-      </w:pPr>
     </w:p>
     <w:p>
       <w:pPr>
@@ -2378,83 +930,8 @@
           <w:rFonts w:ascii="Times New Roman" w:hAnsi="Times New Roman"/>
           <w:sz w:val="20"/>
         </w:rPr>
-        <w:t xml:space="preserve">The evaluation follows Fig. 2. Because every query is run on every model, each policy is replayed on the same query stream and sees only the logged outcome of the model it selects; this also makes the oracle in Eq. (2) computable [15]. Learning policies are first warmed up on the 90 development queries (unscored) and then evaluated on the 210 held-out queries. Each policy is run with five seeds (0-4) that change the query order and the random choices, and results are reported as mean ± standard deviation across seeds [24]. The main comparison uses α = 1.0 and λ = 1.0. Metrics are mean quality, mean and p95 latency, cost per request, failure rate, cumulative reward, regret, and the model-selection distribution. The sweeps vary one factor at a time with α = 0.25 unless stated: reward weights (E2), feature groups (E4), the exploration coefficient α (E6), and three bandit variants (linear Thompson sampling, ε-greedy ridge regression with ε = 0.1, and sliding-window LinUCB with a window of 200). Workload shift (E5) and multi-category analysis (E3) require more than one task category and are left to the full study.</w:t>
+        <w:t xml:space="preserve">Because every query is run on every model, each policy is replayed on the same query stream and sees only the logged outcome of the model it selects; this also makes the oracle in Eq. (2) computable [15]. Learning policies are first warmed up on the 90 development queries (unscored) and then evaluated on the 210 held-out queries. Each policy is run with five seeds (0-4) that change the query order and the random choices, and results are reported as mean ± standard deviation across seeds [24]. The main comparison uses α = 1.0 and λ = 1.0. Metrics are mean quality, mean and p95 latency, cost per request, failure rate, cumulative reward, regret, and the model-selection distribution. The sweeps vary one factor at a time with α = 0.25 unless stated: reward weights (E2), feature groups (E4), the exploration coefficient α (E6), and three bandit variants (linear Thompson sampling, ε-greedy ridge regression with ε = 0.1, and sliding-window LinUCB with a window of 200). Workload shift (E5) and multi-category analysis (E3) require more than one task category and are left to the full study.</w:t>
       </w:r>
-    </w:p>
-    <w:p>
-      <w:pPr>
-        <w:sectPr>
-          <w:type w:val="continuous"/>
-          <w:pgSz w:w="11909" w:h="16834"/>
-          <w:pgMar w:top="778" w:right="893" w:bottom="1440" w:left="893" w:header="288" w:footer="360" w:gutter="0"/>
-          <w:cols w:space="360" w:num="2"/>
-          <w:docGrid w:linePitch="360"/>
-        </w:sectPr>
-      </w:pPr>
-    </w:p>
-    <w:p>
-      <w:pPr>
-        <w:jc w:val="center"/>
-      </w:pPr>
-      <w:r>
-        <w:drawing>
-          <wp:inline xmlns:a="http://schemas.openxmlformats.org/drawingml/2006/main" xmlns:pic="http://schemas.openxmlformats.org/drawingml/2006/picture">
-            <wp:extent cx="6309360" cy="2944368"/>
-            <wp:docPr id="2" name="Picture 2"/>
-            <wp:cNvGraphicFramePr>
-              <a:graphicFrameLocks noChangeAspect="1"/>
-            </wp:cNvGraphicFramePr>
-            <a:graphic>
-              <a:graphicData uri="http://schemas.openxmlformats.org/drawingml/2006/picture">
-                <pic:pic>
-                  <pic:nvPicPr>
-                    <pic:cNvPr id="0" name="fig2.png"/>
-                    <pic:cNvPicPr/>
-                  </pic:nvPicPr>
-                  <pic:blipFill>
-                    <a:blip r:embed="rId10"/>
-                    <a:stretch>
-                      <a:fillRect/>
-                    </a:stretch>
-                  </pic:blipFill>
-                  <pic:spPr>
-                    <a:xfrm>
-                      <a:off x="0" y="0"/>
-                      <a:ext cx="6309360" cy="2944368"/>
-                    </a:xfrm>
-                    <a:prstGeom prst="rect"/>
-                  </pic:spPr>
-                </pic:pic>
-              </a:graphicData>
-            </a:graphic>
-          </wp:inline>
-        </w:drawing>
-      </w:r>
-    </w:p>
-    <w:p>
-      <w:pPr>
-        <w:keepNext w:val="0"/>
-        <w:spacing w:before="20" w:after="60"/>
-        <w:jc w:val="center"/>
-      </w:pPr>
-      <w:r>
-        <w:rPr>
-          <w:rFonts w:ascii="Times New Roman" w:hAnsi="Times New Roman"/>
-          <w:sz w:val="16"/>
-        </w:rPr>
-        <w:t xml:space="preserve">Fig. 2. Evaluation design: full-information logging, replay-based policy comparison, and held-out reporting.</w:t>
-      </w:r>
-    </w:p>
-    <w:p>
-      <w:pPr>
-        <w:sectPr>
-          <w:type w:val="continuous"/>
-          <w:pgSz w:w="11909" w:h="16834"/>
-          <w:pgMar w:top="778" w:right="893" w:bottom="1440" w:left="893" w:header="288" w:footer="360" w:gutter="0"/>
-          <w:cols w:space="360" w:num="1"/>
-          <w:docGrid w:linePitch="360"/>
-        </w:sectPr>
-      </w:pPr>
     </w:p>
     <w:p>
       <w:pPr>
@@ -2500,7 +977,22 @@
           <w:rFonts w:ascii="Times New Roman" w:hAnsi="Times New Roman"/>
           <w:sz w:val="20"/>
         </w:rPr>
-        <w:t xml:space="preserve">Table III summarizes the 900 logged outcomes on the held-out split. No request failed or timed out. The three models are close in accuracy: Qwen3-8B is highest at 95.7%, Qwen3-14B reaches 95.2%, and Qwen3-4B 94.8%, a gap of one to two problems out of 210. Cost per request, by contrast, is 2.2 and 3.3 times higher for the 8B and 14B models. Latency does not follow size: the 14B model produced the shortest answers (231 output tokens on average) and had the lowest mean latency, so on this hardware and FP8 setup latency is governed more by answer length than by parameter count. The development split is harder for the small model (86.7% versus 92.2% and 94.4%), a reminder that 90 queries give noisy estimates. On the test split at least one model is correct on 209 of 210 problems; Qwen3-4B is wrong but a larger model is right on 10 of them.</w:t>
+        <w:t xml:space="preserve">Table I summarizes the 900 logged outcomes (300 problems × 3 models). No request failed or timed out. The three models are close in accuracy: Qwen3-8B is highest at 95.7%, Qwen3-14B reaches 95.2%, and Qwen3-4B 94.8%, a gap of one to two problems out of 210. Cost per request, by contrast, is 2.2 and 3.3 times higher for the 8B and 14B models. Latency does not follow size: the 14B model produced the shortest answers (231 output tokens on average) and had the lowest mean latency, so on this hardware and FP8 setup latency is governed more by answer length than by parameter count. The development split is harder for the small model (86.7% versus 92.2% and 94.4%), a reminder that 90 queries give noisy estimates. On the test split at least one model is correct on 209 of 210 problems; Qwen3-4B is wrong but a larger model is right on 10 of them.</w:t>
+      </w:r>
+    </w:p>
+    <w:p>
+      <w:pPr>
+        <w:keepNext w:val="0"/>
+        <w:spacing w:before="0" w:after="20" w:line="240" w:lineRule="auto"/>
+        <w:ind w:firstLine="216"/>
+        <w:jc w:val="both"/>
+      </w:pPr>
+      <w:r>
+        <w:rPr>
+          <w:rFonts w:ascii="Times New Roman" w:hAnsi="Times New Roman"/>
+          <w:sz w:val="20"/>
+        </w:rPr>
+        <w:t xml:space="preserve">The errors overlap little. Of the 11, 9, and 10 test problems missed by the 4B, 8B, and 14B models, only one is missed by all three, and 5, 7, and 5 are missed by one model alone. Wrong answers are longer than right ones for every model (355 versus 245 output tokens for Qwen3-4B and 456 versus 272 for Qwen3-8B), and only one response, from the 4B model, reached the 1,024-token limit. Decoding speed is nearly constant across sizes at 21 to 23 ms per output token on the FP8 checkpoints, which explains why latency tracks answer length. A router could exploit these patterns only with features that predict an individual model's failure before generation; the length, category, and cue features used here do not, which the ablation below confirms.</w:t>
       </w:r>
     </w:p>
     <w:p>
@@ -2526,7 +1018,7 @@
           <w:b/>
           <w:sz w:val="16"/>
         </w:rPr>
-        <w:t>TABLE III</w:t>
+        <w:t>TABLE I</w:t>
         <w:br/>
         <w:t xml:space="preserve">PER-MODEL OUTCOMES ON GSM8K (DEV n = 90, TEST n = 210) AND LINUCB SELECTION SHARE ON TEST</w:t>
       </w:r>
@@ -3255,7 +1747,7 @@
           <w:b/>
           <w:sz w:val="16"/>
         </w:rPr>
-        <w:t>TABLE IV</w:t>
+        <w:t>TABLE II</w:t>
         <w:br/>
         <w:t xml:space="preserve">OVERALL POLICY COMPARISON ON THE HELD-OUT SPLIT (210 QUERIES, MEAN ± SD OVER 5 SEEDS)</w:t>
       </w:r>
@@ -4595,24 +3087,83 @@
           <w:rFonts w:ascii="Times New Roman" w:hAnsi="Times New Roman"/>
           <w:sz w:val="20"/>
         </w:rPr>
-        <w:t xml:space="preserve">Table IV reports the main comparison. Under the default weights the cost and latency penalties outweigh the small accuracy gains of the larger models, so the 4B model is the best fixed choice. LinUCB learns this: it routes 98.2% of test queries to Qwen3-4B (Table III), reaches the same mean quality (0.948), and costs 1.460 per request, 69% less than large-only routing (4.706) at 0.4 percentage points lower accuracy. Its cumulative reward of 175.6 ± 0.1 is 35.7 higher than large-only and 20.4 higher than random routing. It does not beat small-only or rule-based routing (176.0); its residual exploration of the larger models (1.8% of queries) costs 0.4 reward units, i.e., 0.002 per query. The rule-based policy coincides with small-only because the pilot has a single category whose best development model is Qwen3-4B. Regret against the per-query oracle stays at 8.9 even for the best fixed policy because, with binary quality, the oracle also knows which model happened to be right on each problem. RQ2 is therefore answered negatively for this workload: LinUCB matches but does not exceed the best fixed policy, which is expected when one model dominates and no context separates the queries.</w:t>
+        <w:t xml:space="preserve">Table II and Fig. 2 report the main comparison. Under the default weights the cost and latency penalties outweigh the small accuracy gains of the larger models, so the 4B model is the best fixed choice. LinUCB learns this: it routes 98.2% of test queries to Qwen3-4B (Table I), reaches the same mean quality (0.948), and costs 1.460 per request, 69% less than large-only routing (4.706) at 0.4 percentage points lower accuracy. Its cumulative reward of 175.6 ± 0.1 is 35.7 higher than large-only and 20.4 higher than random routing. It does not beat small-only or rule-based routing (176.0); its residual exploration of the larger models (1.8% of queries) costs 0.4 reward units, i.e., 0.002 per query. The rule-based policy coincides with small-only because the pilot has a single category whose best development model is Qwen3-4B. Regret against the per-query oracle stays at 8.9 even for the best fixed policy because, with binary quality, the oracle also knows which model happened to be right on each problem. RQ2 is therefore answered negatively for this workload: LinUCB matches but does not exceed the best fixed policy, which is expected when one model dominates and no context separates the queries.</w:t>
       </w:r>
     </w:p>
     <w:p>
       <w:pPr>
-        <w:keepNext/>
-        <w:spacing w:before="60" w:after="20"/>
-        <w:jc w:val="left"/>
+        <w:sectPr>
+          <w:type w:val="continuous"/>
+          <w:pgSz w:w="11909" w:h="16834"/>
+          <w:pgMar w:top="778" w:right="893" w:bottom="1440" w:left="893" w:header="288" w:footer="360" w:gutter="0"/>
+          <w:cols w:space="360" w:num="2"/>
+          <w:docGrid w:linePitch="360"/>
+        </w:sectPr>
+      </w:pPr>
+    </w:p>
+    <w:p>
+      <w:pPr>
+        <w:jc w:val="center"/>
+      </w:pPr>
+      <w:r>
+        <w:drawing>
+          <wp:inline xmlns:a="http://schemas.openxmlformats.org/drawingml/2006/main" xmlns:pic="http://schemas.openxmlformats.org/drawingml/2006/picture">
+            <wp:extent cx="6309360" cy="3028493"/>
+            <wp:docPr id="3" name="Picture 3"/>
+            <wp:cNvGraphicFramePr>
+              <a:graphicFrameLocks noChangeAspect="1"/>
+            </wp:cNvGraphicFramePr>
+            <a:graphic>
+              <a:graphicData uri="http://schemas.openxmlformats.org/drawingml/2006/picture">
+                <pic:pic>
+                  <pic:nvPicPr>
+                    <pic:cNvPr id="0" name="fig3.png"/>
+                    <pic:cNvPicPr/>
+                  </pic:nvPicPr>
+                  <pic:blipFill>
+                    <a:blip r:embed="rId11"/>
+                    <a:stretch>
+                      <a:fillRect/>
+                    </a:stretch>
+                  </pic:blipFill>
+                  <pic:spPr>
+                    <a:xfrm>
+                      <a:off x="0" y="0"/>
+                      <a:ext cx="6309360" cy="3028493"/>
+                    </a:xfrm>
+                    <a:prstGeom prst="rect"/>
+                  </pic:spPr>
+                </pic:pic>
+              </a:graphicData>
+            </a:graphic>
+          </wp:inline>
+        </w:drawing>
+      </w:r>
+    </w:p>
+    <w:p>
+      <w:pPr>
+        <w:keepNext w:val="0"/>
+        <w:spacing w:before="20" w:after="60"/>
+        <w:jc w:val="center"/>
       </w:pPr>
       <w:r>
         <w:rPr>
           <w:rFonts w:ascii="Times New Roman" w:hAnsi="Times New Roman"/>
-          <w:b w:val="0"/>
-          <w:i/>
-          <w:sz w:val="20"/>
+          <w:sz w:val="16"/>
         </w:rPr>
-        <w:t xml:space="preserve">C. Reward Weights, Exploration, Features, and Variants</w:t>
+        <w:t xml:space="preserve">Fig. 2. GSM8K pilot on the held-out split: (a) cumulative reward of each policy over the 210-query stream; (b) accuracy versus cost per request (error bars: SD over 5 seeds).</w:t>
       </w:r>
+    </w:p>
+    <w:p>
+      <w:pPr>
+        <w:sectPr>
+          <w:type w:val="continuous"/>
+          <w:pgSz w:w="11909" w:h="16834"/>
+          <w:pgMar w:top="778" w:right="893" w:bottom="1440" w:left="893" w:header="288" w:footer="360" w:gutter="0"/>
+          <w:cols w:space="360" w:num="1"/>
+          <w:docGrid w:linePitch="360"/>
+        </w:sectPr>
+      </w:pPr>
     </w:p>
     <w:p>
       <w:pPr>
@@ -4637,7 +3188,7 @@
           <w:b/>
           <w:sz w:val="16"/>
         </w:rPr>
-        <w:t>TABLE V</w:t>
+        <w:t>TABLE III</w:t>
         <w:br/>
         <w:t xml:space="preserve">SWEEPS ON THE HELD-OUT SPLIT (LINUCB UNLESS STATED; MEAN OVER 5 SEEDS)</w:t>
       </w:r>
@@ -6778,6 +5329,22 @@
     </w:p>
     <w:p>
       <w:pPr>
+        <w:keepNext/>
+        <w:spacing w:before="60" w:after="20"/>
+        <w:jc w:val="left"/>
+      </w:pPr>
+      <w:r>
+        <w:rPr>
+          <w:rFonts w:ascii="Times New Roman" w:hAnsi="Times New Roman"/>
+          <w:b w:val="0"/>
+          <w:i/>
+          <w:sz w:val="20"/>
+        </w:rPr>
+        <w:t xml:space="preserve">C. Reward Weights, Exploration, Features, and Variants</w:t>
+      </w:r>
+    </w:p>
+    <w:p>
+      <w:pPr>
         <w:keepNext w:val="0"/>
         <w:spacing w:before="0" w:after="20" w:line="240" w:lineRule="auto"/>
         <w:ind w:firstLine="216"/>
@@ -6788,7 +5355,7 @@
           <w:rFonts w:ascii="Times New Roman" w:hAnsi="Times New Roman"/>
           <w:sz w:val="20"/>
         </w:rPr>
-        <w:t xml:space="preserve">Table V reports the sweeps. Reward weights (E2, RQ3): with no cost or latency penalty the best fixed policy is large-only (mean reward 0.952), yet LinUCB still selects only Qwen3-4B and reaches 0.948: initial score ties are broken toward the first model, and once Qwen3-4B has accumulated positive reward during warm-up the bonus at α = 0.25 is too small to try the larger models. For every non-zero weight setting small-only is the best fixed policy, and LinUCB matches it except at β_c = 0.6, γ_l = 0.4, where it shifted 20% of queries to Qwen3-8B and lost 0.042 per query. Exploration (E6): α ≤ 0.25 is equivalent to always choosing the 4B model; larger α buys at most 0.5 percentage points of accuracy (0.953 at α = 2.0) at 37% higher cost and lower reward, and the effect is not monotone (α = 0.5 is worse than α = 1.0), reflecting seed-to-seed variation on a small test set. Feature ablation (E4, RQ1): removing length, category, cue, or difficulty features, or keeping only the bias term, leaves every metric unchanged (mean reward 0.838), so on a single-category workload the features carry no routing signal. Bandit variants: sliding-window LinUCB equals LinUCB on this stationary stream, while linear Thompson sampling and ε-greedy explore more and lose 0.015 and 0.028 mean reward.</w:t>
+        <w:t xml:space="preserve">Table III reports the sweeps. Reward weights (E2, RQ3): with no cost or latency penalty the best fixed policy is large-only (mean reward 0.952), yet LinUCB still selects only Qwen3-4B and reaches 0.948: initial score ties are broken toward the first model, and once Qwen3-4B has accumulated positive reward during warm-up the bonus at α = 0.25 is too small to try the larger models. For every non-zero weight setting small-only is the best fixed policy, and LinUCB matches it except at β_c = 0.6, γ_l = 0.4, where it shifted 20% of queries to Qwen3-8B and lost 0.042 per query. Exploration (E6): α ≤ 0.25 is equivalent to always choosing the 4B model; larger α buys at most 0.5 percentage points of accuracy (0.953 at α = 2.0) at 37% higher cost and lower reward, and the effect is not monotone (α = 0.5 is worse than α = 1.0), reflecting seed-to-seed variation on a small test set. Feature ablation (E4, RQ1): removing length, category, cue, or difficulty features, or keeping only the bias term, leaves every metric unchanged (mean reward 0.838), so on a single-category workload the features carry no routing signal. Bandit variants: sliding-window LinUCB equals LinUCB on this stationary stream, while linear Thompson sampling and ε-greedy explore more and lose 0.015 and 0.028 mean reward.</w:t>
       </w:r>
     </w:p>
     <w:p>
@@ -6804,7 +5371,53 @@
           <w:smallCaps/>
           <w:sz w:val="20"/>
         </w:rPr>
-        <w:t xml:space="preserve">VII. Discussion and Limitations</w:t>
+        <w:t xml:space="preserve">VII. System Implementation</w:t>
+      </w:r>
+    </w:p>
+    <w:p>
+      <w:pPr>
+        <w:keepNext w:val="0"/>
+        <w:spacing w:before="0" w:after="20" w:line="240" w:lineRule="auto"/>
+        <w:ind w:firstLine="216"/>
+        <w:jc w:val="both"/>
+      </w:pPr>
+      <w:r>
+        <w:rPr>
+          <w:rFonts w:ascii="Times New Roman" w:hAnsi="Times New Roman"/>
+          <w:sz w:val="20"/>
+        </w:rPr>
+        <w:t xml:space="preserve">The router is implemented in Python as a small package with four parts. The router module holds the feature extractor, the disjoint LinUCB policy with its per-model A_a and b_a, the four baselines, and the reward calculator. The evaluation module collects outcomes by sending every query to every model through vLLM's OpenAI-compatible endpoint; collection is resumable, so an interrupted run continues from the last logged pair. It also provides scorers for exact, multiple-choice, numeric, substring, unit-test, and judge-based quality, and the replay engine that produces Tables I-III. The experiments module runs the sweeps and the three bandit variants, and a unit-test suite covers the scorers, features, LinUCB updates, replay, and service.</w:t>
+      </w:r>
+    </w:p>
+    <w:p>
+      <w:pPr>
+        <w:keepNext w:val="0"/>
+        <w:spacing w:before="0" w:after="20" w:line="240" w:lineRule="auto"/>
+        <w:ind w:firstLine="216"/>
+        <w:jc w:val="both"/>
+      </w:pPr>
+      <w:r>
+        <w:rPr>
+          <w:rFonts w:ascii="Times New Roman" w:hAnsi="Times New Roman"/>
+          <w:sz w:val="20"/>
+        </w:rPr>
+        <w:t xml:space="preserve">For live use the same policy runs inside a FastAPI service. A POST to /route extracts features, scores the three models, calls the selected one, and returns its answer together with a decision identifier and every model's score; a failed or timed-out call is converted immediately into a zero-quality update. A POST to /feedback attaches a quality rating to a pending decision and applies the LinUCB update, and GET /stats exposes the update counts, the exploration coefficient, and the reward configuration. Each decision is appended to an audit log with its context vector, model, latency, cost, quality, and reward, which allows any routing choice to be reconstructed. A minimal web page lets a user type a query, see which model was chosen and why, and rate the answer, and a demo mode exercises the routing and learning logic without a GPU.</w:t>
+      </w:r>
+    </w:p>
+    <w:p>
+      <w:pPr>
+        <w:keepNext/>
+        <w:spacing w:before="100" w:after="40"/>
+        <w:jc w:val="center"/>
+      </w:pPr>
+      <w:r>
+        <w:rPr>
+          <w:rFonts w:ascii="Times New Roman" w:hAnsi="Times New Roman"/>
+          <w:b w:val="0"/>
+          <w:smallCaps/>
+          <w:sz w:val="20"/>
+        </w:rPr>
+        <w:t xml:space="preserve">VIII. Discussion and Limitations</w:t>
       </w:r>
     </w:p>
     <w:p>
@@ -6850,7 +5463,7 @@
           <w:smallCaps/>
           <w:sz w:val="20"/>
         </w:rPr>
-        <w:t xml:space="preserve">VIII. Conclusion and Future Work</w:t>
+        <w:t xml:space="preserve">IX. Conclusion and Future Work</w:t>
       </w:r>
     </w:p>
     <w:p>
@@ -6870,6 +5483,7 @@
     </w:p>
     <w:p>
       <w:pPr>
+        <w:keepNext/>
         <w:spacing w:before="100" w:after="40"/>
         <w:jc w:val="center"/>
       </w:pPr>

</xml_diff>

<commit_message>
Paper: remove the [Guide Email ID] placeholder from the author block
Co-Authored-By: Claude Opus 5.5 <noreply@anthropic.com>
Claude-Session: https://claude.ai/code/session_01AcTDn63VcP6Nv3uyNpnTqr
</commit_message>
<xml_diff>
--- a/paper/Adaptive_LLM_Model_Routing_IEEE_Paper.docx
+++ b/paper/Adaptive_LLM_Model_Routing_IEEE_Paper.docx
@@ -232,21 +232,6 @@
                 <w:sz w:val="16"/>
               </w:rPr>
               <w:t>Chennai, Tamil Nadu, India</w:t>
-            </w:r>
-          </w:p>
-          <w:p>
-            <w:pPr>
-              <w:spacing w:before="0" w:after="0" w:line="240" w:lineRule="auto"/>
-              <w:jc w:val="center"/>
-            </w:pPr>
-            <w:r>
-              <w:rPr>
-                <w:rFonts w:ascii="Times New Roman" w:hAnsi="Times New Roman"/>
-                <w:b w:val="0"/>
-                <w:i w:val="0"/>
-                <w:sz w:val="16"/>
-              </w:rPr>
-              <w:t>[Guide Email ID]</w:t>
             </w:r>
           </w:p>
         </w:tc>

</xml_diff>

<commit_message>
Paper: remove blank gaps, put references on a page of their own
- Figures become full-width frames pinned to the top of a page instead of
  being wrapped in continuous section breaks, which left blank bands in Word
  when a figure did not fit.
- The three results tables are redesigned to fit one column and flow with
  the text (failure rate, 0 for every policy, moves into the text).
- The reference list starts on a new page that holds references only; the
  last text page has balanced columns.
- Add a deployment-implications paragraph and expand future work.

Co-Authored-By: Claude Opus 5.5 <noreply@anthropic.com>
Claude-Session: https://claude.ai/code/session_01AcTDn63VcP6Nv3uyNpnTqr
</commit_message>
<xml_diff>
--- a/paper/Adaptive_LLM_Model_Routing_IEEE_Paper.docx
+++ b/paper/Adaptive_LLM_Model_Routing_IEEE_Paper.docx
@@ -734,17 +734,9 @@
     </w:p>
     <w:p>
       <w:pPr>
-        <w:sectPr>
-          <w:type w:val="continuous"/>
-          <w:pgSz w:w="11909" w:h="16834"/>
-          <w:pgMar w:top="778" w:right="893" w:bottom="1440" w:left="893" w:header="288" w:footer="360" w:gutter="0"/>
-          <w:cols w:space="360" w:num="2"/>
-          <w:docGrid w:linePitch="360"/>
-        </w:sectPr>
-      </w:pPr>
-    </w:p>
-    <w:p>
-      <w:pPr>
+        <w:keepNext/>
+        <w:framePr w:w="10123" w:vSpace="160" w:wrap="notBeside" w:vAnchor="margin" w:hAnchor="margin" w:xAlign="center" w:yAlign="top"/>
+        <w:spacing w:before="0" w:after="0"/>
         <w:jc w:val="center"/>
       </w:pPr>
       <w:r>
@@ -784,8 +776,8 @@
     </w:p>
     <w:p>
       <w:pPr>
-        <w:keepNext w:val="0"/>
-        <w:spacing w:before="20" w:after="60"/>
+        <w:framePr w:w="10123" w:vSpace="160" w:wrap="notBeside" w:vAnchor="margin" w:hAnchor="margin" w:xAlign="center" w:yAlign="top"/>
+        <w:spacing w:before="40" w:after="0"/>
         <w:jc w:val="center"/>
       </w:pPr>
       <w:r>
@@ -795,17 +787,6 @@
         </w:rPr>
         <w:t xml:space="preserve">Fig. 1. Proposed adaptive LLM routing loop with contextual-bandit feedback.</w:t>
       </w:r>
-    </w:p>
-    <w:p>
-      <w:pPr>
-        <w:sectPr>
-          <w:type w:val="continuous"/>
-          <w:pgSz w:w="11909" w:h="16834"/>
-          <w:pgMar w:top="778" w:right="893" w:bottom="1440" w:left="893" w:header="288" w:footer="360" w:gutter="0"/>
-          <w:cols w:space="360" w:num="1"/>
-          <w:docGrid w:linePitch="360"/>
-        </w:sectPr>
-      </w:pPr>
     </w:p>
     <w:p>
       <w:pPr>
@@ -962,7 +943,7 @@
           <w:rFonts w:ascii="Times New Roman" w:hAnsi="Times New Roman"/>
           <w:sz w:val="20"/>
         </w:rPr>
-        <w:t xml:space="preserve">Table I summarizes the 900 logged outcomes (300 problems × 3 models). No request failed or timed out. The three models are close in accuracy: Qwen3-8B is highest at 95.7%, Qwen3-14B reaches 95.2%, and Qwen3-4B 94.8%, a gap of one to two problems out of 210. Cost per request, by contrast, is 2.2 and 3.3 times higher for the 8B and 14B models. Latency does not follow size: the 14B model produced the shortest answers (231 output tokens on average) and had the lowest mean latency, so on this hardware and FP8 setup latency is governed more by answer length than by parameter count. The development split is harder for the small model (86.7% versus 92.2% and 94.4%), a reminder that 90 queries give noisy estimates. On the test split at least one model is correct on 209 of 210 problems; Qwen3-4B is wrong but a larger model is right on 10 of them.</w:t>
+        <w:t xml:space="preserve">Table I summarizes the 900 logged outcomes (300 problems × 3 models); latency, output tokens, and cost are held-out means. No request failed or timed out, so the failure rate is 0 for every policy. The three models are close in accuracy: Qwen3-8B is highest at 95.7%, Qwen3-14B reaches 95.2%, and Qwen3-4B 94.8%, a gap of one to two problems out of 210. Cost per request, by contrast, is 2.2 and 3.3 times higher for the 8B and 14B models. Latency does not follow size: the 14B model produced the shortest answers (231 output tokens on average) and had the lowest mean latency, so on this hardware and FP8 setup latency is governed more by answer length than by parameter count. The development split is harder for the small model (86.7% versus 92.2% and 94.4%), a reminder that 90 queries give noisy estimates. On the test split at least one model is correct on 209 of 210 problems; Qwen3-4B is wrong but a larger model is right on 10 of them.</w:t>
       </w:r>
     </w:p>
     <w:p>
@@ -982,17 +963,6 @@
     </w:p>
     <w:p>
       <w:pPr>
-        <w:sectPr>
-          <w:type w:val="continuous"/>
-          <w:pgSz w:w="11909" w:h="16834"/>
-          <w:pgMar w:top="778" w:right="893" w:bottom="1440" w:left="893" w:header="288" w:footer="360" w:gutter="0"/>
-          <w:cols w:space="360" w:num="2"/>
-          <w:docGrid w:linePitch="360"/>
-        </w:sectPr>
-      </w:pPr>
-    </w:p>
-    <w:p>
-      <w:pPr>
         <w:keepNext/>
         <w:spacing w:before="60" w:after="40"/>
         <w:jc w:val="center"/>
@@ -1005,12 +975,12 @@
         </w:rPr>
         <w:t>TABLE I</w:t>
         <w:br/>
-        <w:t xml:space="preserve">PER-MODEL OUTCOMES ON GSM8K (DEV n = 90, TEST n = 210) AND LINUCB SELECTION SHARE ON TEST</w:t>
+        <w:t xml:space="preserve">PER-MODEL OUTCOMES ON GSM8K AND LINUCB SELECTION SHARE</w:t>
       </w:r>
     </w:p>
     <w:tbl>
       <w:tblPr>
-        <w:tblW w:type="dxa" w:w="10123"/>
+        <w:tblW w:type="dxa" w:w="4824"/>
         <w:jc w:val="center"/>
         <w:tblBorders>
           <w:top w:val="single" w:sz="4" w:color="808080"/>
@@ -1024,12 +994,12 @@
         <w:tblLook w:val="04A0" w:firstRow="1" w:lastRow="0" w:firstColumn="1" w:lastColumn="0" w:noHBand="0" w:noVBand="1"/>
       </w:tblPr>
       <w:tblGrid>
-        <w:gridCol w:w="1500"/>
-        <w:gridCol w:w="1700"/>
-        <w:gridCol w:w="1700"/>
-        <w:gridCol w:w="1700"/>
-        <w:gridCol w:w="1700"/>
-        <w:gridCol w:w="1823"/>
+        <w:gridCol w:w="880"/>
+        <w:gridCol w:w="1064"/>
+        <w:gridCol w:w="720"/>
+        <w:gridCol w:w="720"/>
+        <w:gridCol w:w="720"/>
+        <w:gridCol w:w="720"/>
       </w:tblGrid>
       <w:tr>
         <w:trPr>
@@ -1037,7 +1007,7 @@
         </w:trPr>
         <w:tc>
           <w:tcPr>
-            <w:tcW w:type="dxa" w:w="1500"/>
+            <w:tcW w:type="dxa" w:w="880"/>
             <w:shd w:val="clear" w:color="auto" w:fill="E7E6E6"/>
             <w:tcMar>
               <w:top w:w="40" w:type="dxa"/>
@@ -1056,7 +1026,7 @@
               <w:rPr>
                 <w:rFonts w:ascii="Times New Roman" w:hAnsi="Times New Roman"/>
                 <w:b/>
-                <w:sz w:val="14"/>
+                <w:sz w:val="13"/>
               </w:rPr>
               <w:t xml:space="preserve">Model</w:t>
             </w:r>
@@ -1064,7 +1034,7 @@
         </w:tc>
         <w:tc>
           <w:tcPr>
-            <w:tcW w:type="dxa" w:w="1700"/>
+            <w:tcW w:type="dxa" w:w="1064"/>
             <w:shd w:val="clear" w:color="auto" w:fill="E7E6E6"/>
             <w:tcMar>
               <w:top w:w="40" w:type="dxa"/>
@@ -1083,15 +1053,15 @@
               <w:rPr>
                 <w:rFonts w:ascii="Times New Roman" w:hAnsi="Times New Roman"/>
                 <w:b/>
-                <w:sz w:val="14"/>
+                <w:sz w:val="13"/>
               </w:rPr>
-              <w:t xml:space="preserve">Accuracy Dev / Test</w:t>
+              <w:t xml:space="preserve">Acc. Dev / Test</w:t>
             </w:r>
           </w:p>
         </w:tc>
         <w:tc>
           <w:tcPr>
-            <w:tcW w:type="dxa" w:w="1700"/>
+            <w:tcW w:type="dxa" w:w="720"/>
             <w:shd w:val="clear" w:color="auto" w:fill="E7E6E6"/>
             <w:tcMar>
               <w:top w:w="40" w:type="dxa"/>
@@ -1110,15 +1080,15 @@
               <w:rPr>
                 <w:rFonts w:ascii="Times New Roman" w:hAnsi="Times New Roman"/>
                 <w:b/>
-                <w:sz w:val="14"/>
+                <w:sz w:val="13"/>
               </w:rPr>
-              <w:t xml:space="preserve">Mean Latency (ms, test)</w:t>
+              <w:t xml:space="preserve">Latency (s)</w:t>
             </w:r>
           </w:p>
         </w:tc>
         <w:tc>
           <w:tcPr>
-            <w:tcW w:type="dxa" w:w="1700"/>
+            <w:tcW w:type="dxa" w:w="720"/>
             <w:shd w:val="clear" w:color="auto" w:fill="E7E6E6"/>
             <w:tcMar>
               <w:top w:w="40" w:type="dxa"/>
@@ -1137,15 +1107,15 @@
               <w:rPr>
                 <w:rFonts w:ascii="Times New Roman" w:hAnsi="Times New Roman"/>
                 <w:b/>
-                <w:sz w:val="14"/>
+                <w:sz w:val="13"/>
               </w:rPr>
-              <w:t xml:space="preserve">Mean Output Tokens (test)</w:t>
+              <w:t xml:space="preserve">Output Tokens</w:t>
             </w:r>
           </w:p>
         </w:tc>
         <w:tc>
           <w:tcPr>
-            <w:tcW w:type="dxa" w:w="1700"/>
+            <w:tcW w:type="dxa" w:w="720"/>
             <w:shd w:val="clear" w:color="auto" w:fill="E7E6E6"/>
             <w:tcMar>
               <w:top w:w="40" w:type="dxa"/>
@@ -1164,15 +1134,15 @@
               <w:rPr>
                 <w:rFonts w:ascii="Times New Roman" w:hAnsi="Times New Roman"/>
                 <w:b/>
-                <w:sz w:val="14"/>
+                <w:sz w:val="13"/>
               </w:rPr>
-              <w:t xml:space="preserve">Cost / Request (test)</w:t>
+              <w:t xml:space="preserve">Cost / Req.</w:t>
             </w:r>
           </w:p>
         </w:tc>
         <w:tc>
           <w:tcPr>
-            <w:tcW w:type="dxa" w:w="1823"/>
+            <w:tcW w:type="dxa" w:w="720"/>
             <w:shd w:val="clear" w:color="auto" w:fill="E7E6E6"/>
             <w:tcMar>
               <w:top w:w="40" w:type="dxa"/>
@@ -1191,9 +1161,9 @@
               <w:rPr>
                 <w:rFonts w:ascii="Times New Roman" w:hAnsi="Times New Roman"/>
                 <w:b/>
-                <w:sz w:val="14"/>
+                <w:sz w:val="13"/>
               </w:rPr>
-              <w:t xml:space="preserve">LinUCB Share (test)</w:t>
+              <w:t xml:space="preserve">LinUCB Share</w:t>
             </w:r>
           </w:p>
         </w:tc>
@@ -1204,7 +1174,7 @@
         </w:trPr>
         <w:tc>
           <w:tcPr>
-            <w:tcW w:type="dxa" w:w="1500"/>
+            <w:tcW w:type="dxa" w:w="880"/>
             <w:tcMar>
               <w:top w:w="40" w:type="dxa"/>
               <w:start w:w="50" w:type="dxa"/>
@@ -1222,7 +1192,7 @@
               <w:rPr>
                 <w:rFonts w:ascii="Times New Roman" w:hAnsi="Times New Roman"/>
                 <w:b w:val="0"/>
-                <w:sz w:val="14"/>
+                <w:sz w:val="13"/>
               </w:rPr>
               <w:t xml:space="preserve">Qwen3-4B</w:t>
             </w:r>
@@ -1230,7 +1200,7 @@
         </w:tc>
         <w:tc>
           <w:tcPr>
-            <w:tcW w:type="dxa" w:w="1700"/>
+            <w:tcW w:type="dxa" w:w="1064"/>
             <w:tcMar>
               <w:top w:w="40" w:type="dxa"/>
               <w:start w:w="50" w:type="dxa"/>
@@ -1248,7 +1218,7 @@
               <w:rPr>
                 <w:rFonts w:ascii="Times New Roman" w:hAnsi="Times New Roman"/>
                 <w:b w:val="0"/>
-                <w:sz w:val="14"/>
+                <w:sz w:val="13"/>
               </w:rPr>
               <w:t xml:space="preserve">0.867 / 0.948</w:t>
             </w:r>
@@ -1256,7 +1226,7 @@
         </w:tc>
         <w:tc>
           <w:tcPr>
-            <w:tcW w:type="dxa" w:w="1700"/>
+            <w:tcW w:type="dxa" w:w="720"/>
             <w:tcMar>
               <w:top w:w="40" w:type="dxa"/>
               <w:start w:w="50" w:type="dxa"/>
@@ -1274,15 +1244,15 @@
               <w:rPr>
                 <w:rFonts w:ascii="Times New Roman" w:hAnsi="Times New Roman"/>
                 <w:b w:val="0"/>
-                <w:sz w:val="14"/>
+                <w:sz w:val="13"/>
               </w:rPr>
-              <w:t xml:space="preserve">5,371</w:t>
+              <w:t xml:space="preserve">5.37</w:t>
             </w:r>
           </w:p>
         </w:tc>
         <w:tc>
           <w:tcPr>
-            <w:tcW w:type="dxa" w:w="1700"/>
+            <w:tcW w:type="dxa" w:w="720"/>
             <w:tcMar>
               <w:top w:w="40" w:type="dxa"/>
               <w:start w:w="50" w:type="dxa"/>
@@ -1300,7 +1270,7 @@
               <w:rPr>
                 <w:rFonts w:ascii="Times New Roman" w:hAnsi="Times New Roman"/>
                 <w:b w:val="0"/>
-                <w:sz w:val="14"/>
+                <w:sz w:val="13"/>
               </w:rPr>
               <w:t xml:space="preserve">251</w:t>
             </w:r>
@@ -1308,7 +1278,7 @@
         </w:tc>
         <w:tc>
           <w:tcPr>
-            <w:tcW w:type="dxa" w:w="1700"/>
+            <w:tcW w:type="dxa" w:w="720"/>
             <w:tcMar>
               <w:top w:w="40" w:type="dxa"/>
               <w:start w:w="50" w:type="dxa"/>
@@ -1326,15 +1296,15 @@
               <w:rPr>
                 <w:rFonts w:ascii="Times New Roman" w:hAnsi="Times New Roman"/>
                 <w:b w:val="0"/>
-                <w:sz w:val="14"/>
+                <w:sz w:val="13"/>
               </w:rPr>
-              <w:t xml:space="preserve">1.423</w:t>
+              <w:t xml:space="preserve">1.42</w:t>
             </w:r>
           </w:p>
         </w:tc>
         <w:tc>
           <w:tcPr>
-            <w:tcW w:type="dxa" w:w="1823"/>
+            <w:tcW w:type="dxa" w:w="720"/>
             <w:tcMar>
               <w:top w:w="40" w:type="dxa"/>
               <w:start w:w="50" w:type="dxa"/>
@@ -1352,7 +1322,7 @@
               <w:rPr>
                 <w:rFonts w:ascii="Times New Roman" w:hAnsi="Times New Roman"/>
                 <w:b w:val="0"/>
-                <w:sz w:val="14"/>
+                <w:sz w:val="13"/>
               </w:rPr>
               <w:t xml:space="preserve">0.982</w:t>
             </w:r>
@@ -1365,7 +1335,7 @@
         </w:trPr>
         <w:tc>
           <w:tcPr>
-            <w:tcW w:type="dxa" w:w="1500"/>
+            <w:tcW w:type="dxa" w:w="880"/>
             <w:tcMar>
               <w:top w:w="40" w:type="dxa"/>
               <w:start w:w="50" w:type="dxa"/>
@@ -1383,7 +1353,7 @@
               <w:rPr>
                 <w:rFonts w:ascii="Times New Roman" w:hAnsi="Times New Roman"/>
                 <w:b w:val="0"/>
-                <w:sz w:val="14"/>
+                <w:sz w:val="13"/>
               </w:rPr>
               <w:t xml:space="preserve">Qwen3-8B</w:t>
             </w:r>
@@ -1391,7 +1361,7 @@
         </w:tc>
         <w:tc>
           <w:tcPr>
-            <w:tcW w:type="dxa" w:w="1700"/>
+            <w:tcW w:type="dxa" w:w="1064"/>
             <w:tcMar>
               <w:top w:w="40" w:type="dxa"/>
               <w:start w:w="50" w:type="dxa"/>
@@ -1409,7 +1379,7 @@
               <w:rPr>
                 <w:rFonts w:ascii="Times New Roman" w:hAnsi="Times New Roman"/>
                 <w:b w:val="0"/>
-                <w:sz w:val="14"/>
+                <w:sz w:val="13"/>
               </w:rPr>
               <w:t xml:space="preserve">0.922 / 0.957</w:t>
             </w:r>
@@ -1417,7 +1387,7 @@
         </w:tc>
         <w:tc>
           <w:tcPr>
-            <w:tcW w:type="dxa" w:w="1700"/>
+            <w:tcW w:type="dxa" w:w="720"/>
             <w:tcMar>
               <w:top w:w="40" w:type="dxa"/>
               <w:start w:w="50" w:type="dxa"/>
@@ -1435,15 +1405,15 @@
               <w:rPr>
                 <w:rFonts w:ascii="Times New Roman" w:hAnsi="Times New Roman"/>
                 <w:b w:val="0"/>
-                <w:sz w:val="14"/>
+                <w:sz w:val="13"/>
               </w:rPr>
-              <w:t xml:space="preserve">5,831</w:t>
+              <w:t xml:space="preserve">5.83</w:t>
             </w:r>
           </w:p>
         </w:tc>
         <w:tc>
           <w:tcPr>
-            <w:tcW w:type="dxa" w:w="1700"/>
+            <w:tcW w:type="dxa" w:w="720"/>
             <w:tcMar>
               <w:top w:w="40" w:type="dxa"/>
               <w:start w:w="50" w:type="dxa"/>
@@ -1461,7 +1431,7 @@
               <w:rPr>
                 <w:rFonts w:ascii="Times New Roman" w:hAnsi="Times New Roman"/>
                 <w:b w:val="0"/>
-                <w:sz w:val="14"/>
+                <w:sz w:val="13"/>
               </w:rPr>
               <w:t xml:space="preserve">280</w:t>
             </w:r>
@@ -1469,7 +1439,7 @@
         </w:tc>
         <w:tc>
           <w:tcPr>
-            <w:tcW w:type="dxa" w:w="1700"/>
+            <w:tcW w:type="dxa" w:w="720"/>
             <w:tcMar>
               <w:top w:w="40" w:type="dxa"/>
               <w:start w:w="50" w:type="dxa"/>
@@ -1487,15 +1457,15 @@
               <w:rPr>
                 <w:rFonts w:ascii="Times New Roman" w:hAnsi="Times New Roman"/>
                 <w:b w:val="0"/>
-                <w:sz w:val="14"/>
+                <w:sz w:val="13"/>
               </w:rPr>
-              <w:t xml:space="preserve">3.075</w:t>
+              <w:t xml:space="preserve">3.08</w:t>
             </w:r>
           </w:p>
         </w:tc>
         <w:tc>
           <w:tcPr>
-            <w:tcW w:type="dxa" w:w="1823"/>
+            <w:tcW w:type="dxa" w:w="720"/>
             <w:tcMar>
               <w:top w:w="40" w:type="dxa"/>
               <w:start w:w="50" w:type="dxa"/>
@@ -1513,7 +1483,7 @@
               <w:rPr>
                 <w:rFonts w:ascii="Times New Roman" w:hAnsi="Times New Roman"/>
                 <w:b w:val="0"/>
-                <w:sz w:val="14"/>
+                <w:sz w:val="13"/>
               </w:rPr>
               <w:t xml:space="preserve">0.012</w:t>
             </w:r>
@@ -1526,7 +1496,7 @@
         </w:trPr>
         <w:tc>
           <w:tcPr>
-            <w:tcW w:type="dxa" w:w="1500"/>
+            <w:tcW w:type="dxa" w:w="880"/>
             <w:tcMar>
               <w:top w:w="40" w:type="dxa"/>
               <w:start w:w="50" w:type="dxa"/>
@@ -1544,7 +1514,7 @@
               <w:rPr>
                 <w:rFonts w:ascii="Times New Roman" w:hAnsi="Times New Roman"/>
                 <w:b w:val="0"/>
-                <w:sz w:val="14"/>
+                <w:sz w:val="13"/>
               </w:rPr>
               <w:t xml:space="preserve">Qwen3-14B</w:t>
             </w:r>
@@ -1552,7 +1522,7 @@
         </w:tc>
         <w:tc>
           <w:tcPr>
-            <w:tcW w:type="dxa" w:w="1700"/>
+            <w:tcW w:type="dxa" w:w="1064"/>
             <w:tcMar>
               <w:top w:w="40" w:type="dxa"/>
               <w:start w:w="50" w:type="dxa"/>
@@ -1570,7 +1540,7 @@
               <w:rPr>
                 <w:rFonts w:ascii="Times New Roman" w:hAnsi="Times New Roman"/>
                 <w:b w:val="0"/>
-                <w:sz w:val="14"/>
+                <w:sz w:val="13"/>
               </w:rPr>
               <w:t xml:space="preserve">0.944 / 0.952</w:t>
             </w:r>
@@ -1578,7 +1548,7 @@
         </w:tc>
         <w:tc>
           <w:tcPr>
-            <w:tcW w:type="dxa" w:w="1700"/>
+            <w:tcW w:type="dxa" w:w="720"/>
             <w:tcMar>
               <w:top w:w="40" w:type="dxa"/>
               <w:start w:w="50" w:type="dxa"/>
@@ -1596,15 +1566,15 @@
               <w:rPr>
                 <w:rFonts w:ascii="Times New Roman" w:hAnsi="Times New Roman"/>
                 <w:b w:val="0"/>
-                <w:sz w:val="14"/>
+                <w:sz w:val="13"/>
               </w:rPr>
-              <w:t xml:space="preserve">5,235</w:t>
+              <w:t xml:space="preserve">5.24</w:t>
             </w:r>
           </w:p>
         </w:tc>
         <w:tc>
           <w:tcPr>
-            <w:tcW w:type="dxa" w:w="1700"/>
+            <w:tcW w:type="dxa" w:w="720"/>
             <w:tcMar>
               <w:top w:w="40" w:type="dxa"/>
               <w:start w:w="50" w:type="dxa"/>
@@ -1622,7 +1592,7 @@
               <w:rPr>
                 <w:rFonts w:ascii="Times New Roman" w:hAnsi="Times New Roman"/>
                 <w:b w:val="0"/>
-                <w:sz w:val="14"/>
+                <w:sz w:val="13"/>
               </w:rPr>
               <w:t xml:space="preserve">231</w:t>
             </w:r>
@@ -1630,7 +1600,7 @@
         </w:tc>
         <w:tc>
           <w:tcPr>
-            <w:tcW w:type="dxa" w:w="1700"/>
+            <w:tcW w:type="dxa" w:w="720"/>
             <w:tcMar>
               <w:top w:w="40" w:type="dxa"/>
               <w:start w:w="50" w:type="dxa"/>
@@ -1648,15 +1618,15 @@
               <w:rPr>
                 <w:rFonts w:ascii="Times New Roman" w:hAnsi="Times New Roman"/>
                 <w:b w:val="0"/>
-                <w:sz w:val="14"/>
+                <w:sz w:val="13"/>
               </w:rPr>
-              <w:t xml:space="preserve">4.706</w:t>
+              <w:t xml:space="preserve">4.71</w:t>
             </w:r>
           </w:p>
         </w:tc>
         <w:tc>
           <w:tcPr>
-            <w:tcW w:type="dxa" w:w="1823"/>
+            <w:tcW w:type="dxa" w:w="720"/>
             <w:tcMar>
               <w:top w:w="40" w:type="dxa"/>
               <w:start w:w="50" w:type="dxa"/>
@@ -1674,7 +1644,7 @@
               <w:rPr>
                 <w:rFonts w:ascii="Times New Roman" w:hAnsi="Times New Roman"/>
                 <w:b w:val="0"/>
-                <w:sz w:val="14"/>
+                <w:sz w:val="13"/>
               </w:rPr>
               <w:t xml:space="preserve">0.006</w:t>
             </w:r>
@@ -1682,17 +1652,6 @@
         </w:tc>
       </w:tr>
     </w:tbl>
-    <w:p>
-      <w:pPr>
-        <w:sectPr>
-          <w:type w:val="continuous"/>
-          <w:pgSz w:w="11909" w:h="16834"/>
-          <w:pgMar w:top="778" w:right="893" w:bottom="1440" w:left="893" w:header="288" w:footer="360" w:gutter="0"/>
-          <w:cols w:space="360" w:num="1"/>
-          <w:docGrid w:linePitch="360"/>
-        </w:sectPr>
-      </w:pPr>
-    </w:p>
     <w:p>
       <w:pPr>
         <w:keepNext/>
@@ -1711,17 +1670,6 @@
     </w:p>
     <w:p>
       <w:pPr>
-        <w:sectPr>
-          <w:type w:val="continuous"/>
-          <w:pgSz w:w="11909" w:h="16834"/>
-          <w:pgMar w:top="778" w:right="893" w:bottom="1440" w:left="893" w:header="288" w:footer="360" w:gutter="0"/>
-          <w:cols w:space="360" w:num="2"/>
-          <w:docGrid w:linePitch="360"/>
-        </w:sectPr>
-      </w:pPr>
-    </w:p>
-    <w:p>
-      <w:pPr>
         <w:keepNext/>
         <w:spacing w:before="60" w:after="40"/>
         <w:jc w:val="center"/>
@@ -1734,12 +1682,12 @@
         </w:rPr>
         <w:t>TABLE II</w:t>
         <w:br/>
-        <w:t xml:space="preserve">OVERALL POLICY COMPARISON ON THE HELD-OUT SPLIT (210 QUERIES, MEAN ± SD OVER 5 SEEDS)</w:t>
+        <w:t xml:space="preserve">POLICY COMPARISON ON THE HELD-OUT SPLIT (MEAN ± SD OVER 5 SEEDS)</w:t>
       </w:r>
     </w:p>
     <w:tbl>
       <w:tblPr>
-        <w:tblW w:type="dxa" w:w="10123"/>
+        <w:tblW w:type="dxa" w:w="4824"/>
         <w:jc w:val="center"/>
         <w:tblBorders>
           <w:top w:val="single" w:sz="4" w:color="808080"/>
@@ -1753,14 +1701,12 @@
         <w:tblLook w:val="04A0" w:firstRow="1" w:lastRow="0" w:firstColumn="1" w:lastColumn="0" w:noHBand="0" w:noVBand="1"/>
       </w:tblPr>
       <w:tblGrid>
-        <w:gridCol w:w="1723"/>
-        <w:gridCol w:w="1200"/>
-        <w:gridCol w:w="1200"/>
-        <w:gridCol w:w="1200"/>
-        <w:gridCol w:w="1200"/>
-        <w:gridCol w:w="1200"/>
-        <w:gridCol w:w="1200"/>
-        <w:gridCol w:w="1200"/>
+        <w:gridCol w:w="824"/>
+        <w:gridCol w:w="880"/>
+        <w:gridCol w:w="900"/>
+        <w:gridCol w:w="760"/>
+        <w:gridCol w:w="760"/>
+        <w:gridCol w:w="700"/>
       </w:tblGrid>
       <w:tr>
         <w:trPr>
@@ -1768,7 +1714,7 @@
         </w:trPr>
         <w:tc>
           <w:tcPr>
-            <w:tcW w:type="dxa" w:w="1723"/>
+            <w:tcW w:type="dxa" w:w="824"/>
             <w:shd w:val="clear" w:color="auto" w:fill="E7E6E6"/>
             <w:tcMar>
               <w:top w:w="40" w:type="dxa"/>
@@ -1795,7 +1741,7 @@
         </w:tc>
         <w:tc>
           <w:tcPr>
-            <w:tcW w:type="dxa" w:w="1200"/>
+            <w:tcW w:type="dxa" w:w="880"/>
             <w:shd w:val="clear" w:color="auto" w:fill="E7E6E6"/>
             <w:tcMar>
               <w:top w:w="40" w:type="dxa"/>
@@ -1816,13 +1762,13 @@
                 <w:b/>
                 <w:sz w:val="13"/>
               </w:rPr>
-              <w:t xml:space="preserve">Mean Quality</w:t>
+              <w:t xml:space="preserve">Accuracy</w:t>
             </w:r>
           </w:p>
         </w:tc>
         <w:tc>
           <w:tcPr>
-            <w:tcW w:type="dxa" w:w="1200"/>
+            <w:tcW w:type="dxa" w:w="900"/>
             <w:shd w:val="clear" w:color="auto" w:fill="E7E6E6"/>
             <w:tcMar>
               <w:top w:w="40" w:type="dxa"/>
@@ -1843,13 +1789,13 @@
                 <w:b/>
                 <w:sz w:val="13"/>
               </w:rPr>
-              <w:t xml:space="preserve">Mean Latency (ms)</w:t>
+              <w:t xml:space="preserve">Latency Mean / p95 (s)</w:t>
             </w:r>
           </w:p>
         </w:tc>
         <w:tc>
           <w:tcPr>
-            <w:tcW w:type="dxa" w:w="1200"/>
+            <w:tcW w:type="dxa" w:w="760"/>
             <w:shd w:val="clear" w:color="auto" w:fill="E7E6E6"/>
             <w:tcMar>
               <w:top w:w="40" w:type="dxa"/>
@@ -1870,13 +1816,13 @@
                 <w:b/>
                 <w:sz w:val="13"/>
               </w:rPr>
-              <w:t xml:space="preserve">p95 Latency (ms)</w:t>
+              <w:t xml:space="preserve">Cost / Req.</w:t>
             </w:r>
           </w:p>
         </w:tc>
         <w:tc>
           <w:tcPr>
-            <w:tcW w:type="dxa" w:w="1200"/>
+            <w:tcW w:type="dxa" w:w="760"/>
             <w:shd w:val="clear" w:color="auto" w:fill="E7E6E6"/>
             <w:tcMar>
               <w:top w:w="40" w:type="dxa"/>
@@ -1897,67 +1843,13 @@
                 <w:b/>
                 <w:sz w:val="13"/>
               </w:rPr>
-              <w:t xml:space="preserve">Cost / Request</w:t>
+              <w:t xml:space="preserve">Cum. Reward</w:t>
             </w:r>
           </w:p>
         </w:tc>
         <w:tc>
           <w:tcPr>
-            <w:tcW w:type="dxa" w:w="1200"/>
-            <w:shd w:val="clear" w:color="auto" w:fill="E7E6E6"/>
-            <w:tcMar>
-              <w:top w:w="40" w:type="dxa"/>
-              <w:start w:w="50" w:type="dxa"/>
-              <w:bottom w:w="40" w:type="dxa"/>
-              <w:end w:w="50" w:type="dxa"/>
-            </w:tcMar>
-            <w:vAlign w:val="center"/>
-          </w:tcPr>
-          <w:p>
-            <w:pPr>
-              <w:spacing w:before="0" w:after="0" w:line="240" w:lineRule="auto"/>
-              <w:jc w:val="center"/>
-            </w:pPr>
-            <w:r>
-              <w:rPr>
-                <w:rFonts w:ascii="Times New Roman" w:hAnsi="Times New Roman"/>
-                <w:b/>
-                <w:sz w:val="13"/>
-              </w:rPr>
-              <w:t xml:space="preserve">Failure Rate</w:t>
-            </w:r>
-          </w:p>
-        </w:tc>
-        <w:tc>
-          <w:tcPr>
-            <w:tcW w:type="dxa" w:w="1200"/>
-            <w:shd w:val="clear" w:color="auto" w:fill="E7E6E6"/>
-            <w:tcMar>
-              <w:top w:w="40" w:type="dxa"/>
-              <w:start w:w="50" w:type="dxa"/>
-              <w:bottom w:w="40" w:type="dxa"/>
-              <w:end w:w="50" w:type="dxa"/>
-            </w:tcMar>
-            <w:vAlign w:val="center"/>
-          </w:tcPr>
-          <w:p>
-            <w:pPr>
-              <w:spacing w:before="0" w:after="0" w:line="240" w:lineRule="auto"/>
-              <w:jc w:val="center"/>
-            </w:pPr>
-            <w:r>
-              <w:rPr>
-                <w:rFonts w:ascii="Times New Roman" w:hAnsi="Times New Roman"/>
-                <w:b/>
-                <w:sz w:val="13"/>
-              </w:rPr>
-              <w:t xml:space="preserve">Cumulative Reward</w:t>
-            </w:r>
-          </w:p>
-        </w:tc>
-        <w:tc>
-          <w:tcPr>
-            <w:tcW w:type="dxa" w:w="1200"/>
+            <w:tcW w:type="dxa" w:w="700"/>
             <w:shd w:val="clear" w:color="auto" w:fill="E7E6E6"/>
             <w:tcMar>
               <w:top w:w="40" w:type="dxa"/>
@@ -1989,7 +1881,7 @@
         </w:trPr>
         <w:tc>
           <w:tcPr>
-            <w:tcW w:type="dxa" w:w="1723"/>
+            <w:tcW w:type="dxa" w:w="824"/>
             <w:tcMar>
               <w:top w:w="40" w:type="dxa"/>
               <w:start w:w="50" w:type="dxa"/>
@@ -2015,7 +1907,7 @@
         </w:tc>
         <w:tc>
           <w:tcPr>
-            <w:tcW w:type="dxa" w:w="1200"/>
+            <w:tcW w:type="dxa" w:w="880"/>
             <w:tcMar>
               <w:top w:w="40" w:type="dxa"/>
               <w:start w:w="50" w:type="dxa"/>
@@ -2035,13 +1927,13 @@
                 <w:b w:val="0"/>
                 <w:sz w:val="13"/>
               </w:rPr>
-              <w:t xml:space="preserve">0.948 ± 0.000</w:t>
+              <w:t xml:space="preserve">0.948</w:t>
             </w:r>
           </w:p>
         </w:tc>
         <w:tc>
           <w:tcPr>
-            <w:tcW w:type="dxa" w:w="1200"/>
+            <w:tcW w:type="dxa" w:w="900"/>
             <w:tcMar>
               <w:top w:w="40" w:type="dxa"/>
               <w:start w:w="50" w:type="dxa"/>
@@ -2061,13 +1953,13 @@
                 <w:b w:val="0"/>
                 <w:sz w:val="13"/>
               </w:rPr>
-              <w:t xml:space="preserve">5371 ± 0</w:t>
+              <w:t xml:space="preserve">5.37 / 9.29</w:t>
             </w:r>
           </w:p>
         </w:tc>
         <w:tc>
           <w:tcPr>
-            <w:tcW w:type="dxa" w:w="1200"/>
+            <w:tcW w:type="dxa" w:w="760"/>
             <w:tcMar>
               <w:top w:w="40" w:type="dxa"/>
               <w:start w:w="50" w:type="dxa"/>
@@ -2087,13 +1979,13 @@
                 <w:b w:val="0"/>
                 <w:sz w:val="13"/>
               </w:rPr>
-              <w:t xml:space="preserve">9290 ± 0</w:t>
+              <w:t xml:space="preserve">1.42</w:t>
             </w:r>
           </w:p>
         </w:tc>
         <w:tc>
           <w:tcPr>
-            <w:tcW w:type="dxa" w:w="1200"/>
+            <w:tcW w:type="dxa" w:w="760"/>
             <w:tcMar>
               <w:top w:w="40" w:type="dxa"/>
               <w:start w:w="50" w:type="dxa"/>
@@ -2113,13 +2005,13 @@
                 <w:b w:val="0"/>
                 <w:sz w:val="13"/>
               </w:rPr>
-              <w:t xml:space="preserve">1.423 ± 0.000</w:t>
+              <w:t xml:space="preserve">176.0</w:t>
             </w:r>
           </w:p>
         </w:tc>
         <w:tc>
           <w:tcPr>
-            <w:tcW w:type="dxa" w:w="1200"/>
+            <w:tcW w:type="dxa" w:w="700"/>
             <w:tcMar>
               <w:top w:w="40" w:type="dxa"/>
               <w:start w:w="50" w:type="dxa"/>
@@ -2139,59 +2031,7 @@
                 <w:b w:val="0"/>
                 <w:sz w:val="13"/>
               </w:rPr>
-              <w:t xml:space="preserve">0.000</w:t>
-            </w:r>
-          </w:p>
-        </w:tc>
-        <w:tc>
-          <w:tcPr>
-            <w:tcW w:type="dxa" w:w="1200"/>
-            <w:tcMar>
-              <w:top w:w="40" w:type="dxa"/>
-              <w:start w:w="50" w:type="dxa"/>
-              <w:bottom w:w="40" w:type="dxa"/>
-              <w:end w:w="50" w:type="dxa"/>
-            </w:tcMar>
-            <w:vAlign w:val="center"/>
-          </w:tcPr>
-          <w:p>
-            <w:pPr>
-              <w:spacing w:before="0" w:after="0" w:line="240" w:lineRule="auto"/>
-              <w:jc w:val="center"/>
-            </w:pPr>
-            <w:r>
-              <w:rPr>
-                <w:rFonts w:ascii="Times New Roman" w:hAnsi="Times New Roman"/>
-                <w:b w:val="0"/>
-                <w:sz w:val="13"/>
-              </w:rPr>
-              <w:t xml:space="preserve">176.0 ± 0.0</w:t>
-            </w:r>
-          </w:p>
-        </w:tc>
-        <w:tc>
-          <w:tcPr>
-            <w:tcW w:type="dxa" w:w="1200"/>
-            <w:tcMar>
-              <w:top w:w="40" w:type="dxa"/>
-              <w:start w:w="50" w:type="dxa"/>
-              <w:bottom w:w="40" w:type="dxa"/>
-              <w:end w:w="50" w:type="dxa"/>
-            </w:tcMar>
-            <w:vAlign w:val="center"/>
-          </w:tcPr>
-          <w:p>
-            <w:pPr>
-              <w:spacing w:before="0" w:after="0" w:line="240" w:lineRule="auto"/>
-              <w:jc w:val="center"/>
-            </w:pPr>
-            <w:r>
-              <w:rPr>
-                <w:rFonts w:ascii="Times New Roman" w:hAnsi="Times New Roman"/>
-                <w:b w:val="0"/>
-                <w:sz w:val="13"/>
-              </w:rPr>
-              <w:t xml:space="preserve">8.9 ± 0.0</w:t>
+              <w:t xml:space="preserve">8.9</w:t>
             </w:r>
           </w:p>
         </w:tc>
@@ -2202,7 +2042,7 @@
         </w:trPr>
         <w:tc>
           <w:tcPr>
-            <w:tcW w:type="dxa" w:w="1723"/>
+            <w:tcW w:type="dxa" w:w="824"/>
             <w:tcMar>
               <w:top w:w="40" w:type="dxa"/>
               <w:start w:w="50" w:type="dxa"/>
@@ -2228,7 +2068,7 @@
         </w:tc>
         <w:tc>
           <w:tcPr>
-            <w:tcW w:type="dxa" w:w="1200"/>
+            <w:tcW w:type="dxa" w:w="880"/>
             <w:tcMar>
               <w:top w:w="40" w:type="dxa"/>
               <w:start w:w="50" w:type="dxa"/>
@@ -2248,13 +2088,13 @@
                 <w:b w:val="0"/>
                 <w:sz w:val="13"/>
               </w:rPr>
-              <w:t xml:space="preserve">0.952 ± 0.000</w:t>
+              <w:t xml:space="preserve">0.952</w:t>
             </w:r>
           </w:p>
         </w:tc>
         <w:tc>
           <w:tcPr>
-            <w:tcW w:type="dxa" w:w="1200"/>
+            <w:tcW w:type="dxa" w:w="900"/>
             <w:tcMar>
               <w:top w:w="40" w:type="dxa"/>
               <w:start w:w="50" w:type="dxa"/>
@@ -2274,13 +2114,13 @@
                 <w:b w:val="0"/>
                 <w:sz w:val="13"/>
               </w:rPr>
-              <w:t xml:space="preserve">5235 ± 0</w:t>
+              <w:t xml:space="preserve">5.24 / 8.30</w:t>
             </w:r>
           </w:p>
         </w:tc>
         <w:tc>
           <w:tcPr>
-            <w:tcW w:type="dxa" w:w="1200"/>
+            <w:tcW w:type="dxa" w:w="760"/>
             <w:tcMar>
               <w:top w:w="40" w:type="dxa"/>
               <w:start w:w="50" w:type="dxa"/>
@@ -2300,13 +2140,13 @@
                 <w:b w:val="0"/>
                 <w:sz w:val="13"/>
               </w:rPr>
-              <w:t xml:space="preserve">8297 ± 0</w:t>
+              <w:t xml:space="preserve">4.71</w:t>
             </w:r>
           </w:p>
         </w:tc>
         <w:tc>
           <w:tcPr>
-            <w:tcW w:type="dxa" w:w="1200"/>
+            <w:tcW w:type="dxa" w:w="760"/>
             <w:tcMar>
               <w:top w:w="40" w:type="dxa"/>
               <w:start w:w="50" w:type="dxa"/>
@@ -2326,13 +2166,13 @@
                 <w:b w:val="0"/>
                 <w:sz w:val="13"/>
               </w:rPr>
-              <w:t xml:space="preserve">4.706 ± 0.000</w:t>
+              <w:t xml:space="preserve">139.9</w:t>
             </w:r>
           </w:p>
         </w:tc>
         <w:tc>
           <w:tcPr>
-            <w:tcW w:type="dxa" w:w="1200"/>
+            <w:tcW w:type="dxa" w:w="700"/>
             <w:tcMar>
               <w:top w:w="40" w:type="dxa"/>
               <w:start w:w="50" w:type="dxa"/>
@@ -2352,59 +2192,7 @@
                 <w:b w:val="0"/>
                 <w:sz w:val="13"/>
               </w:rPr>
-              <w:t xml:space="preserve">0.000</w:t>
-            </w:r>
-          </w:p>
-        </w:tc>
-        <w:tc>
-          <w:tcPr>
-            <w:tcW w:type="dxa" w:w="1200"/>
-            <w:tcMar>
-              <w:top w:w="40" w:type="dxa"/>
-              <w:start w:w="50" w:type="dxa"/>
-              <w:bottom w:w="40" w:type="dxa"/>
-              <w:end w:w="50" w:type="dxa"/>
-            </w:tcMar>
-            <w:vAlign w:val="center"/>
-          </w:tcPr>
-          <w:p>
-            <w:pPr>
-              <w:spacing w:before="0" w:after="0" w:line="240" w:lineRule="auto"/>
-              <w:jc w:val="center"/>
-            </w:pPr>
-            <w:r>
-              <w:rPr>
-                <w:rFonts w:ascii="Times New Roman" w:hAnsi="Times New Roman"/>
-                <w:b w:val="0"/>
-                <w:sz w:val="13"/>
-              </w:rPr>
-              <w:t xml:space="preserve">139.9 ± 0.0</w:t>
-            </w:r>
-          </w:p>
-        </w:tc>
-        <w:tc>
-          <w:tcPr>
-            <w:tcW w:type="dxa" w:w="1200"/>
-            <w:tcMar>
-              <w:top w:w="40" w:type="dxa"/>
-              <w:start w:w="50" w:type="dxa"/>
-              <w:bottom w:w="40" w:type="dxa"/>
-              <w:end w:w="50" w:type="dxa"/>
-            </w:tcMar>
-            <w:vAlign w:val="center"/>
-          </w:tcPr>
-          <w:p>
-            <w:pPr>
-              <w:spacing w:before="0" w:after="0" w:line="240" w:lineRule="auto"/>
-              <w:jc w:val="center"/>
-            </w:pPr>
-            <w:r>
-              <w:rPr>
-                <w:rFonts w:ascii="Times New Roman" w:hAnsi="Times New Roman"/>
-                <w:b w:val="0"/>
-                <w:sz w:val="13"/>
-              </w:rPr>
-              <w:t xml:space="preserve">45.0 ± 0.0</w:t>
+              <w:t xml:space="preserve">45.0</w:t>
             </w:r>
           </w:p>
         </w:tc>
@@ -2415,7 +2203,7 @@
         </w:trPr>
         <w:tc>
           <w:tcPr>
-            <w:tcW w:type="dxa" w:w="1723"/>
+            <w:tcW w:type="dxa" w:w="824"/>
             <w:tcMar>
               <w:top w:w="40" w:type="dxa"/>
               <w:start w:w="50" w:type="dxa"/>
@@ -2441,7 +2229,7 @@
         </w:tc>
         <w:tc>
           <w:tcPr>
-            <w:tcW w:type="dxa" w:w="1200"/>
+            <w:tcW w:type="dxa" w:w="880"/>
             <w:tcMar>
               <w:top w:w="40" w:type="dxa"/>
               <w:start w:w="50" w:type="dxa"/>
@@ -2467,7 +2255,7 @@
         </w:tc>
         <w:tc>
           <w:tcPr>
-            <w:tcW w:type="dxa" w:w="1200"/>
+            <w:tcW w:type="dxa" w:w="900"/>
             <w:tcMar>
               <w:top w:w="40" w:type="dxa"/>
               <w:start w:w="50" w:type="dxa"/>
@@ -2487,13 +2275,13 @@
                 <w:b w:val="0"/>
                 <w:sz w:val="13"/>
               </w:rPr>
-              <w:t xml:space="preserve">5464 ± 61</w:t>
+              <w:t xml:space="preserve">5.46 / 8.52</w:t>
             </w:r>
           </w:p>
         </w:tc>
         <w:tc>
           <w:tcPr>
-            <w:tcW w:type="dxa" w:w="1200"/>
+            <w:tcW w:type="dxa" w:w="760"/>
             <w:tcMar>
               <w:top w:w="40" w:type="dxa"/>
               <w:start w:w="50" w:type="dxa"/>
@@ -2513,65 +2301,13 @@
                 <w:b w:val="0"/>
                 <w:sz w:val="13"/>
               </w:rPr>
-              <w:t xml:space="preserve">8522 ± 349</w:t>
+              <w:t xml:space="preserve">3.13 ± 0.10</w:t>
             </w:r>
           </w:p>
         </w:tc>
         <w:tc>
           <w:tcPr>
-            <w:tcW w:type="dxa" w:w="1200"/>
-            <w:tcMar>
-              <w:top w:w="40" w:type="dxa"/>
-              <w:start w:w="50" w:type="dxa"/>
-              <w:bottom w:w="40" w:type="dxa"/>
-              <w:end w:w="50" w:type="dxa"/>
-            </w:tcMar>
-            <w:vAlign w:val="center"/>
-          </w:tcPr>
-          <w:p>
-            <w:pPr>
-              <w:spacing w:before="0" w:after="0" w:line="240" w:lineRule="auto"/>
-              <w:jc w:val="center"/>
-            </w:pPr>
-            <w:r>
-              <w:rPr>
-                <w:rFonts w:ascii="Times New Roman" w:hAnsi="Times New Roman"/>
-                <w:b w:val="0"/>
-                <w:sz w:val="13"/>
-              </w:rPr>
-              <w:t xml:space="preserve">3.131 ± 0.102</w:t>
-            </w:r>
-          </w:p>
-        </w:tc>
-        <w:tc>
-          <w:tcPr>
-            <w:tcW w:type="dxa" w:w="1200"/>
-            <w:tcMar>
-              <w:top w:w="40" w:type="dxa"/>
-              <w:start w:w="50" w:type="dxa"/>
-              <w:bottom w:w="40" w:type="dxa"/>
-              <w:end w:w="50" w:type="dxa"/>
-            </w:tcMar>
-            <w:vAlign w:val="center"/>
-          </w:tcPr>
-          <w:p>
-            <w:pPr>
-              <w:spacing w:before="0" w:after="0" w:line="240" w:lineRule="auto"/>
-              <w:jc w:val="center"/>
-            </w:pPr>
-            <w:r>
-              <w:rPr>
-                <w:rFonts w:ascii="Times New Roman" w:hAnsi="Times New Roman"/>
-                <w:b w:val="0"/>
-                <w:sz w:val="13"/>
-              </w:rPr>
-              <w:t xml:space="preserve">0.000</w:t>
-            </w:r>
-          </w:p>
-        </w:tc>
-        <w:tc>
-          <w:tcPr>
-            <w:tcW w:type="dxa" w:w="1200"/>
+            <w:tcW w:type="dxa" w:w="760"/>
             <w:tcMar>
               <w:top w:w="40" w:type="dxa"/>
               <w:start w:w="50" w:type="dxa"/>
@@ -2597,7 +2333,7 @@
         </w:tc>
         <w:tc>
           <w:tcPr>
-            <w:tcW w:type="dxa" w:w="1200"/>
+            <w:tcW w:type="dxa" w:w="700"/>
             <w:tcMar>
               <w:top w:w="40" w:type="dxa"/>
               <w:start w:w="50" w:type="dxa"/>
@@ -2628,7 +2364,7 @@
         </w:trPr>
         <w:tc>
           <w:tcPr>
-            <w:tcW w:type="dxa" w:w="1723"/>
+            <w:tcW w:type="dxa" w:w="824"/>
             <w:tcMar>
               <w:top w:w="40" w:type="dxa"/>
               <w:start w:w="50" w:type="dxa"/>
@@ -2654,7 +2390,7 @@
         </w:tc>
         <w:tc>
           <w:tcPr>
-            <w:tcW w:type="dxa" w:w="1200"/>
+            <w:tcW w:type="dxa" w:w="880"/>
             <w:tcMar>
               <w:top w:w="40" w:type="dxa"/>
               <w:start w:w="50" w:type="dxa"/>
@@ -2674,13 +2410,13 @@
                 <w:b w:val="0"/>
                 <w:sz w:val="13"/>
               </w:rPr>
-              <w:t xml:space="preserve">0.948 ± 0.000</w:t>
+              <w:t xml:space="preserve">0.948</w:t>
             </w:r>
           </w:p>
         </w:tc>
         <w:tc>
           <w:tcPr>
-            <w:tcW w:type="dxa" w:w="1200"/>
+            <w:tcW w:type="dxa" w:w="900"/>
             <w:tcMar>
               <w:top w:w="40" w:type="dxa"/>
               <w:start w:w="50" w:type="dxa"/>
@@ -2700,13 +2436,13 @@
                 <w:b w:val="0"/>
                 <w:sz w:val="13"/>
               </w:rPr>
-              <w:t xml:space="preserve">5371 ± 0</w:t>
+              <w:t xml:space="preserve">5.37 / 9.29</w:t>
             </w:r>
           </w:p>
         </w:tc>
         <w:tc>
           <w:tcPr>
-            <w:tcW w:type="dxa" w:w="1200"/>
+            <w:tcW w:type="dxa" w:w="760"/>
             <w:tcMar>
               <w:top w:w="40" w:type="dxa"/>
               <w:start w:w="50" w:type="dxa"/>
@@ -2726,13 +2462,13 @@
                 <w:b w:val="0"/>
                 <w:sz w:val="13"/>
               </w:rPr>
-              <w:t xml:space="preserve">9290 ± 0</w:t>
+              <w:t xml:space="preserve">1.42</w:t>
             </w:r>
           </w:p>
         </w:tc>
         <w:tc>
           <w:tcPr>
-            <w:tcW w:type="dxa" w:w="1200"/>
+            <w:tcW w:type="dxa" w:w="760"/>
             <w:tcMar>
               <w:top w:w="40" w:type="dxa"/>
               <w:start w:w="50" w:type="dxa"/>
@@ -2752,13 +2488,13 @@
                 <w:b w:val="0"/>
                 <w:sz w:val="13"/>
               </w:rPr>
-              <w:t xml:space="preserve">1.423 ± 0.000</w:t>
+              <w:t xml:space="preserve">176.0</w:t>
             </w:r>
           </w:p>
         </w:tc>
         <w:tc>
           <w:tcPr>
-            <w:tcW w:type="dxa" w:w="1200"/>
+            <w:tcW w:type="dxa" w:w="700"/>
             <w:tcMar>
               <w:top w:w="40" w:type="dxa"/>
               <w:start w:w="50" w:type="dxa"/>
@@ -2778,13 +2514,44 @@
                 <w:b w:val="0"/>
                 <w:sz w:val="13"/>
               </w:rPr>
-              <w:t xml:space="preserve">0.000</w:t>
+              <w:t xml:space="preserve">8.9</w:t>
+            </w:r>
+          </w:p>
+        </w:tc>
+      </w:tr>
+      <w:tr>
+        <w:trPr>
+          <w:cantSplit/>
+        </w:trPr>
+        <w:tc>
+          <w:tcPr>
+            <w:tcW w:type="dxa" w:w="824"/>
+            <w:tcMar>
+              <w:top w:w="40" w:type="dxa"/>
+              <w:start w:w="50" w:type="dxa"/>
+              <w:bottom w:w="40" w:type="dxa"/>
+              <w:end w:w="50" w:type="dxa"/>
+            </w:tcMar>
+            <w:vAlign w:val="center"/>
+          </w:tcPr>
+          <w:p>
+            <w:pPr>
+              <w:spacing w:before="0" w:after="0" w:line="240" w:lineRule="auto"/>
+              <w:jc w:val="left"/>
+            </w:pPr>
+            <w:r>
+              <w:rPr>
+                <w:rFonts w:ascii="Times New Roman" w:hAnsi="Times New Roman"/>
+                <w:b w:val="0"/>
+                <w:sz w:val="13"/>
+              </w:rPr>
+              <w:t xml:space="preserve">LinUCB</w:t>
             </w:r>
           </w:p>
         </w:tc>
         <w:tc>
           <w:tcPr>
-            <w:tcW w:type="dxa" w:w="1200"/>
+            <w:tcW w:type="dxa" w:w="880"/>
             <w:tcMar>
               <w:top w:w="40" w:type="dxa"/>
               <w:start w:w="50" w:type="dxa"/>
@@ -2804,13 +2571,13 @@
                 <w:b w:val="0"/>
                 <w:sz w:val="13"/>
               </w:rPr>
-              <w:t xml:space="preserve">176.0 ± 0.0</w:t>
+              <w:t xml:space="preserve">0.948</w:t>
             </w:r>
           </w:p>
         </w:tc>
         <w:tc>
           <w:tcPr>
-            <w:tcW w:type="dxa" w:w="1200"/>
+            <w:tcW w:type="dxa" w:w="900"/>
             <w:tcMar>
               <w:top w:w="40" w:type="dxa"/>
               <w:start w:w="50" w:type="dxa"/>
@@ -2830,44 +2597,13 @@
                 <w:b w:val="0"/>
                 <w:sz w:val="13"/>
               </w:rPr>
-              <w:t xml:space="preserve">8.9 ± 0.0</w:t>
-            </w:r>
-          </w:p>
-        </w:tc>
-      </w:tr>
-      <w:tr>
-        <w:trPr>
-          <w:cantSplit/>
-        </w:trPr>
-        <w:tc>
-          <w:tcPr>
-            <w:tcW w:type="dxa" w:w="1723"/>
-            <w:tcMar>
-              <w:top w:w="40" w:type="dxa"/>
-              <w:start w:w="50" w:type="dxa"/>
-              <w:bottom w:w="40" w:type="dxa"/>
-              <w:end w:w="50" w:type="dxa"/>
-            </w:tcMar>
-            <w:vAlign w:val="center"/>
-          </w:tcPr>
-          <w:p>
-            <w:pPr>
-              <w:spacing w:before="0" w:after="0" w:line="240" w:lineRule="auto"/>
-              <w:jc w:val="left"/>
-            </w:pPr>
-            <w:r>
-              <w:rPr>
-                <w:rFonts w:ascii="Times New Roman" w:hAnsi="Times New Roman"/>
-                <w:b w:val="0"/>
-                <w:sz w:val="13"/>
-              </w:rPr>
-              <w:t xml:space="preserve">LinUCB (proposed)</w:t>
+              <w:t xml:space="preserve">5.36 / 9.27</w:t>
             </w:r>
           </w:p>
         </w:tc>
         <w:tc>
           <w:tcPr>
-            <w:tcW w:type="dxa" w:w="1200"/>
+            <w:tcW w:type="dxa" w:w="760"/>
             <w:tcMar>
               <w:top w:w="40" w:type="dxa"/>
               <w:start w:w="50" w:type="dxa"/>
@@ -2887,117 +2623,13 @@
                 <w:b w:val="0"/>
                 <w:sz w:val="13"/>
               </w:rPr>
-              <w:t xml:space="preserve">0.948 ± 0.000</w:t>
+              <w:t xml:space="preserve">1.46 ± 0.01</w:t>
             </w:r>
           </w:p>
         </w:tc>
         <w:tc>
           <w:tcPr>
-            <w:tcW w:type="dxa" w:w="1200"/>
-            <w:tcMar>
-              <w:top w:w="40" w:type="dxa"/>
-              <w:start w:w="50" w:type="dxa"/>
-              <w:bottom w:w="40" w:type="dxa"/>
-              <w:end w:w="50" w:type="dxa"/>
-            </w:tcMar>
-            <w:vAlign w:val="center"/>
-          </w:tcPr>
-          <w:p>
-            <w:pPr>
-              <w:spacing w:before="0" w:after="0" w:line="240" w:lineRule="auto"/>
-              <w:jc w:val="center"/>
-            </w:pPr>
-            <w:r>
-              <w:rPr>
-                <w:rFonts w:ascii="Times New Roman" w:hAnsi="Times New Roman"/>
-                <w:b w:val="0"/>
-                <w:sz w:val="13"/>
-              </w:rPr>
-              <w:t xml:space="preserve">5359 ± 28</w:t>
-            </w:r>
-          </w:p>
-        </w:tc>
-        <w:tc>
-          <w:tcPr>
-            <w:tcW w:type="dxa" w:w="1200"/>
-            <w:tcMar>
-              <w:top w:w="40" w:type="dxa"/>
-              <w:start w:w="50" w:type="dxa"/>
-              <w:bottom w:w="40" w:type="dxa"/>
-              <w:end w:w="50" w:type="dxa"/>
-            </w:tcMar>
-            <w:vAlign w:val="center"/>
-          </w:tcPr>
-          <w:p>
-            <w:pPr>
-              <w:spacing w:before="0" w:after="0" w:line="240" w:lineRule="auto"/>
-              <w:jc w:val="center"/>
-            </w:pPr>
-            <w:r>
-              <w:rPr>
-                <w:rFonts w:ascii="Times New Roman" w:hAnsi="Times New Roman"/>
-                <w:b w:val="0"/>
-                <w:sz w:val="13"/>
-              </w:rPr>
-              <w:t xml:space="preserve">9273 ± 39</w:t>
-            </w:r>
-          </w:p>
-        </w:tc>
-        <w:tc>
-          <w:tcPr>
-            <w:tcW w:type="dxa" w:w="1200"/>
-            <w:tcMar>
-              <w:top w:w="40" w:type="dxa"/>
-              <w:start w:w="50" w:type="dxa"/>
-              <w:bottom w:w="40" w:type="dxa"/>
-              <w:end w:w="50" w:type="dxa"/>
-            </w:tcMar>
-            <w:vAlign w:val="center"/>
-          </w:tcPr>
-          <w:p>
-            <w:pPr>
-              <w:spacing w:before="0" w:after="0" w:line="240" w:lineRule="auto"/>
-              <w:jc w:val="center"/>
-            </w:pPr>
-            <w:r>
-              <w:rPr>
-                <w:rFonts w:ascii="Times New Roman" w:hAnsi="Times New Roman"/>
-                <w:b w:val="0"/>
-                <w:sz w:val="13"/>
-              </w:rPr>
-              <w:t xml:space="preserve">1.460 ± 0.009</w:t>
-            </w:r>
-          </w:p>
-        </w:tc>
-        <w:tc>
-          <w:tcPr>
-            <w:tcW w:type="dxa" w:w="1200"/>
-            <w:tcMar>
-              <w:top w:w="40" w:type="dxa"/>
-              <w:start w:w="50" w:type="dxa"/>
-              <w:bottom w:w="40" w:type="dxa"/>
-              <w:end w:w="50" w:type="dxa"/>
-            </w:tcMar>
-            <w:vAlign w:val="center"/>
-          </w:tcPr>
-          <w:p>
-            <w:pPr>
-              <w:spacing w:before="0" w:after="0" w:line="240" w:lineRule="auto"/>
-              <w:jc w:val="center"/>
-            </w:pPr>
-            <w:r>
-              <w:rPr>
-                <w:rFonts w:ascii="Times New Roman" w:hAnsi="Times New Roman"/>
-                <w:b w:val="0"/>
-                <w:sz w:val="13"/>
-              </w:rPr>
-              <w:t xml:space="preserve">0.000</w:t>
-            </w:r>
-          </w:p>
-        </w:tc>
-        <w:tc>
-          <w:tcPr>
-            <w:tcW w:type="dxa" w:w="1200"/>
+            <w:tcW w:type="dxa" w:w="760"/>
             <w:tcMar>
               <w:top w:w="40" w:type="dxa"/>
               <w:start w:w="50" w:type="dxa"/>
@@ -3023,7 +2655,7 @@
         </w:tc>
         <w:tc>
           <w:tcPr>
-            <w:tcW w:type="dxa" w:w="1200"/>
+            <w:tcW w:type="dxa" w:w="700"/>
             <w:tcMar>
               <w:top w:w="40" w:type="dxa"/>
               <w:start w:w="50" w:type="dxa"/>
@@ -3051,17 +2683,6 @@
     </w:tbl>
     <w:p>
       <w:pPr>
-        <w:sectPr>
-          <w:type w:val="continuous"/>
-          <w:pgSz w:w="11909" w:h="16834"/>
-          <w:pgMar w:top="778" w:right="893" w:bottom="1440" w:left="893" w:header="288" w:footer="360" w:gutter="0"/>
-          <w:cols w:space="360" w:num="1"/>
-          <w:docGrid w:linePitch="360"/>
-        </w:sectPr>
-      </w:pPr>
-    </w:p>
-    <w:p>
-      <w:pPr>
         <w:keepNext w:val="0"/>
         <w:spacing w:before="0" w:after="20" w:line="240" w:lineRule="auto"/>
         <w:ind w:firstLine="216"/>
@@ -3077,17 +2698,9 @@
     </w:p>
     <w:p>
       <w:pPr>
-        <w:sectPr>
-          <w:type w:val="continuous"/>
-          <w:pgSz w:w="11909" w:h="16834"/>
-          <w:pgMar w:top="778" w:right="893" w:bottom="1440" w:left="893" w:header="288" w:footer="360" w:gutter="0"/>
-          <w:cols w:space="360" w:num="2"/>
-          <w:docGrid w:linePitch="360"/>
-        </w:sectPr>
-      </w:pPr>
-    </w:p>
-    <w:p>
-      <w:pPr>
+        <w:keepNext/>
+        <w:framePr w:w="10123" w:vSpace="160" w:wrap="notBeside" w:vAnchor="margin" w:hAnchor="margin" w:xAlign="center" w:yAlign="top"/>
+        <w:spacing w:before="0" w:after="0"/>
         <w:jc w:val="center"/>
       </w:pPr>
       <w:r>
@@ -3127,8 +2740,8 @@
     </w:p>
     <w:p>
       <w:pPr>
-        <w:keepNext w:val="0"/>
-        <w:spacing w:before="20" w:after="60"/>
+        <w:framePr w:w="10123" w:vSpace="160" w:wrap="notBeside" w:vAnchor="margin" w:hAnchor="margin" w:xAlign="center" w:yAlign="top"/>
+        <w:spacing w:before="40" w:after="0"/>
         <w:jc w:val="center"/>
       </w:pPr>
       <w:r>
@@ -3138,28 +2751,6 @@
         </w:rPr>
         <w:t xml:space="preserve">Fig. 2. GSM8K pilot on the held-out split: (a) cumulative reward of each policy over the 210-query stream; (b) accuracy versus cost per request (error bars: SD over 5 seeds).</w:t>
       </w:r>
-    </w:p>
-    <w:p>
-      <w:pPr>
-        <w:sectPr>
-          <w:type w:val="continuous"/>
-          <w:pgSz w:w="11909" w:h="16834"/>
-          <w:pgMar w:top="778" w:right="893" w:bottom="1440" w:left="893" w:header="288" w:footer="360" w:gutter="0"/>
-          <w:cols w:space="360" w:num="1"/>
-          <w:docGrid w:linePitch="360"/>
-        </w:sectPr>
-      </w:pPr>
-    </w:p>
-    <w:p>
-      <w:pPr>
-        <w:sectPr>
-          <w:type w:val="continuous"/>
-          <w:pgSz w:w="11909" w:h="16834"/>
-          <w:pgMar w:top="778" w:right="893" w:bottom="1440" w:left="893" w:header="288" w:footer="360" w:gutter="0"/>
-          <w:cols w:space="360" w:num="2"/>
-          <w:docGrid w:linePitch="360"/>
-        </w:sectPr>
-      </w:pPr>
     </w:p>
     <w:p>
       <w:pPr>
@@ -3175,12 +2766,12 @@
         </w:rPr>
         <w:t>TABLE III</w:t>
         <w:br/>
-        <w:t xml:space="preserve">SWEEPS ON THE HELD-OUT SPLIT (LINUCB UNLESS STATED; MEAN OVER 5 SEEDS)</w:t>
+        <w:t xml:space="preserve">SWEEPS ON THE HELD-OUT SPLIT (MEAN OVER 5 SEEDS)</w:t>
       </w:r>
     </w:p>
     <w:tbl>
       <w:tblPr>
-        <w:tblW w:type="dxa" w:w="10123"/>
+        <w:tblW w:type="dxa" w:w="4824"/>
         <w:jc w:val="center"/>
         <w:tblBorders>
           <w:top w:val="single" w:sz="4" w:color="808080"/>
@@ -3194,12 +2785,12 @@
         <w:tblLook w:val="04A0" w:firstRow="1" w:lastRow="0" w:firstColumn="1" w:lastColumn="0" w:noHBand="0" w:noVBand="1"/>
       </w:tblPr>
       <w:tblGrid>
-        <w:gridCol w:w="2900"/>
-        <w:gridCol w:w="1300"/>
-        <w:gridCol w:w="1300"/>
-        <w:gridCol w:w="1300"/>
-        <w:gridCol w:w="1100"/>
-        <w:gridCol w:w="2223"/>
+        <w:gridCol w:w="1500"/>
+        <w:gridCol w:w="600"/>
+        <w:gridCol w:w="600"/>
+        <w:gridCol w:w="520"/>
+        <w:gridCol w:w="560"/>
+        <w:gridCol w:w="1044"/>
       </w:tblGrid>
       <w:tr>
         <w:trPr>
@@ -3207,7 +2798,7 @@
         </w:trPr>
         <w:tc>
           <w:tcPr>
-            <w:tcW w:type="dxa" w:w="2900"/>
+            <w:tcW w:type="dxa" w:w="1500"/>
             <w:shd w:val="clear" w:color="auto" w:fill="E7E6E6"/>
             <w:tcMar>
               <w:top w:w="40" w:type="dxa"/>
@@ -3226,7 +2817,7 @@
               <w:rPr>
                 <w:rFonts w:ascii="Times New Roman" w:hAnsi="Times New Roman"/>
                 <w:b/>
-                <w:sz w:val="14"/>
+                <w:sz w:val="13"/>
               </w:rPr>
               <w:t xml:space="preserve">Setting</w:t>
             </w:r>
@@ -3234,7 +2825,7 @@
         </w:tc>
         <w:tc>
           <w:tcPr>
-            <w:tcW w:type="dxa" w:w="1300"/>
+            <w:tcW w:type="dxa" w:w="600"/>
             <w:shd w:val="clear" w:color="auto" w:fill="E7E6E6"/>
             <w:tcMar>
               <w:top w:w="40" w:type="dxa"/>
@@ -3253,15 +2844,15 @@
               <w:rPr>
                 <w:rFonts w:ascii="Times New Roman" w:hAnsi="Times New Roman"/>
                 <w:b/>
-                <w:sz w:val="14"/>
+                <w:sz w:val="13"/>
               </w:rPr>
-              <w:t xml:space="preserve">Mean Reward</w:t>
+              <w:t xml:space="preserve">Reward</w:t>
             </w:r>
           </w:p>
         </w:tc>
         <w:tc>
           <w:tcPr>
-            <w:tcW w:type="dxa" w:w="1300"/>
+            <w:tcW w:type="dxa" w:w="600"/>
             <w:shd w:val="clear" w:color="auto" w:fill="E7E6E6"/>
             <w:tcMar>
               <w:top w:w="40" w:type="dxa"/>
@@ -3280,15 +2871,15 @@
               <w:rPr>
                 <w:rFonts w:ascii="Times New Roman" w:hAnsi="Times New Roman"/>
                 <w:b/>
-                <w:sz w:val="14"/>
+                <w:sz w:val="13"/>
               </w:rPr>
-              <w:t xml:space="preserve">Mean Quality</w:t>
+              <w:t xml:space="preserve">Acc.</w:t>
             </w:r>
           </w:p>
         </w:tc>
         <w:tc>
           <w:tcPr>
-            <w:tcW w:type="dxa" w:w="1300"/>
+            <w:tcW w:type="dxa" w:w="520"/>
             <w:shd w:val="clear" w:color="auto" w:fill="E7E6E6"/>
             <w:tcMar>
               <w:top w:w="40" w:type="dxa"/>
@@ -3307,15 +2898,15 @@
               <w:rPr>
                 <w:rFonts w:ascii="Times New Roman" w:hAnsi="Times New Roman"/>
                 <w:b/>
-                <w:sz w:val="14"/>
+                <w:sz w:val="13"/>
               </w:rPr>
-              <w:t xml:space="preserve">Cost / Request</w:t>
+              <w:t xml:space="preserve">Cost</w:t>
             </w:r>
           </w:p>
         </w:tc>
         <w:tc>
           <w:tcPr>
-            <w:tcW w:type="dxa" w:w="1100"/>
+            <w:tcW w:type="dxa" w:w="560"/>
             <w:shd w:val="clear" w:color="auto" w:fill="E7E6E6"/>
             <w:tcMar>
               <w:top w:w="40" w:type="dxa"/>
@@ -3334,7 +2925,7 @@
               <w:rPr>
                 <w:rFonts w:ascii="Times New Roman" w:hAnsi="Times New Roman"/>
                 <w:b/>
-                <w:sz w:val="14"/>
+                <w:sz w:val="13"/>
               </w:rPr>
               <w:t xml:space="preserve">Regret</w:t>
             </w:r>
@@ -3342,7 +2933,7 @@
         </w:tc>
         <w:tc>
           <w:tcPr>
-            <w:tcW w:type="dxa" w:w="2223"/>
+            <w:tcW w:type="dxa" w:w="1044"/>
             <w:shd w:val="clear" w:color="auto" w:fill="E7E6E6"/>
             <w:tcMar>
               <w:top w:w="40" w:type="dxa"/>
@@ -3361,9 +2952,9 @@
               <w:rPr>
                 <w:rFonts w:ascii="Times New Roman" w:hAnsi="Times New Roman"/>
                 <w:b/>
-                <w:sz w:val="14"/>
+                <w:sz w:val="13"/>
               </w:rPr>
-              <w:t xml:space="preserve">Share 4B / 8B / 14B</w:t>
+              <w:t xml:space="preserve">Share 4B/8B/14B</w:t>
             </w:r>
           </w:p>
         </w:tc>
@@ -3374,7 +2965,7 @@
         </w:trPr>
         <w:tc>
           <w:tcPr>
-            <w:tcW w:type="dxa" w:w="2900"/>
+            <w:tcW w:type="dxa" w:w="1500"/>
             <w:tcMar>
               <w:top w:w="40" w:type="dxa"/>
               <w:start w:w="50" w:type="dxa"/>
@@ -3392,7 +2983,7 @@
               <w:rPr>
                 <w:rFonts w:ascii="Times New Roman" w:hAnsi="Times New Roman"/>
                 <w:b w:val="0"/>
-                <w:sz w:val="14"/>
+                <w:sz w:val="13"/>
               </w:rPr>
               <w:t xml:space="preserve">E2: β_c = 0, γ_l = 0</w:t>
             </w:r>
@@ -3400,7 +2991,7 @@
         </w:tc>
         <w:tc>
           <w:tcPr>
-            <w:tcW w:type="dxa" w:w="1300"/>
+            <w:tcW w:type="dxa" w:w="600"/>
             <w:tcMar>
               <w:top w:w="40" w:type="dxa"/>
               <w:start w:w="50" w:type="dxa"/>
@@ -3418,7 +3009,7 @@
               <w:rPr>
                 <w:rFonts w:ascii="Times New Roman" w:hAnsi="Times New Roman"/>
                 <w:b w:val="0"/>
-                <w:sz w:val="14"/>
+                <w:sz w:val="13"/>
               </w:rPr>
               <w:t xml:space="preserve">0.948</w:t>
             </w:r>
@@ -3426,7 +3017,7 @@
         </w:tc>
         <w:tc>
           <w:tcPr>
-            <w:tcW w:type="dxa" w:w="1300"/>
+            <w:tcW w:type="dxa" w:w="600"/>
             <w:tcMar>
               <w:top w:w="40" w:type="dxa"/>
               <w:start w:w="50" w:type="dxa"/>
@@ -3444,7 +3035,7 @@
               <w:rPr>
                 <w:rFonts w:ascii="Times New Roman" w:hAnsi="Times New Roman"/>
                 <w:b w:val="0"/>
-                <w:sz w:val="14"/>
+                <w:sz w:val="13"/>
               </w:rPr>
               <w:t xml:space="preserve">0.948</w:t>
             </w:r>
@@ -3452,7 +3043,7 @@
         </w:tc>
         <w:tc>
           <w:tcPr>
-            <w:tcW w:type="dxa" w:w="1300"/>
+            <w:tcW w:type="dxa" w:w="520"/>
             <w:tcMar>
               <w:top w:w="40" w:type="dxa"/>
               <w:start w:w="50" w:type="dxa"/>
@@ -3470,15 +3061,15 @@
               <w:rPr>
                 <w:rFonts w:ascii="Times New Roman" w:hAnsi="Times New Roman"/>
                 <w:b w:val="0"/>
-                <w:sz w:val="14"/>
+                <w:sz w:val="13"/>
               </w:rPr>
-              <w:t xml:space="preserve">1.423</w:t>
+              <w:t xml:space="preserve">1.42</w:t>
             </w:r>
           </w:p>
         </w:tc>
         <w:tc>
           <w:tcPr>
-            <w:tcW w:type="dxa" w:w="1100"/>
+            <w:tcW w:type="dxa" w:w="560"/>
             <w:tcMar>
               <w:top w:w="40" w:type="dxa"/>
               <w:start w:w="50" w:type="dxa"/>
@@ -3496,7 +3087,7 @@
               <w:rPr>
                 <w:rFonts w:ascii="Times New Roman" w:hAnsi="Times New Roman"/>
                 <w:b w:val="0"/>
-                <w:sz w:val="14"/>
+                <w:sz w:val="13"/>
               </w:rPr>
               <w:t xml:space="preserve">10.0</w:t>
             </w:r>
@@ -3504,7 +3095,38 @@
         </w:tc>
         <w:tc>
           <w:tcPr>
-            <w:tcW w:type="dxa" w:w="2223"/>
+            <w:tcW w:type="dxa" w:w="1044"/>
+            <w:tcMar>
+              <w:top w:w="40" w:type="dxa"/>
+              <w:start w:w="50" w:type="dxa"/>
+              <w:bottom w:w="40" w:type="dxa"/>
+              <w:end w:w="50" w:type="dxa"/>
+            </w:tcMar>
+            <w:vAlign w:val="center"/>
+          </w:tcPr>
+          <w:p>
+            <w:pPr>
+              <w:spacing w:before="0" w:after="0" w:line="240" w:lineRule="auto"/>
+              <w:jc w:val="center"/>
+            </w:pPr>
+            <w:r>
+              <w:rPr>
+                <w:rFonts w:ascii="Times New Roman" w:hAnsi="Times New Roman"/>
+                <w:b w:val="0"/>
+                <w:sz w:val="13"/>
+              </w:rPr>
+              <w:t xml:space="preserve">1.00/0.00/0.00</w:t>
+            </w:r>
+          </w:p>
+        </w:tc>
+      </w:tr>
+      <w:tr>
+        <w:trPr>
+          <w:cantSplit/>
+        </w:trPr>
+        <w:tc>
+          <w:tcPr>
+            <w:tcW w:type="dxa" w:w="1500"/>
             <w:tcMar>
               <w:top w:w="40" w:type="dxa"/>
               <w:start w:w="50" w:type="dxa"/>
@@ -3522,9 +3144,139 @@
               <w:rPr>
                 <w:rFonts w:ascii="Times New Roman" w:hAnsi="Times New Roman"/>
                 <w:b w:val="0"/>
-                <w:sz w:val="14"/>
+                <w:sz w:val="13"/>
               </w:rPr>
-              <w:t xml:space="preserve">1.00 / 0.00 / 0.00</w:t>
+              <w:t xml:space="preserve">E2: β_c = 0.1, γ_l = 0.05</w:t>
+            </w:r>
+          </w:p>
+        </w:tc>
+        <w:tc>
+          <w:tcPr>
+            <w:tcW w:type="dxa" w:w="600"/>
+            <w:tcMar>
+              <w:top w:w="40" w:type="dxa"/>
+              <w:start w:w="50" w:type="dxa"/>
+              <w:bottom w:w="40" w:type="dxa"/>
+              <w:end w:w="50" w:type="dxa"/>
+            </w:tcMar>
+            <w:vAlign w:val="center"/>
+          </w:tcPr>
+          <w:p>
+            <w:pPr>
+              <w:spacing w:before="0" w:after="0" w:line="240" w:lineRule="auto"/>
+              <w:jc w:val="center"/>
+            </w:pPr>
+            <w:r>
+              <w:rPr>
+                <w:rFonts w:ascii="Times New Roman" w:hAnsi="Times New Roman"/>
+                <w:b w:val="0"/>
+                <w:sz w:val="13"/>
+              </w:rPr>
+              <w:t xml:space="preserve">0.918</w:t>
+            </w:r>
+          </w:p>
+        </w:tc>
+        <w:tc>
+          <w:tcPr>
+            <w:tcW w:type="dxa" w:w="600"/>
+            <w:tcMar>
+              <w:top w:w="40" w:type="dxa"/>
+              <w:start w:w="50" w:type="dxa"/>
+              <w:bottom w:w="40" w:type="dxa"/>
+              <w:end w:w="50" w:type="dxa"/>
+            </w:tcMar>
+            <w:vAlign w:val="center"/>
+          </w:tcPr>
+          <w:p>
+            <w:pPr>
+              <w:spacing w:before="0" w:after="0" w:line="240" w:lineRule="auto"/>
+              <w:jc w:val="center"/>
+            </w:pPr>
+            <w:r>
+              <w:rPr>
+                <w:rFonts w:ascii="Times New Roman" w:hAnsi="Times New Roman"/>
+                <w:b w:val="0"/>
+                <w:sz w:val="13"/>
+              </w:rPr>
+              <w:t xml:space="preserve">0.948</w:t>
+            </w:r>
+          </w:p>
+        </w:tc>
+        <w:tc>
+          <w:tcPr>
+            <w:tcW w:type="dxa" w:w="520"/>
+            <w:tcMar>
+              <w:top w:w="40" w:type="dxa"/>
+              <w:start w:w="50" w:type="dxa"/>
+              <w:bottom w:w="40" w:type="dxa"/>
+              <w:end w:w="50" w:type="dxa"/>
+            </w:tcMar>
+            <w:vAlign w:val="center"/>
+          </w:tcPr>
+          <w:p>
+            <w:pPr>
+              <w:spacing w:before="0" w:after="0" w:line="240" w:lineRule="auto"/>
+              <w:jc w:val="center"/>
+            </w:pPr>
+            <w:r>
+              <w:rPr>
+                <w:rFonts w:ascii="Times New Roman" w:hAnsi="Times New Roman"/>
+                <w:b w:val="0"/>
+                <w:sz w:val="13"/>
+              </w:rPr>
+              <w:t xml:space="preserve">1.42</w:t>
+            </w:r>
+          </w:p>
+        </w:tc>
+        <w:tc>
+          <w:tcPr>
+            <w:tcW w:type="dxa" w:w="560"/>
+            <w:tcMar>
+              <w:top w:w="40" w:type="dxa"/>
+              <w:start w:w="50" w:type="dxa"/>
+              <w:bottom w:w="40" w:type="dxa"/>
+              <w:end w:w="50" w:type="dxa"/>
+            </w:tcMar>
+            <w:vAlign w:val="center"/>
+          </w:tcPr>
+          <w:p>
+            <w:pPr>
+              <w:spacing w:before="0" w:after="0" w:line="240" w:lineRule="auto"/>
+              <w:jc w:val="center"/>
+            </w:pPr>
+            <w:r>
+              <w:rPr>
+                <w:rFonts w:ascii="Times New Roman" w:hAnsi="Times New Roman"/>
+                <w:b w:val="0"/>
+                <w:sz w:val="13"/>
+              </w:rPr>
+              <w:t xml:space="preserve">9.6</w:t>
+            </w:r>
+          </w:p>
+        </w:tc>
+        <w:tc>
+          <w:tcPr>
+            <w:tcW w:type="dxa" w:w="1044"/>
+            <w:tcMar>
+              <w:top w:w="40" w:type="dxa"/>
+              <w:start w:w="50" w:type="dxa"/>
+              <w:bottom w:w="40" w:type="dxa"/>
+              <w:end w:w="50" w:type="dxa"/>
+            </w:tcMar>
+            <w:vAlign w:val="center"/>
+          </w:tcPr>
+          <w:p>
+            <w:pPr>
+              <w:spacing w:before="0" w:after="0" w:line="240" w:lineRule="auto"/>
+              <w:jc w:val="center"/>
+            </w:pPr>
+            <w:r>
+              <w:rPr>
+                <w:rFonts w:ascii="Times New Roman" w:hAnsi="Times New Roman"/>
+                <w:b w:val="0"/>
+                <w:sz w:val="13"/>
+              </w:rPr>
+              <w:t xml:space="preserve">1.00/0.00/0.00</w:t>
             </w:r>
           </w:p>
         </w:tc>
@@ -3535,7 +3287,7 @@
         </w:trPr>
         <w:tc>
           <w:tcPr>
-            <w:tcW w:type="dxa" w:w="2900"/>
+            <w:tcW w:type="dxa" w:w="1500"/>
             <w:tcMar>
               <w:top w:w="40" w:type="dxa"/>
               <w:start w:w="50" w:type="dxa"/>
@@ -3553,15 +3305,15 @@
               <w:rPr>
                 <w:rFonts w:ascii="Times New Roman" w:hAnsi="Times New Roman"/>
                 <w:b w:val="0"/>
-                <w:sz w:val="14"/>
+                <w:sz w:val="13"/>
               </w:rPr>
-              <w:t xml:space="preserve">E2: β_c = 0.1, γ_l = 0.05</w:t>
+              <w:t xml:space="preserve">E2: β_c = 0.3, γ_l = 0.2</w:t>
             </w:r>
           </w:p>
         </w:tc>
         <w:tc>
           <w:tcPr>
-            <w:tcW w:type="dxa" w:w="1300"/>
+            <w:tcW w:type="dxa" w:w="600"/>
             <w:tcMar>
               <w:top w:w="40" w:type="dxa"/>
               <w:start w:w="50" w:type="dxa"/>
@@ -3579,15 +3331,15 @@
               <w:rPr>
                 <w:rFonts w:ascii="Times New Roman" w:hAnsi="Times New Roman"/>
                 <w:b w:val="0"/>
-                <w:sz w:val="14"/>
+                <w:sz w:val="13"/>
               </w:rPr>
-              <w:t xml:space="preserve">0.918</w:t>
+              <w:t xml:space="preserve">0.838</w:t>
             </w:r>
           </w:p>
         </w:tc>
         <w:tc>
           <w:tcPr>
-            <w:tcW w:type="dxa" w:w="1300"/>
+            <w:tcW w:type="dxa" w:w="600"/>
             <w:tcMar>
               <w:top w:w="40" w:type="dxa"/>
               <w:start w:w="50" w:type="dxa"/>
@@ -3605,7 +3357,7 @@
               <w:rPr>
                 <w:rFonts w:ascii="Times New Roman" w:hAnsi="Times New Roman"/>
                 <w:b w:val="0"/>
-                <w:sz w:val="14"/>
+                <w:sz w:val="13"/>
               </w:rPr>
               <w:t xml:space="preserve">0.948</w:t>
             </w:r>
@@ -3613,7 +3365,7 @@
         </w:tc>
         <w:tc>
           <w:tcPr>
-            <w:tcW w:type="dxa" w:w="1300"/>
+            <w:tcW w:type="dxa" w:w="520"/>
             <w:tcMar>
               <w:top w:w="40" w:type="dxa"/>
               <w:start w:w="50" w:type="dxa"/>
@@ -3631,15 +3383,15 @@
               <w:rPr>
                 <w:rFonts w:ascii="Times New Roman" w:hAnsi="Times New Roman"/>
                 <w:b w:val="0"/>
-                <w:sz w:val="14"/>
+                <w:sz w:val="13"/>
               </w:rPr>
-              <w:t xml:space="preserve">1.423</w:t>
+              <w:t xml:space="preserve">1.42</w:t>
             </w:r>
           </w:p>
         </w:tc>
         <w:tc>
           <w:tcPr>
-            <w:tcW w:type="dxa" w:w="1100"/>
+            <w:tcW w:type="dxa" w:w="560"/>
             <w:tcMar>
               <w:top w:w="40" w:type="dxa"/>
               <w:start w:w="50" w:type="dxa"/>
@@ -3657,15 +3409,46 @@
               <w:rPr>
                 <w:rFonts w:ascii="Times New Roman" w:hAnsi="Times New Roman"/>
                 <w:b w:val="0"/>
-                <w:sz w:val="14"/>
+                <w:sz w:val="13"/>
               </w:rPr>
-              <w:t xml:space="preserve">9.6</w:t>
+              <w:t xml:space="preserve">8.9</w:t>
             </w:r>
           </w:p>
         </w:tc>
         <w:tc>
           <w:tcPr>
-            <w:tcW w:type="dxa" w:w="2223"/>
+            <w:tcW w:type="dxa" w:w="1044"/>
+            <w:tcMar>
+              <w:top w:w="40" w:type="dxa"/>
+              <w:start w:w="50" w:type="dxa"/>
+              <w:bottom w:w="40" w:type="dxa"/>
+              <w:end w:w="50" w:type="dxa"/>
+            </w:tcMar>
+            <w:vAlign w:val="center"/>
+          </w:tcPr>
+          <w:p>
+            <w:pPr>
+              <w:spacing w:before="0" w:after="0" w:line="240" w:lineRule="auto"/>
+              <w:jc w:val="center"/>
+            </w:pPr>
+            <w:r>
+              <w:rPr>
+                <w:rFonts w:ascii="Times New Roman" w:hAnsi="Times New Roman"/>
+                <w:b w:val="0"/>
+                <w:sz w:val="13"/>
+              </w:rPr>
+              <w:t xml:space="preserve">1.00/0.00/0.00</w:t>
+            </w:r>
+          </w:p>
+        </w:tc>
+      </w:tr>
+      <w:tr>
+        <w:trPr>
+          <w:cantSplit/>
+        </w:trPr>
+        <w:tc>
+          <w:tcPr>
+            <w:tcW w:type="dxa" w:w="1500"/>
             <w:tcMar>
               <w:top w:w="40" w:type="dxa"/>
               <w:start w:w="50" w:type="dxa"/>
@@ -3683,9 +3466,139 @@
               <w:rPr>
                 <w:rFonts w:ascii="Times New Roman" w:hAnsi="Times New Roman"/>
                 <w:b w:val="0"/>
-                <w:sz w:val="14"/>
+                <w:sz w:val="13"/>
               </w:rPr>
-              <w:t xml:space="preserve">1.00 / 0.00 / 0.00</w:t>
+              <w:t xml:space="preserve">E2: β_c = 0.6, γ_l = 0.4</w:t>
+            </w:r>
+          </w:p>
+        </w:tc>
+        <w:tc>
+          <w:tcPr>
+            <w:tcW w:type="dxa" w:w="600"/>
+            <w:tcMar>
+              <w:top w:w="40" w:type="dxa"/>
+              <w:start w:w="50" w:type="dxa"/>
+              <w:bottom w:w="40" w:type="dxa"/>
+              <w:end w:w="50" w:type="dxa"/>
+            </w:tcMar>
+            <w:vAlign w:val="center"/>
+          </w:tcPr>
+          <w:p>
+            <w:pPr>
+              <w:spacing w:before="0" w:after="0" w:line="240" w:lineRule="auto"/>
+              <w:jc w:val="center"/>
+            </w:pPr>
+            <w:r>
+              <w:rPr>
+                <w:rFonts w:ascii="Times New Roman" w:hAnsi="Times New Roman"/>
+                <w:b w:val="0"/>
+                <w:sz w:val="13"/>
+              </w:rPr>
+              <w:t xml:space="preserve">0.687</w:t>
+            </w:r>
+          </w:p>
+        </w:tc>
+        <w:tc>
+          <w:tcPr>
+            <w:tcW w:type="dxa" w:w="600"/>
+            <w:tcMar>
+              <w:top w:w="40" w:type="dxa"/>
+              <w:start w:w="50" w:type="dxa"/>
+              <w:bottom w:w="40" w:type="dxa"/>
+              <w:end w:w="50" w:type="dxa"/>
+            </w:tcMar>
+            <w:vAlign w:val="center"/>
+          </w:tcPr>
+          <w:p>
+            <w:pPr>
+              <w:spacing w:before="0" w:after="0" w:line="240" w:lineRule="auto"/>
+              <w:jc w:val="center"/>
+            </w:pPr>
+            <w:r>
+              <w:rPr>
+                <w:rFonts w:ascii="Times New Roman" w:hAnsi="Times New Roman"/>
+                <w:b w:val="0"/>
+                <w:sz w:val="13"/>
+              </w:rPr>
+              <w:t xml:space="preserve">0.950</w:t>
+            </w:r>
+          </w:p>
+        </w:tc>
+        <w:tc>
+          <w:tcPr>
+            <w:tcW w:type="dxa" w:w="520"/>
+            <w:tcMar>
+              <w:top w:w="40" w:type="dxa"/>
+              <w:start w:w="50" w:type="dxa"/>
+              <w:bottom w:w="40" w:type="dxa"/>
+              <w:end w:w="50" w:type="dxa"/>
+            </w:tcMar>
+            <w:vAlign w:val="center"/>
+          </w:tcPr>
+          <w:p>
+            <w:pPr>
+              <w:spacing w:before="0" w:after="0" w:line="240" w:lineRule="auto"/>
+              <w:jc w:val="center"/>
+            </w:pPr>
+            <w:r>
+              <w:rPr>
+                <w:rFonts w:ascii="Times New Roman" w:hAnsi="Times New Roman"/>
+                <w:b w:val="0"/>
+                <w:sz w:val="13"/>
+              </w:rPr>
+              <w:t xml:space="preserve">1.76</w:t>
+            </w:r>
+          </w:p>
+        </w:tc>
+        <w:tc>
+          <w:tcPr>
+            <w:tcW w:type="dxa" w:w="560"/>
+            <w:tcMar>
+              <w:top w:w="40" w:type="dxa"/>
+              <w:start w:w="50" w:type="dxa"/>
+              <w:bottom w:w="40" w:type="dxa"/>
+              <w:end w:w="50" w:type="dxa"/>
+            </w:tcMar>
+            <w:vAlign w:val="center"/>
+          </w:tcPr>
+          <w:p>
+            <w:pPr>
+              <w:spacing w:before="0" w:after="0" w:line="240" w:lineRule="auto"/>
+              <w:jc w:val="center"/>
+            </w:pPr>
+            <w:r>
+              <w:rPr>
+                <w:rFonts w:ascii="Times New Roman" w:hAnsi="Times New Roman"/>
+                <w:b w:val="0"/>
+                <w:sz w:val="13"/>
+              </w:rPr>
+              <w:t xml:space="preserve">16.4</w:t>
+            </w:r>
+          </w:p>
+        </w:tc>
+        <w:tc>
+          <w:tcPr>
+            <w:tcW w:type="dxa" w:w="1044"/>
+            <w:tcMar>
+              <w:top w:w="40" w:type="dxa"/>
+              <w:start w:w="50" w:type="dxa"/>
+              <w:bottom w:w="40" w:type="dxa"/>
+              <w:end w:w="50" w:type="dxa"/>
+            </w:tcMar>
+            <w:vAlign w:val="center"/>
+          </w:tcPr>
+          <w:p>
+            <w:pPr>
+              <w:spacing w:before="0" w:after="0" w:line="240" w:lineRule="auto"/>
+              <w:jc w:val="center"/>
+            </w:pPr>
+            <w:r>
+              <w:rPr>
+                <w:rFonts w:ascii="Times New Roman" w:hAnsi="Times New Roman"/>
+                <w:b w:val="0"/>
+                <w:sz w:val="13"/>
+              </w:rPr>
+              <w:t xml:space="preserve">0.80/0.20/0.00</w:t>
             </w:r>
           </w:p>
         </w:tc>
@@ -3696,7 +3609,7 @@
         </w:trPr>
         <w:tc>
           <w:tcPr>
-            <w:tcW w:type="dxa" w:w="2900"/>
+            <w:tcW w:type="dxa" w:w="1500"/>
             <w:tcMar>
               <w:top w:w="40" w:type="dxa"/>
               <w:start w:w="50" w:type="dxa"/>
@@ -3714,15 +3627,15 @@
               <w:rPr>
                 <w:rFonts w:ascii="Times New Roman" w:hAnsi="Times New Roman"/>
                 <w:b w:val="0"/>
-                <w:sz w:val="14"/>
+                <w:sz w:val="13"/>
               </w:rPr>
-              <w:t xml:space="preserve">E2: β_c = 0.3, γ_l = 0.2</w:t>
+              <w:t xml:space="preserve">E2: β_c = 1.0, γ_l = 0.6</w:t>
             </w:r>
           </w:p>
         </w:tc>
         <w:tc>
           <w:tcPr>
-            <w:tcW w:type="dxa" w:w="1300"/>
+            <w:tcW w:type="dxa" w:w="600"/>
             <w:tcMar>
               <w:top w:w="40" w:type="dxa"/>
               <w:start w:w="50" w:type="dxa"/>
@@ -3740,15 +3653,15 @@
               <w:rPr>
                 <w:rFonts w:ascii="Times New Roman" w:hAnsi="Times New Roman"/>
                 <w:b w:val="0"/>
-                <w:sz w:val="14"/>
+                <w:sz w:val="13"/>
               </w:rPr>
-              <w:t xml:space="preserve">0.838</w:t>
+              <w:t xml:space="preserve">0.610</w:t>
             </w:r>
           </w:p>
         </w:tc>
         <w:tc>
           <w:tcPr>
-            <w:tcW w:type="dxa" w:w="1300"/>
+            <w:tcW w:type="dxa" w:w="600"/>
             <w:tcMar>
               <w:top w:w="40" w:type="dxa"/>
               <w:start w:w="50" w:type="dxa"/>
@@ -3766,7 +3679,7 @@
               <w:rPr>
                 <w:rFonts w:ascii="Times New Roman" w:hAnsi="Times New Roman"/>
                 <w:b w:val="0"/>
-                <w:sz w:val="14"/>
+                <w:sz w:val="13"/>
               </w:rPr>
               <w:t xml:space="preserve">0.948</w:t>
             </w:r>
@@ -3774,7 +3687,7 @@
         </w:tc>
         <w:tc>
           <w:tcPr>
-            <w:tcW w:type="dxa" w:w="1300"/>
+            <w:tcW w:type="dxa" w:w="520"/>
             <w:tcMar>
               <w:top w:w="40" w:type="dxa"/>
               <w:start w:w="50" w:type="dxa"/>
@@ -3792,15 +3705,15 @@
               <w:rPr>
                 <w:rFonts w:ascii="Times New Roman" w:hAnsi="Times New Roman"/>
                 <w:b w:val="0"/>
-                <w:sz w:val="14"/>
+                <w:sz w:val="13"/>
               </w:rPr>
-              <w:t xml:space="preserve">1.423</w:t>
+              <w:t xml:space="preserve">1.42</w:t>
             </w:r>
           </w:p>
         </w:tc>
         <w:tc>
           <w:tcPr>
-            <w:tcW w:type="dxa" w:w="1100"/>
+            <w:tcW w:type="dxa" w:w="560"/>
             <w:tcMar>
               <w:top w:w="40" w:type="dxa"/>
               <w:start w:w="50" w:type="dxa"/>
@@ -3818,15 +3731,46 @@
               <w:rPr>
                 <w:rFonts w:ascii="Times New Roman" w:hAnsi="Times New Roman"/>
                 <w:b w:val="0"/>
-                <w:sz w:val="14"/>
+                <w:sz w:val="13"/>
               </w:rPr>
-              <w:t xml:space="preserve">8.9</w:t>
+              <w:t xml:space="preserve">6.2</w:t>
             </w:r>
           </w:p>
         </w:tc>
         <w:tc>
           <w:tcPr>
-            <w:tcW w:type="dxa" w:w="2223"/>
+            <w:tcW w:type="dxa" w:w="1044"/>
+            <w:tcMar>
+              <w:top w:w="40" w:type="dxa"/>
+              <w:start w:w="50" w:type="dxa"/>
+              <w:bottom w:w="40" w:type="dxa"/>
+              <w:end w:w="50" w:type="dxa"/>
+            </w:tcMar>
+            <w:vAlign w:val="center"/>
+          </w:tcPr>
+          <w:p>
+            <w:pPr>
+              <w:spacing w:before="0" w:after="0" w:line="240" w:lineRule="auto"/>
+              <w:jc w:val="center"/>
+            </w:pPr>
+            <w:r>
+              <w:rPr>
+                <w:rFonts w:ascii="Times New Roman" w:hAnsi="Times New Roman"/>
+                <w:b w:val="0"/>
+                <w:sz w:val="13"/>
+              </w:rPr>
+              <w:t xml:space="preserve">1.00/0.00/0.00</w:t>
+            </w:r>
+          </w:p>
+        </w:tc>
+      </w:tr>
+      <w:tr>
+        <w:trPr>
+          <w:cantSplit/>
+        </w:trPr>
+        <w:tc>
+          <w:tcPr>
+            <w:tcW w:type="dxa" w:w="1500"/>
             <w:tcMar>
               <w:top w:w="40" w:type="dxa"/>
               <w:start w:w="50" w:type="dxa"/>
@@ -3844,9 +3788,139 @@
               <w:rPr>
                 <w:rFonts w:ascii="Times New Roman" w:hAnsi="Times New Roman"/>
                 <w:b w:val="0"/>
-                <w:sz w:val="14"/>
+                <w:sz w:val="13"/>
               </w:rPr>
-              <w:t xml:space="preserve">1.00 / 0.00 / 0.00</w:t>
+              <w:t xml:space="preserve">E6: α = 0, 0.1, 0.25</w:t>
+            </w:r>
+          </w:p>
+        </w:tc>
+        <w:tc>
+          <w:tcPr>
+            <w:tcW w:type="dxa" w:w="600"/>
+            <w:tcMar>
+              <w:top w:w="40" w:type="dxa"/>
+              <w:start w:w="50" w:type="dxa"/>
+              <w:bottom w:w="40" w:type="dxa"/>
+              <w:end w:w="50" w:type="dxa"/>
+            </w:tcMar>
+            <w:vAlign w:val="center"/>
+          </w:tcPr>
+          <w:p>
+            <w:pPr>
+              <w:spacing w:before="0" w:after="0" w:line="240" w:lineRule="auto"/>
+              <w:jc w:val="center"/>
+            </w:pPr>
+            <w:r>
+              <w:rPr>
+                <w:rFonts w:ascii="Times New Roman" w:hAnsi="Times New Roman"/>
+                <w:b w:val="0"/>
+                <w:sz w:val="13"/>
+              </w:rPr>
+              <w:t xml:space="preserve">0.838</w:t>
+            </w:r>
+          </w:p>
+        </w:tc>
+        <w:tc>
+          <w:tcPr>
+            <w:tcW w:type="dxa" w:w="600"/>
+            <w:tcMar>
+              <w:top w:w="40" w:type="dxa"/>
+              <w:start w:w="50" w:type="dxa"/>
+              <w:bottom w:w="40" w:type="dxa"/>
+              <w:end w:w="50" w:type="dxa"/>
+            </w:tcMar>
+            <w:vAlign w:val="center"/>
+          </w:tcPr>
+          <w:p>
+            <w:pPr>
+              <w:spacing w:before="0" w:after="0" w:line="240" w:lineRule="auto"/>
+              <w:jc w:val="center"/>
+            </w:pPr>
+            <w:r>
+              <w:rPr>
+                <w:rFonts w:ascii="Times New Roman" w:hAnsi="Times New Roman"/>
+                <w:b w:val="0"/>
+                <w:sz w:val="13"/>
+              </w:rPr>
+              <w:t xml:space="preserve">0.948</w:t>
+            </w:r>
+          </w:p>
+        </w:tc>
+        <w:tc>
+          <w:tcPr>
+            <w:tcW w:type="dxa" w:w="520"/>
+            <w:tcMar>
+              <w:top w:w="40" w:type="dxa"/>
+              <w:start w:w="50" w:type="dxa"/>
+              <w:bottom w:w="40" w:type="dxa"/>
+              <w:end w:w="50" w:type="dxa"/>
+            </w:tcMar>
+            <w:vAlign w:val="center"/>
+          </w:tcPr>
+          <w:p>
+            <w:pPr>
+              <w:spacing w:before="0" w:after="0" w:line="240" w:lineRule="auto"/>
+              <w:jc w:val="center"/>
+            </w:pPr>
+            <w:r>
+              <w:rPr>
+                <w:rFonts w:ascii="Times New Roman" w:hAnsi="Times New Roman"/>
+                <w:b w:val="0"/>
+                <w:sz w:val="13"/>
+              </w:rPr>
+              <w:t xml:space="preserve">1.42</w:t>
+            </w:r>
+          </w:p>
+        </w:tc>
+        <w:tc>
+          <w:tcPr>
+            <w:tcW w:type="dxa" w:w="560"/>
+            <w:tcMar>
+              <w:top w:w="40" w:type="dxa"/>
+              <w:start w:w="50" w:type="dxa"/>
+              <w:bottom w:w="40" w:type="dxa"/>
+              <w:end w:w="50" w:type="dxa"/>
+            </w:tcMar>
+            <w:vAlign w:val="center"/>
+          </w:tcPr>
+          <w:p>
+            <w:pPr>
+              <w:spacing w:before="0" w:after="0" w:line="240" w:lineRule="auto"/>
+              <w:jc w:val="center"/>
+            </w:pPr>
+            <w:r>
+              <w:rPr>
+                <w:rFonts w:ascii="Times New Roman" w:hAnsi="Times New Roman"/>
+                <w:b w:val="0"/>
+                <w:sz w:val="13"/>
+              </w:rPr>
+              <w:t xml:space="preserve">8.9</w:t>
+            </w:r>
+          </w:p>
+        </w:tc>
+        <w:tc>
+          <w:tcPr>
+            <w:tcW w:type="dxa" w:w="1044"/>
+            <w:tcMar>
+              <w:top w:w="40" w:type="dxa"/>
+              <w:start w:w="50" w:type="dxa"/>
+              <w:bottom w:w="40" w:type="dxa"/>
+              <w:end w:w="50" w:type="dxa"/>
+            </w:tcMar>
+            <w:vAlign w:val="center"/>
+          </w:tcPr>
+          <w:p>
+            <w:pPr>
+              <w:spacing w:before="0" w:after="0" w:line="240" w:lineRule="auto"/>
+              <w:jc w:val="center"/>
+            </w:pPr>
+            <w:r>
+              <w:rPr>
+                <w:rFonts w:ascii="Times New Roman" w:hAnsi="Times New Roman"/>
+                <w:b w:val="0"/>
+                <w:sz w:val="13"/>
+              </w:rPr>
+              <w:t xml:space="preserve">1.00/0.00/0.00</w:t>
             </w:r>
           </w:p>
         </w:tc>
@@ -3857,7 +3931,7 @@
         </w:trPr>
         <w:tc>
           <w:tcPr>
-            <w:tcW w:type="dxa" w:w="2900"/>
+            <w:tcW w:type="dxa" w:w="1500"/>
             <w:tcMar>
               <w:top w:w="40" w:type="dxa"/>
               <w:start w:w="50" w:type="dxa"/>
@@ -3875,15 +3949,15 @@
               <w:rPr>
                 <w:rFonts w:ascii="Times New Roman" w:hAnsi="Times New Roman"/>
                 <w:b w:val="0"/>
-                <w:sz w:val="14"/>
+                <w:sz w:val="13"/>
               </w:rPr>
-              <w:t xml:space="preserve">E2: β_c = 0.6, γ_l = 0.4</w:t>
+              <w:t xml:space="preserve">E6: α = 0.5</w:t>
             </w:r>
           </w:p>
         </w:tc>
         <w:tc>
           <w:tcPr>
-            <w:tcW w:type="dxa" w:w="1300"/>
+            <w:tcW w:type="dxa" w:w="600"/>
             <w:tcMar>
               <w:top w:w="40" w:type="dxa"/>
               <w:start w:w="50" w:type="dxa"/>
@@ -3901,15 +3975,15 @@
               <w:rPr>
                 <w:rFonts w:ascii="Times New Roman" w:hAnsi="Times New Roman"/>
                 <w:b w:val="0"/>
-                <w:sz w:val="14"/>
+                <w:sz w:val="13"/>
               </w:rPr>
-              <w:t xml:space="preserve">0.687</w:t>
+              <w:t xml:space="preserve">0.799</w:t>
             </w:r>
           </w:p>
         </w:tc>
         <w:tc>
           <w:tcPr>
-            <w:tcW w:type="dxa" w:w="1300"/>
+            <w:tcW w:type="dxa" w:w="600"/>
             <w:tcMar>
               <w:top w:w="40" w:type="dxa"/>
               <w:start w:w="50" w:type="dxa"/>
@@ -3927,15 +4001,15 @@
               <w:rPr>
                 <w:rFonts w:ascii="Times New Roman" w:hAnsi="Times New Roman"/>
                 <w:b w:val="0"/>
-                <w:sz w:val="14"/>
+                <w:sz w:val="13"/>
               </w:rPr>
-              <w:t xml:space="preserve">0.950</w:t>
+              <w:t xml:space="preserve">0.951</w:t>
             </w:r>
           </w:p>
         </w:tc>
         <w:tc>
           <w:tcPr>
-            <w:tcW w:type="dxa" w:w="1300"/>
+            <w:tcW w:type="dxa" w:w="520"/>
             <w:tcMar>
               <w:top w:w="40" w:type="dxa"/>
               <w:start w:w="50" w:type="dxa"/>
@@ -3953,15 +4027,15 @@
               <w:rPr>
                 <w:rFonts w:ascii="Times New Roman" w:hAnsi="Times New Roman"/>
                 <w:b w:val="0"/>
-                <w:sz w:val="14"/>
+                <w:sz w:val="13"/>
               </w:rPr>
-              <w:t xml:space="preserve">1.759</w:t>
+              <w:t xml:space="preserve">2.10</w:t>
             </w:r>
           </w:p>
         </w:tc>
         <w:tc>
           <w:tcPr>
-            <w:tcW w:type="dxa" w:w="1100"/>
+            <w:tcW w:type="dxa" w:w="560"/>
             <w:tcMar>
               <w:top w:w="40" w:type="dxa"/>
               <w:start w:w="50" w:type="dxa"/>
@@ -3979,15 +4053,46 @@
               <w:rPr>
                 <w:rFonts w:ascii="Times New Roman" w:hAnsi="Times New Roman"/>
                 <w:b w:val="0"/>
-                <w:sz w:val="14"/>
+                <w:sz w:val="13"/>
               </w:rPr>
-              <w:t xml:space="preserve">16.4</w:t>
+              <w:t xml:space="preserve">17.2</w:t>
             </w:r>
           </w:p>
         </w:tc>
         <w:tc>
           <w:tcPr>
-            <w:tcW w:type="dxa" w:w="2223"/>
+            <w:tcW w:type="dxa" w:w="1044"/>
+            <w:tcMar>
+              <w:top w:w="40" w:type="dxa"/>
+              <w:start w:w="50" w:type="dxa"/>
+              <w:bottom w:w="40" w:type="dxa"/>
+              <w:end w:w="50" w:type="dxa"/>
+            </w:tcMar>
+            <w:vAlign w:val="center"/>
+          </w:tcPr>
+          <w:p>
+            <w:pPr>
+              <w:spacing w:before="0" w:after="0" w:line="240" w:lineRule="auto"/>
+              <w:jc w:val="center"/>
+            </w:pPr>
+            <w:r>
+              <w:rPr>
+                <w:rFonts w:ascii="Times New Roman" w:hAnsi="Times New Roman"/>
+                <w:b w:val="0"/>
+                <w:sz w:val="13"/>
+              </w:rPr>
+              <w:t xml:space="preserve">0.60/0.39/0.01</w:t>
+            </w:r>
+          </w:p>
+        </w:tc>
+      </w:tr>
+      <w:tr>
+        <w:trPr>
+          <w:cantSplit/>
+        </w:trPr>
+        <w:tc>
+          <w:tcPr>
+            <w:tcW w:type="dxa" w:w="1500"/>
             <w:tcMar>
               <w:top w:w="40" w:type="dxa"/>
               <w:start w:w="50" w:type="dxa"/>
@@ -4005,9 +4110,139 @@
               <w:rPr>
                 <w:rFonts w:ascii="Times New Roman" w:hAnsi="Times New Roman"/>
                 <w:b w:val="0"/>
-                <w:sz w:val="14"/>
+                <w:sz w:val="13"/>
               </w:rPr>
-              <w:t xml:space="preserve">0.80 / 0.20 / 0.00</w:t>
+              <w:t xml:space="preserve">E6: α = 1.0</w:t>
+            </w:r>
+          </w:p>
+        </w:tc>
+        <w:tc>
+          <w:tcPr>
+            <w:tcW w:type="dxa" w:w="600"/>
+            <w:tcMar>
+              <w:top w:w="40" w:type="dxa"/>
+              <w:start w:w="50" w:type="dxa"/>
+              <w:bottom w:w="40" w:type="dxa"/>
+              <w:end w:w="50" w:type="dxa"/>
+            </w:tcMar>
+            <w:vAlign w:val="center"/>
+          </w:tcPr>
+          <w:p>
+            <w:pPr>
+              <w:spacing w:before="0" w:after="0" w:line="240" w:lineRule="auto"/>
+              <w:jc w:val="center"/>
+            </w:pPr>
+            <w:r>
+              <w:rPr>
+                <w:rFonts w:ascii="Times New Roman" w:hAnsi="Times New Roman"/>
+                <w:b w:val="0"/>
+                <w:sz w:val="13"/>
+              </w:rPr>
+              <w:t xml:space="preserve">0.836</w:t>
+            </w:r>
+          </w:p>
+        </w:tc>
+        <w:tc>
+          <w:tcPr>
+            <w:tcW w:type="dxa" w:w="600"/>
+            <w:tcMar>
+              <w:top w:w="40" w:type="dxa"/>
+              <w:start w:w="50" w:type="dxa"/>
+              <w:bottom w:w="40" w:type="dxa"/>
+              <w:end w:w="50" w:type="dxa"/>
+            </w:tcMar>
+            <w:vAlign w:val="center"/>
+          </w:tcPr>
+          <w:p>
+            <w:pPr>
+              <w:spacing w:before="0" w:after="0" w:line="240" w:lineRule="auto"/>
+              <w:jc w:val="center"/>
+            </w:pPr>
+            <w:r>
+              <w:rPr>
+                <w:rFonts w:ascii="Times New Roman" w:hAnsi="Times New Roman"/>
+                <w:b w:val="0"/>
+                <w:sz w:val="13"/>
+              </w:rPr>
+              <w:t xml:space="preserve">0.948</w:t>
+            </w:r>
+          </w:p>
+        </w:tc>
+        <w:tc>
+          <w:tcPr>
+            <w:tcW w:type="dxa" w:w="520"/>
+            <w:tcMar>
+              <w:top w:w="40" w:type="dxa"/>
+              <w:start w:w="50" w:type="dxa"/>
+              <w:bottom w:w="40" w:type="dxa"/>
+              <w:end w:w="50" w:type="dxa"/>
+            </w:tcMar>
+            <w:vAlign w:val="center"/>
+          </w:tcPr>
+          <w:p>
+            <w:pPr>
+              <w:spacing w:before="0" w:after="0" w:line="240" w:lineRule="auto"/>
+              <w:jc w:val="center"/>
+            </w:pPr>
+            <w:r>
+              <w:rPr>
+                <w:rFonts w:ascii="Times New Roman" w:hAnsi="Times New Roman"/>
+                <w:b w:val="0"/>
+                <w:sz w:val="13"/>
+              </w:rPr>
+              <w:t xml:space="preserve">1.46</w:t>
+            </w:r>
+          </w:p>
+        </w:tc>
+        <w:tc>
+          <w:tcPr>
+            <w:tcW w:type="dxa" w:w="560"/>
+            <w:tcMar>
+              <w:top w:w="40" w:type="dxa"/>
+              <w:start w:w="50" w:type="dxa"/>
+              <w:bottom w:w="40" w:type="dxa"/>
+              <w:end w:w="50" w:type="dxa"/>
+            </w:tcMar>
+            <w:vAlign w:val="center"/>
+          </w:tcPr>
+          <w:p>
+            <w:pPr>
+              <w:spacing w:before="0" w:after="0" w:line="240" w:lineRule="auto"/>
+              <w:jc w:val="center"/>
+            </w:pPr>
+            <w:r>
+              <w:rPr>
+                <w:rFonts w:ascii="Times New Roman" w:hAnsi="Times New Roman"/>
+                <w:b w:val="0"/>
+                <w:sz w:val="13"/>
+              </w:rPr>
+              <w:t xml:space="preserve">9.3</w:t>
+            </w:r>
+          </w:p>
+        </w:tc>
+        <w:tc>
+          <w:tcPr>
+            <w:tcW w:type="dxa" w:w="1044"/>
+            <w:tcMar>
+              <w:top w:w="40" w:type="dxa"/>
+              <w:start w:w="50" w:type="dxa"/>
+              <w:bottom w:w="40" w:type="dxa"/>
+              <w:end w:w="50" w:type="dxa"/>
+            </w:tcMar>
+            <w:vAlign w:val="center"/>
+          </w:tcPr>
+          <w:p>
+            <w:pPr>
+              <w:spacing w:before="0" w:after="0" w:line="240" w:lineRule="auto"/>
+              <w:jc w:val="center"/>
+            </w:pPr>
+            <w:r>
+              <w:rPr>
+                <w:rFonts w:ascii="Times New Roman" w:hAnsi="Times New Roman"/>
+                <w:b w:val="0"/>
+                <w:sz w:val="13"/>
+              </w:rPr>
+              <w:t xml:space="preserve">0.98/0.01/0.01</w:t>
             </w:r>
           </w:p>
         </w:tc>
@@ -4018,7 +4253,7 @@
         </w:trPr>
         <w:tc>
           <w:tcPr>
-            <w:tcW w:type="dxa" w:w="2900"/>
+            <w:tcW w:type="dxa" w:w="1500"/>
             <w:tcMar>
               <w:top w:w="40" w:type="dxa"/>
               <w:start w:w="50" w:type="dxa"/>
@@ -4036,15 +4271,15 @@
               <w:rPr>
                 <w:rFonts w:ascii="Times New Roman" w:hAnsi="Times New Roman"/>
                 <w:b w:val="0"/>
-                <w:sz w:val="14"/>
+                <w:sz w:val="13"/>
               </w:rPr>
-              <w:t xml:space="preserve">E2: β_c = 1.0, γ_l = 0.6</w:t>
+              <w:t xml:space="preserve">E6: α = 2.0</w:t>
             </w:r>
           </w:p>
         </w:tc>
         <w:tc>
           <w:tcPr>
-            <w:tcW w:type="dxa" w:w="1300"/>
+            <w:tcW w:type="dxa" w:w="600"/>
             <w:tcMar>
               <w:top w:w="40" w:type="dxa"/>
               <w:start w:w="50" w:type="dxa"/>
@@ -4062,15 +4297,15 @@
               <w:rPr>
                 <w:rFonts w:ascii="Times New Roman" w:hAnsi="Times New Roman"/>
                 <w:b w:val="0"/>
-                <w:sz w:val="14"/>
+                <w:sz w:val="13"/>
               </w:rPr>
-              <w:t xml:space="preserve">0.610</w:t>
+              <w:t xml:space="preserve">0.813</w:t>
             </w:r>
           </w:p>
         </w:tc>
         <w:tc>
           <w:tcPr>
-            <w:tcW w:type="dxa" w:w="1300"/>
+            <w:tcW w:type="dxa" w:w="600"/>
             <w:tcMar>
               <w:top w:w="40" w:type="dxa"/>
               <w:start w:w="50" w:type="dxa"/>
@@ -4088,15 +4323,15 @@
               <w:rPr>
                 <w:rFonts w:ascii="Times New Roman" w:hAnsi="Times New Roman"/>
                 <w:b w:val="0"/>
-                <w:sz w:val="14"/>
+                <w:sz w:val="13"/>
               </w:rPr>
-              <w:t xml:space="preserve">0.948</w:t>
+              <w:t xml:space="preserve">0.953</w:t>
             </w:r>
           </w:p>
         </w:tc>
         <w:tc>
           <w:tcPr>
-            <w:tcW w:type="dxa" w:w="1300"/>
+            <w:tcW w:type="dxa" w:w="520"/>
             <w:tcMar>
               <w:top w:w="40" w:type="dxa"/>
               <w:start w:w="50" w:type="dxa"/>
@@ -4114,15 +4349,15 @@
               <w:rPr>
                 <w:rFonts w:ascii="Times New Roman" w:hAnsi="Times New Roman"/>
                 <w:b w:val="0"/>
-                <w:sz w:val="14"/>
+                <w:sz w:val="13"/>
               </w:rPr>
-              <w:t xml:space="preserve">1.423</w:t>
+              <w:t xml:space="preserve">1.95</w:t>
             </w:r>
           </w:p>
         </w:tc>
         <w:tc>
           <w:tcPr>
-            <w:tcW w:type="dxa" w:w="1100"/>
+            <w:tcW w:type="dxa" w:w="560"/>
             <w:tcMar>
               <w:top w:w="40" w:type="dxa"/>
               <w:start w:w="50" w:type="dxa"/>
@@ -4140,15 +4375,46 @@
               <w:rPr>
                 <w:rFonts w:ascii="Times New Roman" w:hAnsi="Times New Roman"/>
                 <w:b w:val="0"/>
-                <w:sz w:val="14"/>
+                <w:sz w:val="13"/>
               </w:rPr>
-              <w:t xml:space="preserve">6.2</w:t>
+              <w:t xml:space="preserve">14.2</w:t>
             </w:r>
           </w:p>
         </w:tc>
         <w:tc>
           <w:tcPr>
-            <w:tcW w:type="dxa" w:w="2223"/>
+            <w:tcW w:type="dxa" w:w="1044"/>
+            <w:tcMar>
+              <w:top w:w="40" w:type="dxa"/>
+              <w:start w:w="50" w:type="dxa"/>
+              <w:bottom w:w="40" w:type="dxa"/>
+              <w:end w:w="50" w:type="dxa"/>
+            </w:tcMar>
+            <w:vAlign w:val="center"/>
+          </w:tcPr>
+          <w:p>
+            <w:pPr>
+              <w:spacing w:before="0" w:after="0" w:line="240" w:lineRule="auto"/>
+              <w:jc w:val="center"/>
+            </w:pPr>
+            <w:r>
+              <w:rPr>
+                <w:rFonts w:ascii="Times New Roman" w:hAnsi="Times New Roman"/>
+                <w:b w:val="0"/>
+                <w:sz w:val="13"/>
+              </w:rPr>
+              <w:t xml:space="preserve">0.75/0.17/0.07</w:t>
+            </w:r>
+          </w:p>
+        </w:tc>
+      </w:tr>
+      <w:tr>
+        <w:trPr>
+          <w:cantSplit/>
+        </w:trPr>
+        <w:tc>
+          <w:tcPr>
+            <w:tcW w:type="dxa" w:w="1500"/>
             <w:tcMar>
               <w:top w:w="40" w:type="dxa"/>
               <w:start w:w="50" w:type="dxa"/>
@@ -4166,9 +4432,139 @@
               <w:rPr>
                 <w:rFonts w:ascii="Times New Roman" w:hAnsi="Times New Roman"/>
                 <w:b w:val="0"/>
-                <w:sz w:val="14"/>
+                <w:sz w:val="13"/>
               </w:rPr>
-              <w:t xml:space="preserve">1.00 / 0.00 / 0.00</w:t>
+              <w:t xml:space="preserve">Linear Thompson sampling</w:t>
+            </w:r>
+          </w:p>
+        </w:tc>
+        <w:tc>
+          <w:tcPr>
+            <w:tcW w:type="dxa" w:w="600"/>
+            <w:tcMar>
+              <w:top w:w="40" w:type="dxa"/>
+              <w:start w:w="50" w:type="dxa"/>
+              <w:bottom w:w="40" w:type="dxa"/>
+              <w:end w:w="50" w:type="dxa"/>
+            </w:tcMar>
+            <w:vAlign w:val="center"/>
+          </w:tcPr>
+          <w:p>
+            <w:pPr>
+              <w:spacing w:before="0" w:after="0" w:line="240" w:lineRule="auto"/>
+              <w:jc w:val="center"/>
+            </w:pPr>
+            <w:r>
+              <w:rPr>
+                <w:rFonts w:ascii="Times New Roman" w:hAnsi="Times New Roman"/>
+                <w:b w:val="0"/>
+                <w:sz w:val="13"/>
+              </w:rPr>
+              <w:t xml:space="preserve">0.823</w:t>
+            </w:r>
+          </w:p>
+        </w:tc>
+        <w:tc>
+          <w:tcPr>
+            <w:tcW w:type="dxa" w:w="600"/>
+            <w:tcMar>
+              <w:top w:w="40" w:type="dxa"/>
+              <w:start w:w="50" w:type="dxa"/>
+              <w:bottom w:w="40" w:type="dxa"/>
+              <w:end w:w="50" w:type="dxa"/>
+            </w:tcMar>
+            <w:vAlign w:val="center"/>
+          </w:tcPr>
+          <w:p>
+            <w:pPr>
+              <w:spacing w:before="0" w:after="0" w:line="240" w:lineRule="auto"/>
+              <w:jc w:val="center"/>
+            </w:pPr>
+            <w:r>
+              <w:rPr>
+                <w:rFonts w:ascii="Times New Roman" w:hAnsi="Times New Roman"/>
+                <w:b w:val="0"/>
+                <w:sz w:val="13"/>
+              </w:rPr>
+              <w:t xml:space="preserve">0.951</w:t>
+            </w:r>
+          </w:p>
+        </w:tc>
+        <w:tc>
+          <w:tcPr>
+            <w:tcW w:type="dxa" w:w="520"/>
+            <w:tcMar>
+              <w:top w:w="40" w:type="dxa"/>
+              <w:start w:w="50" w:type="dxa"/>
+              <w:bottom w:w="40" w:type="dxa"/>
+              <w:end w:w="50" w:type="dxa"/>
+            </w:tcMar>
+            <w:vAlign w:val="center"/>
+          </w:tcPr>
+          <w:p>
+            <w:pPr>
+              <w:spacing w:before="0" w:after="0" w:line="240" w:lineRule="auto"/>
+              <w:jc w:val="center"/>
+            </w:pPr>
+            <w:r>
+              <w:rPr>
+                <w:rFonts w:ascii="Times New Roman" w:hAnsi="Times New Roman"/>
+                <w:b w:val="0"/>
+                <w:sz w:val="13"/>
+              </w:rPr>
+              <w:t xml:space="preserve">1.77</w:t>
+            </w:r>
+          </w:p>
+        </w:tc>
+        <w:tc>
+          <w:tcPr>
+            <w:tcW w:type="dxa" w:w="560"/>
+            <w:tcMar>
+              <w:top w:w="40" w:type="dxa"/>
+              <w:start w:w="50" w:type="dxa"/>
+              <w:bottom w:w="40" w:type="dxa"/>
+              <w:end w:w="50" w:type="dxa"/>
+            </w:tcMar>
+            <w:vAlign w:val="center"/>
+          </w:tcPr>
+          <w:p>
+            <w:pPr>
+              <w:spacing w:before="0" w:after="0" w:line="240" w:lineRule="auto"/>
+              <w:jc w:val="center"/>
+            </w:pPr>
+            <w:r>
+              <w:rPr>
+                <w:rFonts w:ascii="Times New Roman" w:hAnsi="Times New Roman"/>
+                <w:b w:val="0"/>
+                <w:sz w:val="13"/>
+              </w:rPr>
+              <w:t xml:space="preserve">12.0</w:t>
+            </w:r>
+          </w:p>
+        </w:tc>
+        <w:tc>
+          <w:tcPr>
+            <w:tcW w:type="dxa" w:w="1044"/>
+            <w:tcMar>
+              <w:top w:w="40" w:type="dxa"/>
+              <w:start w:w="50" w:type="dxa"/>
+              <w:bottom w:w="40" w:type="dxa"/>
+              <w:end w:w="50" w:type="dxa"/>
+            </w:tcMar>
+            <w:vAlign w:val="center"/>
+          </w:tcPr>
+          <w:p>
+            <w:pPr>
+              <w:spacing w:before="0" w:after="0" w:line="240" w:lineRule="auto"/>
+              <w:jc w:val="center"/>
+            </w:pPr>
+            <w:r>
+              <w:rPr>
+                <w:rFonts w:ascii="Times New Roman" w:hAnsi="Times New Roman"/>
+                <w:b w:val="0"/>
+                <w:sz w:val="13"/>
+              </w:rPr>
+              <w:t xml:space="preserve">0.88/0.03/0.09</w:t>
             </w:r>
           </w:p>
         </w:tc>
@@ -4179,7 +4575,7 @@
         </w:trPr>
         <w:tc>
           <w:tcPr>
-            <w:tcW w:type="dxa" w:w="2900"/>
+            <w:tcW w:type="dxa" w:w="1500"/>
             <w:tcMar>
               <w:top w:w="40" w:type="dxa"/>
               <w:start w:w="50" w:type="dxa"/>
@@ -4197,15 +4593,15 @@
               <w:rPr>
                 <w:rFonts w:ascii="Times New Roman" w:hAnsi="Times New Roman"/>
                 <w:b w:val="0"/>
-                <w:sz w:val="14"/>
+                <w:sz w:val="13"/>
               </w:rPr>
-              <w:t xml:space="preserve">E6: α = 0, 0.1, 0.25</w:t>
+              <w:t xml:space="preserve">ε-greedy ridge (ε = 0.1)</w:t>
             </w:r>
           </w:p>
         </w:tc>
         <w:tc>
           <w:tcPr>
-            <w:tcW w:type="dxa" w:w="1300"/>
+            <w:tcW w:type="dxa" w:w="600"/>
             <w:tcMar>
               <w:top w:w="40" w:type="dxa"/>
               <w:start w:w="50" w:type="dxa"/>
@@ -4223,15 +4619,15 @@
               <w:rPr>
                 <w:rFonts w:ascii="Times New Roman" w:hAnsi="Times New Roman"/>
                 <w:b w:val="0"/>
-                <w:sz w:val="14"/>
+                <w:sz w:val="13"/>
               </w:rPr>
-              <w:t xml:space="preserve">0.838</w:t>
+              <w:t xml:space="preserve">0.810</w:t>
             </w:r>
           </w:p>
         </w:tc>
         <w:tc>
           <w:tcPr>
-            <w:tcW w:type="dxa" w:w="1300"/>
+            <w:tcW w:type="dxa" w:w="600"/>
             <w:tcMar>
               <w:top w:w="40" w:type="dxa"/>
               <w:start w:w="50" w:type="dxa"/>
@@ -4249,15 +4645,15 @@
               <w:rPr>
                 <w:rFonts w:ascii="Times New Roman" w:hAnsi="Times New Roman"/>
                 <w:b w:val="0"/>
-                <w:sz w:val="14"/>
+                <w:sz w:val="13"/>
               </w:rPr>
-              <w:t xml:space="preserve">0.948</w:t>
+              <w:t xml:space="preserve">0.949</w:t>
             </w:r>
           </w:p>
         </w:tc>
         <w:tc>
           <w:tcPr>
-            <w:tcW w:type="dxa" w:w="1300"/>
+            <w:tcW w:type="dxa" w:w="520"/>
             <w:tcMar>
               <w:top w:w="40" w:type="dxa"/>
               <w:start w:w="50" w:type="dxa"/>
@@ -4275,15 +4671,15 @@
               <w:rPr>
                 <w:rFonts w:ascii="Times New Roman" w:hAnsi="Times New Roman"/>
                 <w:b w:val="0"/>
-                <w:sz w:val="14"/>
+                <w:sz w:val="13"/>
               </w:rPr>
-              <w:t xml:space="preserve">1.423</w:t>
+              <w:t xml:space="preserve">1.89</w:t>
             </w:r>
           </w:p>
         </w:tc>
         <w:tc>
           <w:tcPr>
-            <w:tcW w:type="dxa" w:w="1100"/>
+            <w:tcW w:type="dxa" w:w="560"/>
             <w:tcMar>
               <w:top w:w="40" w:type="dxa"/>
               <w:start w:w="50" w:type="dxa"/>
@@ -4301,15 +4697,46 @@
               <w:rPr>
                 <w:rFonts w:ascii="Times New Roman" w:hAnsi="Times New Roman"/>
                 <w:b w:val="0"/>
-                <w:sz w:val="14"/>
+                <w:sz w:val="13"/>
               </w:rPr>
-              <w:t xml:space="preserve">8.9</w:t>
+              <w:t xml:space="preserve">14.8</w:t>
             </w:r>
           </w:p>
         </w:tc>
         <w:tc>
           <w:tcPr>
-            <w:tcW w:type="dxa" w:w="2223"/>
+            <w:tcW w:type="dxa" w:w="1044"/>
+            <w:tcMar>
+              <w:top w:w="40" w:type="dxa"/>
+              <w:start w:w="50" w:type="dxa"/>
+              <w:bottom w:w="40" w:type="dxa"/>
+              <w:end w:w="50" w:type="dxa"/>
+            </w:tcMar>
+            <w:vAlign w:val="center"/>
+          </w:tcPr>
+          <w:p>
+            <w:pPr>
+              <w:spacing w:before="0" w:after="0" w:line="240" w:lineRule="auto"/>
+              <w:jc w:val="center"/>
+            </w:pPr>
+            <w:r>
+              <w:rPr>
+                <w:rFonts w:ascii="Times New Roman" w:hAnsi="Times New Roman"/>
+                <w:b w:val="0"/>
+                <w:sz w:val="13"/>
+              </w:rPr>
+              <w:t xml:space="preserve">0.76/0.21/0.03</w:t>
+            </w:r>
+          </w:p>
+        </w:tc>
+      </w:tr>
+      <w:tr>
+        <w:trPr>
+          <w:cantSplit/>
+        </w:trPr>
+        <w:tc>
+          <w:tcPr>
+            <w:tcW w:type="dxa" w:w="1500"/>
             <w:tcMar>
               <w:top w:w="40" w:type="dxa"/>
               <w:start w:w="50" w:type="dxa"/>
@@ -4327,46 +4754,15 @@
               <w:rPr>
                 <w:rFonts w:ascii="Times New Roman" w:hAnsi="Times New Roman"/>
                 <w:b w:val="0"/>
-                <w:sz w:val="14"/>
+                <w:sz w:val="13"/>
               </w:rPr>
-              <w:t xml:space="preserve">1.00 / 0.00 / 0.00</w:t>
-            </w:r>
-          </w:p>
-        </w:tc>
-      </w:tr>
-      <w:tr>
-        <w:trPr>
-          <w:cantSplit/>
-        </w:trPr>
-        <w:tc>
-          <w:tcPr>
-            <w:tcW w:type="dxa" w:w="2900"/>
-            <w:tcMar>
-              <w:top w:w="40" w:type="dxa"/>
-              <w:start w:w="50" w:type="dxa"/>
-              <w:bottom w:w="40" w:type="dxa"/>
-              <w:end w:w="50" w:type="dxa"/>
-            </w:tcMar>
-            <w:vAlign w:val="center"/>
-          </w:tcPr>
-          <w:p>
-            <w:pPr>
-              <w:spacing w:before="0" w:after="0" w:line="240" w:lineRule="auto"/>
-              <w:jc w:val="left"/>
-            </w:pPr>
-            <w:r>
-              <w:rPr>
-                <w:rFonts w:ascii="Times New Roman" w:hAnsi="Times New Roman"/>
-                <w:b w:val="0"/>
-                <w:sz w:val="14"/>
-              </w:rPr>
-              <w:t xml:space="preserve">E6: α = 0.5</w:t>
+              <w:t xml:space="preserve">Sliding-window LinUCB</w:t>
             </w:r>
           </w:p>
         </w:tc>
         <w:tc>
           <w:tcPr>
-            <w:tcW w:type="dxa" w:w="1300"/>
+            <w:tcW w:type="dxa" w:w="600"/>
             <w:tcMar>
               <w:top w:w="40" w:type="dxa"/>
               <w:start w:w="50" w:type="dxa"/>
@@ -4384,15 +4780,15 @@
               <w:rPr>
                 <w:rFonts w:ascii="Times New Roman" w:hAnsi="Times New Roman"/>
                 <w:b w:val="0"/>
-                <w:sz w:val="14"/>
+                <w:sz w:val="13"/>
               </w:rPr>
-              <w:t xml:space="preserve">0.799</w:t>
+              <w:t xml:space="preserve">0.838</w:t>
             </w:r>
           </w:p>
         </w:tc>
         <w:tc>
           <w:tcPr>
-            <w:tcW w:type="dxa" w:w="1300"/>
+            <w:tcW w:type="dxa" w:w="600"/>
             <w:tcMar>
               <w:top w:w="40" w:type="dxa"/>
               <w:start w:w="50" w:type="dxa"/>
@@ -4410,15 +4806,15 @@
               <w:rPr>
                 <w:rFonts w:ascii="Times New Roman" w:hAnsi="Times New Roman"/>
                 <w:b w:val="0"/>
-                <w:sz w:val="14"/>
+                <w:sz w:val="13"/>
               </w:rPr>
-              <w:t xml:space="preserve">0.951</w:t>
+              <w:t xml:space="preserve">0.948</w:t>
             </w:r>
           </w:p>
         </w:tc>
         <w:tc>
           <w:tcPr>
-            <w:tcW w:type="dxa" w:w="1300"/>
+            <w:tcW w:type="dxa" w:w="520"/>
             <w:tcMar>
               <w:top w:w="40" w:type="dxa"/>
               <w:start w:w="50" w:type="dxa"/>
@@ -4436,15 +4832,15 @@
               <w:rPr>
                 <w:rFonts w:ascii="Times New Roman" w:hAnsi="Times New Roman"/>
                 <w:b w:val="0"/>
-                <w:sz w:val="14"/>
+                <w:sz w:val="13"/>
               </w:rPr>
-              <w:t xml:space="preserve">2.098</w:t>
+              <w:t xml:space="preserve">1.42</w:t>
             </w:r>
           </w:p>
         </w:tc>
         <w:tc>
           <w:tcPr>
-            <w:tcW w:type="dxa" w:w="1100"/>
+            <w:tcW w:type="dxa" w:w="560"/>
             <w:tcMar>
               <w:top w:w="40" w:type="dxa"/>
               <w:start w:w="50" w:type="dxa"/>
@@ -4462,72 +4858,15 @@
               <w:rPr>
                 <w:rFonts w:ascii="Times New Roman" w:hAnsi="Times New Roman"/>
                 <w:b w:val="0"/>
-                <w:sz w:val="14"/>
+                <w:sz w:val="13"/>
               </w:rPr>
-              <w:t xml:space="preserve">17.2</w:t>
+              <w:t xml:space="preserve">8.9</w:t>
             </w:r>
           </w:p>
         </w:tc>
         <w:tc>
           <w:tcPr>
-            <w:tcW w:type="dxa" w:w="2223"/>
-            <w:tcMar>
-              <w:top w:w="40" w:type="dxa"/>
-              <w:start w:w="50" w:type="dxa"/>
-              <w:bottom w:w="40" w:type="dxa"/>
-              <w:end w:w="50" w:type="dxa"/>
-            </w:tcMar>
-            <w:vAlign w:val="center"/>
-          </w:tcPr>
-          <w:p>
-            <w:pPr>
-              <w:spacing w:before="0" w:after="0" w:line="240" w:lineRule="auto"/>
-              <w:jc w:val="left"/>
-            </w:pPr>
-            <w:r>
-              <w:rPr>
-                <w:rFonts w:ascii="Times New Roman" w:hAnsi="Times New Roman"/>
-                <w:b w:val="0"/>
-                <w:sz w:val="14"/>
-              </w:rPr>
-              <w:t xml:space="preserve">0.60 / 0.39 / 0.01</w:t>
-            </w:r>
-          </w:p>
-        </w:tc>
-      </w:tr>
-      <w:tr>
-        <w:trPr>
-          <w:cantSplit/>
-        </w:trPr>
-        <w:tc>
-          <w:tcPr>
-            <w:tcW w:type="dxa" w:w="2900"/>
-            <w:tcMar>
-              <w:top w:w="40" w:type="dxa"/>
-              <w:start w:w="50" w:type="dxa"/>
-              <w:bottom w:w="40" w:type="dxa"/>
-              <w:end w:w="50" w:type="dxa"/>
-            </w:tcMar>
-            <w:vAlign w:val="center"/>
-          </w:tcPr>
-          <w:p>
-            <w:pPr>
-              <w:spacing w:before="0" w:after="0" w:line="240" w:lineRule="auto"/>
-              <w:jc w:val="left"/>
-            </w:pPr>
-            <w:r>
-              <w:rPr>
-                <w:rFonts w:ascii="Times New Roman" w:hAnsi="Times New Roman"/>
-                <w:b w:val="0"/>
-                <w:sz w:val="14"/>
-              </w:rPr>
-              <w:t xml:space="preserve">E6: α = 1.0</w:t>
-            </w:r>
-          </w:p>
-        </w:tc>
-        <w:tc>
-          <w:tcPr>
-            <w:tcW w:type="dxa" w:w="1300"/>
+            <w:tcW w:type="dxa" w:w="1044"/>
             <w:tcMar>
               <w:top w:w="40" w:type="dxa"/>
               <w:start w:w="50" w:type="dxa"/>
@@ -4545,773 +4884,14 @@
               <w:rPr>
                 <w:rFonts w:ascii="Times New Roman" w:hAnsi="Times New Roman"/>
                 <w:b w:val="0"/>
-                <w:sz w:val="14"/>
+                <w:sz w:val="13"/>
               </w:rPr>
-              <w:t xml:space="preserve">0.836</w:t>
-            </w:r>
-          </w:p>
-        </w:tc>
-        <w:tc>
-          <w:tcPr>
-            <w:tcW w:type="dxa" w:w="1300"/>
-            <w:tcMar>
-              <w:top w:w="40" w:type="dxa"/>
-              <w:start w:w="50" w:type="dxa"/>
-              <w:bottom w:w="40" w:type="dxa"/>
-              <w:end w:w="50" w:type="dxa"/>
-            </w:tcMar>
-            <w:vAlign w:val="center"/>
-          </w:tcPr>
-          <w:p>
-            <w:pPr>
-              <w:spacing w:before="0" w:after="0" w:line="240" w:lineRule="auto"/>
-              <w:jc w:val="center"/>
-            </w:pPr>
-            <w:r>
-              <w:rPr>
-                <w:rFonts w:ascii="Times New Roman" w:hAnsi="Times New Roman"/>
-                <w:b w:val="0"/>
-                <w:sz w:val="14"/>
-              </w:rPr>
-              <w:t xml:space="preserve">0.948</w:t>
-            </w:r>
-          </w:p>
-        </w:tc>
-        <w:tc>
-          <w:tcPr>
-            <w:tcW w:type="dxa" w:w="1300"/>
-            <w:tcMar>
-              <w:top w:w="40" w:type="dxa"/>
-              <w:start w:w="50" w:type="dxa"/>
-              <w:bottom w:w="40" w:type="dxa"/>
-              <w:end w:w="50" w:type="dxa"/>
-            </w:tcMar>
-            <w:vAlign w:val="center"/>
-          </w:tcPr>
-          <w:p>
-            <w:pPr>
-              <w:spacing w:before="0" w:after="0" w:line="240" w:lineRule="auto"/>
-              <w:jc w:val="center"/>
-            </w:pPr>
-            <w:r>
-              <w:rPr>
-                <w:rFonts w:ascii="Times New Roman" w:hAnsi="Times New Roman"/>
-                <w:b w:val="0"/>
-                <w:sz w:val="14"/>
-              </w:rPr>
-              <w:t xml:space="preserve">1.460</w:t>
-            </w:r>
-          </w:p>
-        </w:tc>
-        <w:tc>
-          <w:tcPr>
-            <w:tcW w:type="dxa" w:w="1100"/>
-            <w:tcMar>
-              <w:top w:w="40" w:type="dxa"/>
-              <w:start w:w="50" w:type="dxa"/>
-              <w:bottom w:w="40" w:type="dxa"/>
-              <w:end w:w="50" w:type="dxa"/>
-            </w:tcMar>
-            <w:vAlign w:val="center"/>
-          </w:tcPr>
-          <w:p>
-            <w:pPr>
-              <w:spacing w:before="0" w:after="0" w:line="240" w:lineRule="auto"/>
-              <w:jc w:val="center"/>
-            </w:pPr>
-            <w:r>
-              <w:rPr>
-                <w:rFonts w:ascii="Times New Roman" w:hAnsi="Times New Roman"/>
-                <w:b w:val="0"/>
-                <w:sz w:val="14"/>
-              </w:rPr>
-              <w:t xml:space="preserve">9.3</w:t>
-            </w:r>
-          </w:p>
-        </w:tc>
-        <w:tc>
-          <w:tcPr>
-            <w:tcW w:type="dxa" w:w="2223"/>
-            <w:tcMar>
-              <w:top w:w="40" w:type="dxa"/>
-              <w:start w:w="50" w:type="dxa"/>
-              <w:bottom w:w="40" w:type="dxa"/>
-              <w:end w:w="50" w:type="dxa"/>
-            </w:tcMar>
-            <w:vAlign w:val="center"/>
-          </w:tcPr>
-          <w:p>
-            <w:pPr>
-              <w:spacing w:before="0" w:after="0" w:line="240" w:lineRule="auto"/>
-              <w:jc w:val="left"/>
-            </w:pPr>
-            <w:r>
-              <w:rPr>
-                <w:rFonts w:ascii="Times New Roman" w:hAnsi="Times New Roman"/>
-                <w:b w:val="0"/>
-                <w:sz w:val="14"/>
-              </w:rPr>
-              <w:t xml:space="preserve">0.98 / 0.01 / 0.01</w:t>
-            </w:r>
-          </w:p>
-        </w:tc>
-      </w:tr>
-      <w:tr>
-        <w:trPr>
-          <w:cantSplit/>
-        </w:trPr>
-        <w:tc>
-          <w:tcPr>
-            <w:tcW w:type="dxa" w:w="2900"/>
-            <w:tcMar>
-              <w:top w:w="40" w:type="dxa"/>
-              <w:start w:w="50" w:type="dxa"/>
-              <w:bottom w:w="40" w:type="dxa"/>
-              <w:end w:w="50" w:type="dxa"/>
-            </w:tcMar>
-            <w:vAlign w:val="center"/>
-          </w:tcPr>
-          <w:p>
-            <w:pPr>
-              <w:spacing w:before="0" w:after="0" w:line="240" w:lineRule="auto"/>
-              <w:jc w:val="left"/>
-            </w:pPr>
-            <w:r>
-              <w:rPr>
-                <w:rFonts w:ascii="Times New Roman" w:hAnsi="Times New Roman"/>
-                <w:b w:val="0"/>
-                <w:sz w:val="14"/>
-              </w:rPr>
-              <w:t xml:space="preserve">E6: α = 2.0</w:t>
-            </w:r>
-          </w:p>
-        </w:tc>
-        <w:tc>
-          <w:tcPr>
-            <w:tcW w:type="dxa" w:w="1300"/>
-            <w:tcMar>
-              <w:top w:w="40" w:type="dxa"/>
-              <w:start w:w="50" w:type="dxa"/>
-              <w:bottom w:w="40" w:type="dxa"/>
-              <w:end w:w="50" w:type="dxa"/>
-            </w:tcMar>
-            <w:vAlign w:val="center"/>
-          </w:tcPr>
-          <w:p>
-            <w:pPr>
-              <w:spacing w:before="0" w:after="0" w:line="240" w:lineRule="auto"/>
-              <w:jc w:val="center"/>
-            </w:pPr>
-            <w:r>
-              <w:rPr>
-                <w:rFonts w:ascii="Times New Roman" w:hAnsi="Times New Roman"/>
-                <w:b w:val="0"/>
-                <w:sz w:val="14"/>
-              </w:rPr>
-              <w:t xml:space="preserve">0.813</w:t>
-            </w:r>
-          </w:p>
-        </w:tc>
-        <w:tc>
-          <w:tcPr>
-            <w:tcW w:type="dxa" w:w="1300"/>
-            <w:tcMar>
-              <w:top w:w="40" w:type="dxa"/>
-              <w:start w:w="50" w:type="dxa"/>
-              <w:bottom w:w="40" w:type="dxa"/>
-              <w:end w:w="50" w:type="dxa"/>
-            </w:tcMar>
-            <w:vAlign w:val="center"/>
-          </w:tcPr>
-          <w:p>
-            <w:pPr>
-              <w:spacing w:before="0" w:after="0" w:line="240" w:lineRule="auto"/>
-              <w:jc w:val="center"/>
-            </w:pPr>
-            <w:r>
-              <w:rPr>
-                <w:rFonts w:ascii="Times New Roman" w:hAnsi="Times New Roman"/>
-                <w:b w:val="0"/>
-                <w:sz w:val="14"/>
-              </w:rPr>
-              <w:t xml:space="preserve">0.953</w:t>
-            </w:r>
-          </w:p>
-        </w:tc>
-        <w:tc>
-          <w:tcPr>
-            <w:tcW w:type="dxa" w:w="1300"/>
-            <w:tcMar>
-              <w:top w:w="40" w:type="dxa"/>
-              <w:start w:w="50" w:type="dxa"/>
-              <w:bottom w:w="40" w:type="dxa"/>
-              <w:end w:w="50" w:type="dxa"/>
-            </w:tcMar>
-            <w:vAlign w:val="center"/>
-          </w:tcPr>
-          <w:p>
-            <w:pPr>
-              <w:spacing w:before="0" w:after="0" w:line="240" w:lineRule="auto"/>
-              <w:jc w:val="center"/>
-            </w:pPr>
-            <w:r>
-              <w:rPr>
-                <w:rFonts w:ascii="Times New Roman" w:hAnsi="Times New Roman"/>
-                <w:b w:val="0"/>
-                <w:sz w:val="14"/>
-              </w:rPr>
-              <w:t xml:space="preserve">1.945</w:t>
-            </w:r>
-          </w:p>
-        </w:tc>
-        <w:tc>
-          <w:tcPr>
-            <w:tcW w:type="dxa" w:w="1100"/>
-            <w:tcMar>
-              <w:top w:w="40" w:type="dxa"/>
-              <w:start w:w="50" w:type="dxa"/>
-              <w:bottom w:w="40" w:type="dxa"/>
-              <w:end w:w="50" w:type="dxa"/>
-            </w:tcMar>
-            <w:vAlign w:val="center"/>
-          </w:tcPr>
-          <w:p>
-            <w:pPr>
-              <w:spacing w:before="0" w:after="0" w:line="240" w:lineRule="auto"/>
-              <w:jc w:val="center"/>
-            </w:pPr>
-            <w:r>
-              <w:rPr>
-                <w:rFonts w:ascii="Times New Roman" w:hAnsi="Times New Roman"/>
-                <w:b w:val="0"/>
-                <w:sz w:val="14"/>
-              </w:rPr>
-              <w:t xml:space="preserve">14.2</w:t>
-            </w:r>
-          </w:p>
-        </w:tc>
-        <w:tc>
-          <w:tcPr>
-            <w:tcW w:type="dxa" w:w="2223"/>
-            <w:tcMar>
-              <w:top w:w="40" w:type="dxa"/>
-              <w:start w:w="50" w:type="dxa"/>
-              <w:bottom w:w="40" w:type="dxa"/>
-              <w:end w:w="50" w:type="dxa"/>
-            </w:tcMar>
-            <w:vAlign w:val="center"/>
-          </w:tcPr>
-          <w:p>
-            <w:pPr>
-              <w:spacing w:before="0" w:after="0" w:line="240" w:lineRule="auto"/>
-              <w:jc w:val="left"/>
-            </w:pPr>
-            <w:r>
-              <w:rPr>
-                <w:rFonts w:ascii="Times New Roman" w:hAnsi="Times New Roman"/>
-                <w:b w:val="0"/>
-                <w:sz w:val="14"/>
-              </w:rPr>
-              <w:t xml:space="preserve">0.75 / 0.17 / 0.07</w:t>
-            </w:r>
-          </w:p>
-        </w:tc>
-      </w:tr>
-      <w:tr>
-        <w:trPr>
-          <w:cantSplit/>
-        </w:trPr>
-        <w:tc>
-          <w:tcPr>
-            <w:tcW w:type="dxa" w:w="2900"/>
-            <w:tcMar>
-              <w:top w:w="40" w:type="dxa"/>
-              <w:start w:w="50" w:type="dxa"/>
-              <w:bottom w:w="40" w:type="dxa"/>
-              <w:end w:w="50" w:type="dxa"/>
-            </w:tcMar>
-            <w:vAlign w:val="center"/>
-          </w:tcPr>
-          <w:p>
-            <w:pPr>
-              <w:spacing w:before="0" w:after="0" w:line="240" w:lineRule="auto"/>
-              <w:jc w:val="left"/>
-            </w:pPr>
-            <w:r>
-              <w:rPr>
-                <w:rFonts w:ascii="Times New Roman" w:hAnsi="Times New Roman"/>
-                <w:b w:val="0"/>
-                <w:sz w:val="14"/>
-              </w:rPr>
-              <w:t xml:space="preserve">Linear Thompson sampling</w:t>
-            </w:r>
-          </w:p>
-        </w:tc>
-        <w:tc>
-          <w:tcPr>
-            <w:tcW w:type="dxa" w:w="1300"/>
-            <w:tcMar>
-              <w:top w:w="40" w:type="dxa"/>
-              <w:start w:w="50" w:type="dxa"/>
-              <w:bottom w:w="40" w:type="dxa"/>
-              <w:end w:w="50" w:type="dxa"/>
-            </w:tcMar>
-            <w:vAlign w:val="center"/>
-          </w:tcPr>
-          <w:p>
-            <w:pPr>
-              <w:spacing w:before="0" w:after="0" w:line="240" w:lineRule="auto"/>
-              <w:jc w:val="center"/>
-            </w:pPr>
-            <w:r>
-              <w:rPr>
-                <w:rFonts w:ascii="Times New Roman" w:hAnsi="Times New Roman"/>
-                <w:b w:val="0"/>
-                <w:sz w:val="14"/>
-              </w:rPr>
-              <w:t xml:space="preserve">0.823</w:t>
-            </w:r>
-          </w:p>
-        </w:tc>
-        <w:tc>
-          <w:tcPr>
-            <w:tcW w:type="dxa" w:w="1300"/>
-            <w:tcMar>
-              <w:top w:w="40" w:type="dxa"/>
-              <w:start w:w="50" w:type="dxa"/>
-              <w:bottom w:w="40" w:type="dxa"/>
-              <w:end w:w="50" w:type="dxa"/>
-            </w:tcMar>
-            <w:vAlign w:val="center"/>
-          </w:tcPr>
-          <w:p>
-            <w:pPr>
-              <w:spacing w:before="0" w:after="0" w:line="240" w:lineRule="auto"/>
-              <w:jc w:val="center"/>
-            </w:pPr>
-            <w:r>
-              <w:rPr>
-                <w:rFonts w:ascii="Times New Roman" w:hAnsi="Times New Roman"/>
-                <w:b w:val="0"/>
-                <w:sz w:val="14"/>
-              </w:rPr>
-              <w:t xml:space="preserve">0.951</w:t>
-            </w:r>
-          </w:p>
-        </w:tc>
-        <w:tc>
-          <w:tcPr>
-            <w:tcW w:type="dxa" w:w="1300"/>
-            <w:tcMar>
-              <w:top w:w="40" w:type="dxa"/>
-              <w:start w:w="50" w:type="dxa"/>
-              <w:bottom w:w="40" w:type="dxa"/>
-              <w:end w:w="50" w:type="dxa"/>
-            </w:tcMar>
-            <w:vAlign w:val="center"/>
-          </w:tcPr>
-          <w:p>
-            <w:pPr>
-              <w:spacing w:before="0" w:after="0" w:line="240" w:lineRule="auto"/>
-              <w:jc w:val="center"/>
-            </w:pPr>
-            <w:r>
-              <w:rPr>
-                <w:rFonts w:ascii="Times New Roman" w:hAnsi="Times New Roman"/>
-                <w:b w:val="0"/>
-                <w:sz w:val="14"/>
-              </w:rPr>
-              <w:t xml:space="preserve">1.766</w:t>
-            </w:r>
-          </w:p>
-        </w:tc>
-        <w:tc>
-          <w:tcPr>
-            <w:tcW w:type="dxa" w:w="1100"/>
-            <w:tcMar>
-              <w:top w:w="40" w:type="dxa"/>
-              <w:start w:w="50" w:type="dxa"/>
-              <w:bottom w:w="40" w:type="dxa"/>
-              <w:end w:w="50" w:type="dxa"/>
-            </w:tcMar>
-            <w:vAlign w:val="center"/>
-          </w:tcPr>
-          <w:p>
-            <w:pPr>
-              <w:spacing w:before="0" w:after="0" w:line="240" w:lineRule="auto"/>
-              <w:jc w:val="center"/>
-            </w:pPr>
-            <w:r>
-              <w:rPr>
-                <w:rFonts w:ascii="Times New Roman" w:hAnsi="Times New Roman"/>
-                <w:b w:val="0"/>
-                <w:sz w:val="14"/>
-              </w:rPr>
-              <w:t xml:space="preserve">12.0</w:t>
-            </w:r>
-          </w:p>
-        </w:tc>
-        <w:tc>
-          <w:tcPr>
-            <w:tcW w:type="dxa" w:w="2223"/>
-            <w:tcMar>
-              <w:top w:w="40" w:type="dxa"/>
-              <w:start w:w="50" w:type="dxa"/>
-              <w:bottom w:w="40" w:type="dxa"/>
-              <w:end w:w="50" w:type="dxa"/>
-            </w:tcMar>
-            <w:vAlign w:val="center"/>
-          </w:tcPr>
-          <w:p>
-            <w:pPr>
-              <w:spacing w:before="0" w:after="0" w:line="240" w:lineRule="auto"/>
-              <w:jc w:val="left"/>
-            </w:pPr>
-            <w:r>
-              <w:rPr>
-                <w:rFonts w:ascii="Times New Roman" w:hAnsi="Times New Roman"/>
-                <w:b w:val="0"/>
-                <w:sz w:val="14"/>
-              </w:rPr>
-              <w:t xml:space="preserve">0.88 / 0.03 / 0.09</w:t>
-            </w:r>
-          </w:p>
-        </w:tc>
-      </w:tr>
-      <w:tr>
-        <w:trPr>
-          <w:cantSplit/>
-        </w:trPr>
-        <w:tc>
-          <w:tcPr>
-            <w:tcW w:type="dxa" w:w="2900"/>
-            <w:tcMar>
-              <w:top w:w="40" w:type="dxa"/>
-              <w:start w:w="50" w:type="dxa"/>
-              <w:bottom w:w="40" w:type="dxa"/>
-              <w:end w:w="50" w:type="dxa"/>
-            </w:tcMar>
-            <w:vAlign w:val="center"/>
-          </w:tcPr>
-          <w:p>
-            <w:pPr>
-              <w:spacing w:before="0" w:after="0" w:line="240" w:lineRule="auto"/>
-              <w:jc w:val="left"/>
-            </w:pPr>
-            <w:r>
-              <w:rPr>
-                <w:rFonts w:ascii="Times New Roman" w:hAnsi="Times New Roman"/>
-                <w:b w:val="0"/>
-                <w:sz w:val="14"/>
-              </w:rPr>
-              <w:t xml:space="preserve">ε-greedy ridge (ε = 0.1)</w:t>
-            </w:r>
-          </w:p>
-        </w:tc>
-        <w:tc>
-          <w:tcPr>
-            <w:tcW w:type="dxa" w:w="1300"/>
-            <w:tcMar>
-              <w:top w:w="40" w:type="dxa"/>
-              <w:start w:w="50" w:type="dxa"/>
-              <w:bottom w:w="40" w:type="dxa"/>
-              <w:end w:w="50" w:type="dxa"/>
-            </w:tcMar>
-            <w:vAlign w:val="center"/>
-          </w:tcPr>
-          <w:p>
-            <w:pPr>
-              <w:spacing w:before="0" w:after="0" w:line="240" w:lineRule="auto"/>
-              <w:jc w:val="center"/>
-            </w:pPr>
-            <w:r>
-              <w:rPr>
-                <w:rFonts w:ascii="Times New Roman" w:hAnsi="Times New Roman"/>
-                <w:b w:val="0"/>
-                <w:sz w:val="14"/>
-              </w:rPr>
-              <w:t xml:space="preserve">0.810</w:t>
-            </w:r>
-          </w:p>
-        </w:tc>
-        <w:tc>
-          <w:tcPr>
-            <w:tcW w:type="dxa" w:w="1300"/>
-            <w:tcMar>
-              <w:top w:w="40" w:type="dxa"/>
-              <w:start w:w="50" w:type="dxa"/>
-              <w:bottom w:w="40" w:type="dxa"/>
-              <w:end w:w="50" w:type="dxa"/>
-            </w:tcMar>
-            <w:vAlign w:val="center"/>
-          </w:tcPr>
-          <w:p>
-            <w:pPr>
-              <w:spacing w:before="0" w:after="0" w:line="240" w:lineRule="auto"/>
-              <w:jc w:val="center"/>
-            </w:pPr>
-            <w:r>
-              <w:rPr>
-                <w:rFonts w:ascii="Times New Roman" w:hAnsi="Times New Roman"/>
-                <w:b w:val="0"/>
-                <w:sz w:val="14"/>
-              </w:rPr>
-              <w:t xml:space="preserve">0.949</w:t>
-            </w:r>
-          </w:p>
-        </w:tc>
-        <w:tc>
-          <w:tcPr>
-            <w:tcW w:type="dxa" w:w="1300"/>
-            <w:tcMar>
-              <w:top w:w="40" w:type="dxa"/>
-              <w:start w:w="50" w:type="dxa"/>
-              <w:bottom w:w="40" w:type="dxa"/>
-              <w:end w:w="50" w:type="dxa"/>
-            </w:tcMar>
-            <w:vAlign w:val="center"/>
-          </w:tcPr>
-          <w:p>
-            <w:pPr>
-              <w:spacing w:before="0" w:after="0" w:line="240" w:lineRule="auto"/>
-              <w:jc w:val="center"/>
-            </w:pPr>
-            <w:r>
-              <w:rPr>
-                <w:rFonts w:ascii="Times New Roman" w:hAnsi="Times New Roman"/>
-                <w:b w:val="0"/>
-                <w:sz w:val="14"/>
-              </w:rPr>
-              <w:t xml:space="preserve">1.887</w:t>
-            </w:r>
-          </w:p>
-        </w:tc>
-        <w:tc>
-          <w:tcPr>
-            <w:tcW w:type="dxa" w:w="1100"/>
-            <w:tcMar>
-              <w:top w:w="40" w:type="dxa"/>
-              <w:start w:w="50" w:type="dxa"/>
-              <w:bottom w:w="40" w:type="dxa"/>
-              <w:end w:w="50" w:type="dxa"/>
-            </w:tcMar>
-            <w:vAlign w:val="center"/>
-          </w:tcPr>
-          <w:p>
-            <w:pPr>
-              <w:spacing w:before="0" w:after="0" w:line="240" w:lineRule="auto"/>
-              <w:jc w:val="center"/>
-            </w:pPr>
-            <w:r>
-              <w:rPr>
-                <w:rFonts w:ascii="Times New Roman" w:hAnsi="Times New Roman"/>
-                <w:b w:val="0"/>
-                <w:sz w:val="14"/>
-              </w:rPr>
-              <w:t xml:space="preserve">14.8</w:t>
-            </w:r>
-          </w:p>
-        </w:tc>
-        <w:tc>
-          <w:tcPr>
-            <w:tcW w:type="dxa" w:w="2223"/>
-            <w:tcMar>
-              <w:top w:w="40" w:type="dxa"/>
-              <w:start w:w="50" w:type="dxa"/>
-              <w:bottom w:w="40" w:type="dxa"/>
-              <w:end w:w="50" w:type="dxa"/>
-            </w:tcMar>
-            <w:vAlign w:val="center"/>
-          </w:tcPr>
-          <w:p>
-            <w:pPr>
-              <w:spacing w:before="0" w:after="0" w:line="240" w:lineRule="auto"/>
-              <w:jc w:val="left"/>
-            </w:pPr>
-            <w:r>
-              <w:rPr>
-                <w:rFonts w:ascii="Times New Roman" w:hAnsi="Times New Roman"/>
-                <w:b w:val="0"/>
-                <w:sz w:val="14"/>
-              </w:rPr>
-              <w:t xml:space="preserve">0.76 / 0.21 / 0.03</w:t>
-            </w:r>
-          </w:p>
-        </w:tc>
-      </w:tr>
-      <w:tr>
-        <w:trPr>
-          <w:cantSplit/>
-        </w:trPr>
-        <w:tc>
-          <w:tcPr>
-            <w:tcW w:type="dxa" w:w="2900"/>
-            <w:tcMar>
-              <w:top w:w="40" w:type="dxa"/>
-              <w:start w:w="50" w:type="dxa"/>
-              <w:bottom w:w="40" w:type="dxa"/>
-              <w:end w:w="50" w:type="dxa"/>
-            </w:tcMar>
-            <w:vAlign w:val="center"/>
-          </w:tcPr>
-          <w:p>
-            <w:pPr>
-              <w:spacing w:before="0" w:after="0" w:line="240" w:lineRule="auto"/>
-              <w:jc w:val="left"/>
-            </w:pPr>
-            <w:r>
-              <w:rPr>
-                <w:rFonts w:ascii="Times New Roman" w:hAnsi="Times New Roman"/>
-                <w:b w:val="0"/>
-                <w:sz w:val="14"/>
-              </w:rPr>
-              <w:t xml:space="preserve">Sliding-window LinUCB</w:t>
-            </w:r>
-          </w:p>
-        </w:tc>
-        <w:tc>
-          <w:tcPr>
-            <w:tcW w:type="dxa" w:w="1300"/>
-            <w:tcMar>
-              <w:top w:w="40" w:type="dxa"/>
-              <w:start w:w="50" w:type="dxa"/>
-              <w:bottom w:w="40" w:type="dxa"/>
-              <w:end w:w="50" w:type="dxa"/>
-            </w:tcMar>
-            <w:vAlign w:val="center"/>
-          </w:tcPr>
-          <w:p>
-            <w:pPr>
-              <w:spacing w:before="0" w:after="0" w:line="240" w:lineRule="auto"/>
-              <w:jc w:val="center"/>
-            </w:pPr>
-            <w:r>
-              <w:rPr>
-                <w:rFonts w:ascii="Times New Roman" w:hAnsi="Times New Roman"/>
-                <w:b w:val="0"/>
-                <w:sz w:val="14"/>
-              </w:rPr>
-              <w:t xml:space="preserve">0.838</w:t>
-            </w:r>
-          </w:p>
-        </w:tc>
-        <w:tc>
-          <w:tcPr>
-            <w:tcW w:type="dxa" w:w="1300"/>
-            <w:tcMar>
-              <w:top w:w="40" w:type="dxa"/>
-              <w:start w:w="50" w:type="dxa"/>
-              <w:bottom w:w="40" w:type="dxa"/>
-              <w:end w:w="50" w:type="dxa"/>
-            </w:tcMar>
-            <w:vAlign w:val="center"/>
-          </w:tcPr>
-          <w:p>
-            <w:pPr>
-              <w:spacing w:before="0" w:after="0" w:line="240" w:lineRule="auto"/>
-              <w:jc w:val="center"/>
-            </w:pPr>
-            <w:r>
-              <w:rPr>
-                <w:rFonts w:ascii="Times New Roman" w:hAnsi="Times New Roman"/>
-                <w:b w:val="0"/>
-                <w:sz w:val="14"/>
-              </w:rPr>
-              <w:t xml:space="preserve">0.948</w:t>
-            </w:r>
-          </w:p>
-        </w:tc>
-        <w:tc>
-          <w:tcPr>
-            <w:tcW w:type="dxa" w:w="1300"/>
-            <w:tcMar>
-              <w:top w:w="40" w:type="dxa"/>
-              <w:start w:w="50" w:type="dxa"/>
-              <w:bottom w:w="40" w:type="dxa"/>
-              <w:end w:w="50" w:type="dxa"/>
-            </w:tcMar>
-            <w:vAlign w:val="center"/>
-          </w:tcPr>
-          <w:p>
-            <w:pPr>
-              <w:spacing w:before="0" w:after="0" w:line="240" w:lineRule="auto"/>
-              <w:jc w:val="center"/>
-            </w:pPr>
-            <w:r>
-              <w:rPr>
-                <w:rFonts w:ascii="Times New Roman" w:hAnsi="Times New Roman"/>
-                <w:b w:val="0"/>
-                <w:sz w:val="14"/>
-              </w:rPr>
-              <w:t xml:space="preserve">1.423</w:t>
-            </w:r>
-          </w:p>
-        </w:tc>
-        <w:tc>
-          <w:tcPr>
-            <w:tcW w:type="dxa" w:w="1100"/>
-            <w:tcMar>
-              <w:top w:w="40" w:type="dxa"/>
-              <w:start w:w="50" w:type="dxa"/>
-              <w:bottom w:w="40" w:type="dxa"/>
-              <w:end w:w="50" w:type="dxa"/>
-            </w:tcMar>
-            <w:vAlign w:val="center"/>
-          </w:tcPr>
-          <w:p>
-            <w:pPr>
-              <w:spacing w:before="0" w:after="0" w:line="240" w:lineRule="auto"/>
-              <w:jc w:val="center"/>
-            </w:pPr>
-            <w:r>
-              <w:rPr>
-                <w:rFonts w:ascii="Times New Roman" w:hAnsi="Times New Roman"/>
-                <w:b w:val="0"/>
-                <w:sz w:val="14"/>
-              </w:rPr>
-              <w:t xml:space="preserve">8.9</w:t>
-            </w:r>
-          </w:p>
-        </w:tc>
-        <w:tc>
-          <w:tcPr>
-            <w:tcW w:type="dxa" w:w="2223"/>
-            <w:tcMar>
-              <w:top w:w="40" w:type="dxa"/>
-              <w:start w:w="50" w:type="dxa"/>
-              <w:bottom w:w="40" w:type="dxa"/>
-              <w:end w:w="50" w:type="dxa"/>
-            </w:tcMar>
-            <w:vAlign w:val="center"/>
-          </w:tcPr>
-          <w:p>
-            <w:pPr>
-              <w:spacing w:before="0" w:after="0" w:line="240" w:lineRule="auto"/>
-              <w:jc w:val="left"/>
-            </w:pPr>
-            <w:r>
-              <w:rPr>
-                <w:rFonts w:ascii="Times New Roman" w:hAnsi="Times New Roman"/>
-                <w:b w:val="0"/>
-                <w:sz w:val="14"/>
-              </w:rPr>
-              <w:t xml:space="preserve">1.00 / 0.00 / 0.00</w:t>
+              <w:t xml:space="preserve">1.00/0.00/0.00</w:t>
             </w:r>
           </w:p>
         </w:tc>
       </w:tr>
     </w:tbl>
-    <w:p>
-      <w:pPr>
-        <w:sectPr>
-          <w:type w:val="continuous"/>
-          <w:pgSz w:w="11909" w:h="16834"/>
-          <w:pgMar w:top="778" w:right="893" w:bottom="1440" w:left="893" w:header="288" w:footer="360" w:gutter="0"/>
-          <w:cols w:space="360" w:num="1"/>
-          <w:docGrid w:linePitch="360"/>
-        </w:sectPr>
-      </w:pPr>
-    </w:p>
     <w:p>
       <w:pPr>
         <w:keepNext/>
@@ -5437,6 +5017,21 @@
     </w:p>
     <w:p>
       <w:pPr>
+        <w:keepNext w:val="0"/>
+        <w:spacing w:before="0" w:after="20" w:line="240" w:lineRule="auto"/>
+        <w:ind w:firstLine="216"/>
+        <w:jc w:val="both"/>
+      </w:pPr>
+      <w:r>
+        <w:rPr>
+          <w:rFonts w:ascii="Times New Roman" w:hAnsi="Times New Roman"/>
+          <w:sz w:val="20"/>
+        </w:rPr>
+        <w:t xml:space="preserve">For deployment, the pilot suggests a simple procedure. Before routing at all, run each candidate on a small development sample and compute the reward of every fixed policy; if one model dominates under the chosen weights, as Qwen3-4B does here, a fixed or rule-based choice is sufficient and a learned router mainly acts as a safeguard that would notice if that stopped being true. LinUCB is worth its added state when the development data show different best models for different kinds of queries, and in that case the exploration coefficient should be kept small (α ≤ 1 in this pilot), because larger values spent up to 37% more cost for at most half a point of accuracy. Because the router stores only a 12×12 matrix and a 12-dimensional vector per model, its overhead is negligible next to a single LLM call, and its audit log makes every choice explainable.</w:t>
+      </w:r>
+    </w:p>
+    <w:p>
+      <w:pPr>
         <w:keepNext/>
         <w:spacing w:before="100" w:after="40"/>
         <w:jc w:val="center"/>
@@ -5463,13 +5058,40 @@
           <w:rFonts w:ascii="Times New Roman" w:hAnsi="Times New Roman"/>
           <w:sz w:val="20"/>
         </w:rPr>
-        <w:t xml:space="preserve">This paper presented an adaptive LLM routing framework that formulates per-query model selection as a contextual-bandit problem and uses LinUCB to balance quality, latency, and cost without modifying the candidate models. In a GSM8K pilot with Qwen3-4B, 8B, and 14B on one RTX 4090, LinUCB learned to route 98.2% of queries to the smallest model, matched its 94.8% accuracy, and cut cost per request by 69% relative to large-only routing, but it did not exceed the small-only and rule-based baselines, which are near-optimal on a single-category workload. Future work is to run the full seven-category evaluation with workload shift, add features that predict small-model failures, measure GPU-time cost under concurrent load, compare budget-constrained routing [11], and evaluate non-stationary and neural bandit variants.</w:t>
+        <w:t xml:space="preserve">This paper presented an adaptive LLM routing framework that formulates per-query model selection as a contextual-bandit problem and uses LinUCB to balance quality, latency, and cost without modifying the candidate models. In a GSM8K pilot with Qwen3-4B, 8B, and 14B on one RTX 4090, LinUCB learned to route 98.2% of queries to the smallest model, matched its 94.8% accuracy, and cut cost per request by 69% relative to large-only routing, but it did not exceed the small-only and rule-based baselines, which are near-optimal on a single-category workload.</w:t>
       </w:r>
     </w:p>
     <w:p>
       <w:pPr>
+        <w:keepNext w:val="0"/>
+        <w:spacing w:before="0" w:after="20" w:line="240" w:lineRule="auto"/>
+        <w:ind w:firstLine="216"/>
+        <w:jc w:val="both"/>
+      </w:pPr>
+      <w:r>
+        <w:rPr>
+          <w:rFonts w:ascii="Times New Roman" w:hAnsi="Times New Roman"/>
+          <w:sz w:val="20"/>
+        </w:rPr>
+        <w:t xml:space="preserve">Future work follows from these limits. The next step is the full seven-category evaluation, which adds MMLU-style question answering, HumanEval-style coding with unit tests, and judge-scored open-ended tasks, and which makes the per-category analysis (E3) and a workload-shift run (E5) possible. Further steps are to add features that predict when the small model will fail, to measure GPU-time cost under concurrent load, to compare budget-constrained routing [11], and to evaluate non-stationary and neural bandit variants.</w:t>
+      </w:r>
+    </w:p>
+    <w:p>
+      <w:pPr>
+        <w:sectPr>
+          <w:type w:val="continuous"/>
+          <w:pgSz w:w="11909" w:h="16834"/>
+          <w:pgMar w:top="778" w:right="893" w:bottom="1440" w:left="893" w:header="288" w:footer="360" w:gutter="0"/>
+          <w:cols w:space="360" w:num="2"/>
+          <w:docGrid w:linePitch="360"/>
+        </w:sectPr>
+      </w:pPr>
+    </w:p>
+    <w:p>
+      <w:pPr>
         <w:keepNext/>
-        <w:spacing w:before="100" w:after="40"/>
+        <w:pageBreakBefore/>
+        <w:spacing w:before="0" w:after="40"/>
         <w:jc w:val="center"/>
       </w:pPr>
       <w:r>

</xml_diff>

<commit_message>
Paper: float figures so text fills every page
Figures were paragraph frames; some viewers pushed the frame to the next
page together with the text after it, leaving the bottom of page 2 empty.
Each figure (image + caption) is now a borderless floating table pinned to
the top of the page, outside the text flow, so the columns keep filling.

Co-Authored-By: Claude Opus 5.5 <noreply@anthropic.com>
Claude-Session: https://claude.ai/code/session_01AcTDn63VcP6Nv3uyNpnTqr
</commit_message>
<xml_diff>
--- a/paper/Adaptive_LLM_Model_Routing_IEEE_Paper.docx
+++ b/paper/Adaptive_LLM_Model_Routing_IEEE_Paper.docx
@@ -732,62 +732,92 @@
         <w:t>(5)</w:t>
       </w:r>
     </w:p>
-    <w:p>
-      <w:pPr>
-        <w:keepNext/>
-        <w:framePr w:w="10123" w:vSpace="160" w:wrap="notBeside" w:vAnchor="margin" w:hAnchor="margin" w:xAlign="center" w:yAlign="top"/>
-        <w:spacing w:before="0" w:after="0"/>
-        <w:jc w:val="center"/>
-      </w:pPr>
-      <w:r>
-        <w:drawing>
-          <wp:inline xmlns:a="http://schemas.openxmlformats.org/drawingml/2006/main" xmlns:pic="http://schemas.openxmlformats.org/drawingml/2006/picture">
-            <wp:extent cx="6309360" cy="3575304"/>
-            <wp:docPr id="1" name="Picture 1"/>
-            <wp:cNvGraphicFramePr>
-              <a:graphicFrameLocks noChangeAspect="1"/>
-            </wp:cNvGraphicFramePr>
-            <a:graphic>
-              <a:graphicData uri="http://schemas.openxmlformats.org/drawingml/2006/picture">
-                <pic:pic>
-                  <pic:nvPicPr>
-                    <pic:cNvPr id="0" name="fig1.png"/>
-                    <pic:cNvPicPr/>
-                  </pic:nvPicPr>
-                  <pic:blipFill>
-                    <a:blip r:embed="rId9"/>
-                    <a:stretch>
-                      <a:fillRect/>
-                    </a:stretch>
-                  </pic:blipFill>
-                  <pic:spPr>
-                    <a:xfrm>
-                      <a:off x="0" y="0"/>
-                      <a:ext cx="6309360" cy="3575304"/>
-                    </a:xfrm>
-                    <a:prstGeom prst="rect"/>
-                  </pic:spPr>
-                </pic:pic>
-              </a:graphicData>
-            </a:graphic>
-          </wp:inline>
-        </w:drawing>
-      </w:r>
-    </w:p>
-    <w:p>
-      <w:pPr>
-        <w:framePr w:w="10123" w:vSpace="160" w:wrap="notBeside" w:vAnchor="margin" w:hAnchor="margin" w:xAlign="center" w:yAlign="top"/>
-        <w:spacing w:before="40" w:after="0"/>
-        <w:jc w:val="center"/>
-      </w:pPr>
-      <w:r>
-        <w:rPr>
-          <w:rFonts w:ascii="Times New Roman" w:hAnsi="Times New Roman"/>
-          <w:sz w:val="16"/>
-        </w:rPr>
-        <w:t xml:space="preserve">Fig. 1. Proposed adaptive LLM routing loop with contextual-bandit feedback.</w:t>
-      </w:r>
-    </w:p>
+    <w:tbl>
+      <w:tblPr>
+        <w:tblpPr w:leftFromText="0" w:rightFromText="0" w:topFromText="0" w:bottomFromText="200" w:vertAnchor="margin" w:horzAnchor="margin" w:tblpXSpec="center" w:tblpYSpec="top"/>
+        <w:tblOverlap w:val="never"/>
+        <w:tblW w:type="dxa" w:w="10123"/>
+        <w:tblBorders>
+          <w:top w:val="nil"/>
+          <w:left w:val="nil"/>
+          <w:bottom w:val="nil"/>
+          <w:right w:val="nil"/>
+          <w:insideH w:val="nil"/>
+          <w:insideV w:val="nil"/>
+        </w:tblBorders>
+        <w:tblLayout w:type="fixed"/>
+        <w:tblCellMar>
+          <w:left w:w="0" w:type="dxa"/>
+          <w:right w:w="0" w:type="dxa"/>
+        </w:tblCellMar>
+      </w:tblPr>
+      <w:tblGrid>
+        <w:gridCol w:w="10123"/>
+      </w:tblGrid>
+      <w:tr>
+        <w:trPr>
+          <w:cantSplit/>
+        </w:trPr>
+        <w:tc>
+          <w:tcPr>
+            <w:tcW w:type="dxa" w:w="10123"/>
+          </w:tcPr>
+          <w:p>
+            <w:pPr>
+              <w:spacing w:before="0" w:after="0" w:line="240" w:lineRule="auto"/>
+              <w:jc w:val="center"/>
+            </w:pPr>
+            <w:r>
+              <w:drawing>
+                <wp:inline xmlns:a="http://schemas.openxmlformats.org/drawingml/2006/main" xmlns:pic="http://schemas.openxmlformats.org/drawingml/2006/picture">
+                  <wp:extent cx="6309360" cy="3575304"/>
+                  <wp:docPr id="1" name="Picture 1"/>
+                  <wp:cNvGraphicFramePr>
+                    <a:graphicFrameLocks noChangeAspect="1"/>
+                  </wp:cNvGraphicFramePr>
+                  <a:graphic>
+                    <a:graphicData uri="http://schemas.openxmlformats.org/drawingml/2006/picture">
+                      <pic:pic>
+                        <pic:nvPicPr>
+                          <pic:cNvPr id="0" name="fig1.png"/>
+                          <pic:cNvPicPr/>
+                        </pic:nvPicPr>
+                        <pic:blipFill>
+                          <a:blip r:embed="rId9"/>
+                          <a:stretch>
+                            <a:fillRect/>
+                          </a:stretch>
+                        </pic:blipFill>
+                        <pic:spPr>
+                          <a:xfrm>
+                            <a:off x="0" y="0"/>
+                            <a:ext cx="6309360" cy="3575304"/>
+                          </a:xfrm>
+                          <a:prstGeom prst="rect"/>
+                        </pic:spPr>
+                      </pic:pic>
+                    </a:graphicData>
+                  </a:graphic>
+                </wp:inline>
+              </w:drawing>
+            </w:r>
+          </w:p>
+          <w:p>
+            <w:pPr>
+              <w:spacing w:before="40" w:after="0"/>
+              <w:jc w:val="center"/>
+            </w:pPr>
+            <w:r>
+              <w:rPr>
+                <w:rFonts w:ascii="Times New Roman" w:hAnsi="Times New Roman"/>
+                <w:sz w:val="16"/>
+              </w:rPr>
+              <w:t xml:space="preserve">Fig. 1. Proposed adaptive LLM routing loop with contextual-bandit feedback.</w:t>
+            </w:r>
+          </w:p>
+        </w:tc>
+      </w:tr>
+    </w:tbl>
     <w:p>
       <w:pPr>
         <w:keepNext/>
@@ -2696,62 +2726,92 @@
         <w:t xml:space="preserve">Table II and Fig. 2 report the main comparison. Under the default weights the cost and latency penalties outweigh the small accuracy gains of the larger models, so the 4B model is the best fixed choice. LinUCB learns this: it routes 98.2% of test queries to Qwen3-4B (Table I), reaches the same mean quality (0.948), and costs 1.460 per request, 69% less than large-only routing (4.706) at 0.4 percentage points lower accuracy. Its cumulative reward of 175.6 ± 0.1 is 35.7 higher than large-only and 20.4 higher than random routing. It does not beat small-only or rule-based routing (176.0); its residual exploration of the larger models (1.8% of queries) costs 0.4 reward units, i.e., 0.002 per query. The rule-based policy coincides with small-only because the pilot has a single category whose best development model is Qwen3-4B. Regret against the per-query oracle stays at 8.9 even for the best fixed policy because, with binary quality, the oracle also knows which model happened to be right on each problem. RQ2 is therefore answered negatively for this workload: LinUCB matches but does not exceed the best fixed policy, which is expected when one model dominates and no context separates the queries.</w:t>
       </w:r>
     </w:p>
-    <w:p>
-      <w:pPr>
-        <w:keepNext/>
-        <w:framePr w:w="10123" w:vSpace="160" w:wrap="notBeside" w:vAnchor="margin" w:hAnchor="margin" w:xAlign="center" w:yAlign="top"/>
-        <w:spacing w:before="0" w:after="0"/>
-        <w:jc w:val="center"/>
-      </w:pPr>
-      <w:r>
-        <w:drawing>
-          <wp:inline xmlns:a="http://schemas.openxmlformats.org/drawingml/2006/main" xmlns:pic="http://schemas.openxmlformats.org/drawingml/2006/picture">
-            <wp:extent cx="6309360" cy="3028493"/>
-            <wp:docPr id="3" name="Picture 3"/>
-            <wp:cNvGraphicFramePr>
-              <a:graphicFrameLocks noChangeAspect="1"/>
-            </wp:cNvGraphicFramePr>
-            <a:graphic>
-              <a:graphicData uri="http://schemas.openxmlformats.org/drawingml/2006/picture">
-                <pic:pic>
-                  <pic:nvPicPr>
-                    <pic:cNvPr id="0" name="fig3.png"/>
-                    <pic:cNvPicPr/>
-                  </pic:nvPicPr>
-                  <pic:blipFill>
-                    <a:blip r:embed="rId11"/>
-                    <a:stretch>
-                      <a:fillRect/>
-                    </a:stretch>
-                  </pic:blipFill>
-                  <pic:spPr>
-                    <a:xfrm>
-                      <a:off x="0" y="0"/>
-                      <a:ext cx="6309360" cy="3028493"/>
-                    </a:xfrm>
-                    <a:prstGeom prst="rect"/>
-                  </pic:spPr>
-                </pic:pic>
-              </a:graphicData>
-            </a:graphic>
-          </wp:inline>
-        </w:drawing>
-      </w:r>
-    </w:p>
-    <w:p>
-      <w:pPr>
-        <w:framePr w:w="10123" w:vSpace="160" w:wrap="notBeside" w:vAnchor="margin" w:hAnchor="margin" w:xAlign="center" w:yAlign="top"/>
-        <w:spacing w:before="40" w:after="0"/>
-        <w:jc w:val="center"/>
-      </w:pPr>
-      <w:r>
-        <w:rPr>
-          <w:rFonts w:ascii="Times New Roman" w:hAnsi="Times New Roman"/>
-          <w:sz w:val="16"/>
-        </w:rPr>
-        <w:t xml:space="preserve">Fig. 2. GSM8K pilot on the held-out split: (a) cumulative reward of each policy over the 210-query stream; (b) accuracy versus cost per request (error bars: SD over 5 seeds).</w:t>
-      </w:r>
-    </w:p>
+    <w:tbl>
+      <w:tblPr>
+        <w:tblpPr w:leftFromText="0" w:rightFromText="0" w:topFromText="0" w:bottomFromText="200" w:vertAnchor="margin" w:horzAnchor="margin" w:tblpXSpec="center" w:tblpYSpec="top"/>
+        <w:tblOverlap w:val="never"/>
+        <w:tblW w:type="dxa" w:w="10123"/>
+        <w:tblBorders>
+          <w:top w:val="nil"/>
+          <w:left w:val="nil"/>
+          <w:bottom w:val="nil"/>
+          <w:right w:val="nil"/>
+          <w:insideH w:val="nil"/>
+          <w:insideV w:val="nil"/>
+        </w:tblBorders>
+        <w:tblLayout w:type="fixed"/>
+        <w:tblCellMar>
+          <w:left w:w="0" w:type="dxa"/>
+          <w:right w:w="0" w:type="dxa"/>
+        </w:tblCellMar>
+      </w:tblPr>
+      <w:tblGrid>
+        <w:gridCol w:w="10123"/>
+      </w:tblGrid>
+      <w:tr>
+        <w:trPr>
+          <w:cantSplit/>
+        </w:trPr>
+        <w:tc>
+          <w:tcPr>
+            <w:tcW w:type="dxa" w:w="10123"/>
+          </w:tcPr>
+          <w:p>
+            <w:pPr>
+              <w:spacing w:before="0" w:after="0" w:line="240" w:lineRule="auto"/>
+              <w:jc w:val="center"/>
+            </w:pPr>
+            <w:r>
+              <w:drawing>
+                <wp:inline xmlns:a="http://schemas.openxmlformats.org/drawingml/2006/main" xmlns:pic="http://schemas.openxmlformats.org/drawingml/2006/picture">
+                  <wp:extent cx="6309360" cy="3028493"/>
+                  <wp:docPr id="3" name="Picture 3"/>
+                  <wp:cNvGraphicFramePr>
+                    <a:graphicFrameLocks noChangeAspect="1"/>
+                  </wp:cNvGraphicFramePr>
+                  <a:graphic>
+                    <a:graphicData uri="http://schemas.openxmlformats.org/drawingml/2006/picture">
+                      <pic:pic>
+                        <pic:nvPicPr>
+                          <pic:cNvPr id="0" name="fig3.png"/>
+                          <pic:cNvPicPr/>
+                        </pic:nvPicPr>
+                        <pic:blipFill>
+                          <a:blip r:embed="rId11"/>
+                          <a:stretch>
+                            <a:fillRect/>
+                          </a:stretch>
+                        </pic:blipFill>
+                        <pic:spPr>
+                          <a:xfrm>
+                            <a:off x="0" y="0"/>
+                            <a:ext cx="6309360" cy="3028493"/>
+                          </a:xfrm>
+                          <a:prstGeom prst="rect"/>
+                        </pic:spPr>
+                      </pic:pic>
+                    </a:graphicData>
+                  </a:graphic>
+                </wp:inline>
+              </w:drawing>
+            </w:r>
+          </w:p>
+          <w:p>
+            <w:pPr>
+              <w:spacing w:before="40" w:after="0"/>
+              <w:jc w:val="center"/>
+            </w:pPr>
+            <w:r>
+              <w:rPr>
+                <w:rFonts w:ascii="Times New Roman" w:hAnsi="Times New Roman"/>
+                <w:sz w:val="16"/>
+              </w:rPr>
+              <w:t xml:space="preserve">Fig. 2. GSM8K pilot on the held-out split: (a) cumulative reward of each policy over the 210-query stream; (b) accuracy versus cost per request (error bars: SD over 5 seeds).</w:t>
+            </w:r>
+          </w:p>
+        </w:tc>
+      </w:tr>
+    </w:tbl>
     <w:p>
       <w:pPr>
         <w:keepNext/>

</xml_diff>

<commit_message>
Paper: one-column inline figures and more pilot analysis so pages fill
Floating full-width figures still left page 2 half empty in some viewers.
Both figures are redrawn for one column and placed inline, like the tables.
The space this frees is filled with real content from the code and the
logged outcomes: the prompt template and numeric scoring rule, exact
feature definitions, the pilot run procedure, why the ablation is flat
(the reasoning cue fires on all 300 prompts, category and difficulty are
constant), oracle headroom (184.9 reward, 99.5% accuracy at 1.54/request),
LinUCB warm-up counts and score decomposition, the accuracy gain a larger
model would need to break even (10.7 and 17.7 points), and a replay caveat.

Co-Authored-By: Claude Opus 5.5 <noreply@anthropic.com>
Claude-Session: https://claude.ai/code/session_01AcTDn63VcP6Nv3uyNpnTqr
</commit_message>
<xml_diff>
--- a/paper/Adaptive_LLM_Model_Routing_IEEE_Paper.docx
+++ b/paper/Adaptive_LLM_Model_Routing_IEEE_Paper.docx
@@ -549,7 +549,7 @@
           <w:rFonts w:ascii="Times New Roman" w:hAnsi="Times New Roman"/>
           <w:sz w:val="20"/>
         </w:rPr>
-        <w:t xml:space="preserve">The full design covers seven categories with a quality signal for each: general question answering (exact match, e.g., MMLU [17]), reasoning and multi-step problems (final-answer match, e.g., GSM8K [18]), coding (unit tests, e.g., HumanEval [19]), and summarization, writing, information extraction, and instruction following (rubric scores from a validated judge, field-level match, or constraint checks). The pilot reported here covers the reasoning category only: 300 problems sampled with seed 0 from the official GSM8K test split [18], divided into 90 development and 210 held-out test queries. Quality is 1 when the final numeric answer matches the reference and 0 otherwise; the scorer reproduces all 1,319 GSM8K reference answers. Every query is run on every model (900 outcomes), and each outcome logs the response, latency, input and output tokens, cost, failure status, and quality.</w:t>
+        <w:t xml:space="preserve">The full design covers seven categories with a quality signal for each: general question answering (exact match, e.g., MMLU [17]), reasoning and multi-step problems (final-answer match, e.g., GSM8K [18]), coding (unit tests, e.g., HumanEval [19]), and summarization, writing, information extraction, and instruction following (rubric scores from a validated judge, field-level match, or constraint checks). The pilot reported here covers the reasoning category only: 300 problems sampled with seed 0 from the official GSM8K test split [18], divided into 90 development and 210 held-out test queries. Every problem uses the same prompt: solve the word problem, reason step by step, and give the final answer on the last line in the form '#### &lt;number&gt;'. The numeric scorer takes the number after the last '####' marker, or the last number in the response if the marker is missing, removes thousands separators, and accepts it when it matches the reference within a relative tolerance of 10⁻⁶. Quality is 1 for a match and 0 otherwise; applied to the reference solutions themselves, the scorer reproduces all 1,319 GSM8K test answers. Every query is run on every model (900 outcomes), and each outcome logs the response, latency, input and output tokens, cost, failure status, and quality.</w:t>
       </w:r>
     </w:p>
     <w:p>
@@ -611,7 +611,7 @@
           <w:rFonts w:ascii="Times New Roman" w:hAnsi="Times New Roman"/>
           <w:sz w:val="20"/>
         </w:rPr>
-        <w:t xml:space="preserve">The context x_t has d = 12 entries computed before generation: log prompt length, a one-hot indicator over the seven task categories, a code-content indicator, a reasoning-cue indicator, a difficulty estimate, and a constant bias. A low-dimensional sentence embedding [23] is an optional extension. The contribution of each group is measured by ablation (E4).</w:t>
+        <w:t xml:space="preserve">The context x_t has d = 12 entries computed before generation. The length feature is log(1 + n)/log(1 + 2048), clipped to 1, where n approximates the prompt's token count as 1.3 times its word count. Seven entries form a one-hot indicator of the task category. Two binary cues come from regular expressions: a code cue (code fences, function or class definitions, imports, stack traces) and a reasoning cue (phrases such as 'step by step', 'solve', 'how many', 'prove', or 'explain'). The difficulty entry is a per-category prior, one minus the smallest model's mean development accuracy in that category. A constant bias completes the vector. A low-dimensional sentence embedding [23] is an optional extension. The contribution of each group is measured by ablation (E4).</w:t>
       </w:r>
     </w:p>
     <w:p>
@@ -732,92 +732,60 @@
         <w:t>(5)</w:t>
       </w:r>
     </w:p>
-    <w:tbl>
-      <w:tblPr>
-        <w:tblpPr w:leftFromText="0" w:rightFromText="0" w:topFromText="0" w:bottomFromText="200" w:vertAnchor="margin" w:horzAnchor="margin" w:tblpXSpec="center" w:tblpYSpec="top"/>
-        <w:tblOverlap w:val="never"/>
-        <w:tblW w:type="dxa" w:w="10123"/>
-        <w:tblBorders>
-          <w:top w:val="nil"/>
-          <w:left w:val="nil"/>
-          <w:bottom w:val="nil"/>
-          <w:right w:val="nil"/>
-          <w:insideH w:val="nil"/>
-          <w:insideV w:val="nil"/>
-        </w:tblBorders>
-        <w:tblLayout w:type="fixed"/>
-        <w:tblCellMar>
-          <w:left w:w="0" w:type="dxa"/>
-          <w:right w:w="0" w:type="dxa"/>
-        </w:tblCellMar>
-      </w:tblPr>
-      <w:tblGrid>
-        <w:gridCol w:w="10123"/>
-      </w:tblGrid>
-      <w:tr>
-        <w:trPr>
-          <w:cantSplit/>
-        </w:trPr>
-        <w:tc>
-          <w:tcPr>
-            <w:tcW w:type="dxa" w:w="10123"/>
-          </w:tcPr>
-          <w:p>
-            <w:pPr>
-              <w:spacing w:before="0" w:after="0" w:line="240" w:lineRule="auto"/>
-              <w:jc w:val="center"/>
-            </w:pPr>
-            <w:r>
-              <w:drawing>
-                <wp:inline xmlns:a="http://schemas.openxmlformats.org/drawingml/2006/main" xmlns:pic="http://schemas.openxmlformats.org/drawingml/2006/picture">
-                  <wp:extent cx="6309360" cy="3575304"/>
-                  <wp:docPr id="1" name="Picture 1"/>
-                  <wp:cNvGraphicFramePr>
-                    <a:graphicFrameLocks noChangeAspect="1"/>
-                  </wp:cNvGraphicFramePr>
-                  <a:graphic>
-                    <a:graphicData uri="http://schemas.openxmlformats.org/drawingml/2006/picture">
-                      <pic:pic>
-                        <pic:nvPicPr>
-                          <pic:cNvPr id="0" name="fig1.png"/>
-                          <pic:cNvPicPr/>
-                        </pic:nvPicPr>
-                        <pic:blipFill>
-                          <a:blip r:embed="rId9"/>
-                          <a:stretch>
-                            <a:fillRect/>
-                          </a:stretch>
-                        </pic:blipFill>
-                        <pic:spPr>
-                          <a:xfrm>
-                            <a:off x="0" y="0"/>
-                            <a:ext cx="6309360" cy="3575304"/>
-                          </a:xfrm>
-                          <a:prstGeom prst="rect"/>
-                        </pic:spPr>
-                      </pic:pic>
-                    </a:graphicData>
-                  </a:graphic>
-                </wp:inline>
-              </w:drawing>
-            </w:r>
-          </w:p>
-          <w:p>
-            <w:pPr>
-              <w:spacing w:before="40" w:after="0"/>
-              <w:jc w:val="center"/>
-            </w:pPr>
-            <w:r>
-              <w:rPr>
-                <w:rFonts w:ascii="Times New Roman" w:hAnsi="Times New Roman"/>
-                <w:sz w:val="16"/>
-              </w:rPr>
-              <w:t xml:space="preserve">Fig. 1. Proposed adaptive LLM routing loop with contextual-bandit feedback.</w:t>
-            </w:r>
-          </w:p>
-        </w:tc>
-      </w:tr>
-    </w:tbl>
+    <w:p>
+      <w:pPr>
+        <w:keepNext/>
+        <w:spacing w:before="80" w:after="0"/>
+        <w:jc w:val="center"/>
+      </w:pPr>
+      <w:r>
+        <w:drawing>
+          <wp:inline xmlns:a="http://schemas.openxmlformats.org/drawingml/2006/main" xmlns:pic="http://schemas.openxmlformats.org/drawingml/2006/picture">
+            <wp:extent cx="3063240" cy="3461461"/>
+            <wp:docPr id="1" name="Picture 1"/>
+            <wp:cNvGraphicFramePr>
+              <a:graphicFrameLocks noChangeAspect="1"/>
+            </wp:cNvGraphicFramePr>
+            <a:graphic>
+              <a:graphicData uri="http://schemas.openxmlformats.org/drawingml/2006/picture">
+                <pic:pic>
+                  <pic:nvPicPr>
+                    <pic:cNvPr id="0" name="fig1.png"/>
+                    <pic:cNvPicPr/>
+                  </pic:nvPicPr>
+                  <pic:blipFill>
+                    <a:blip r:embed="rId9"/>
+                    <a:stretch>
+                      <a:fillRect/>
+                    </a:stretch>
+                  </pic:blipFill>
+                  <pic:spPr>
+                    <a:xfrm>
+                      <a:off x="0" y="0"/>
+                      <a:ext cx="3063240" cy="3461461"/>
+                    </a:xfrm>
+                    <a:prstGeom prst="rect"/>
+                  </pic:spPr>
+                </pic:pic>
+              </a:graphicData>
+            </a:graphic>
+          </wp:inline>
+        </w:drawing>
+      </w:r>
+    </w:p>
+    <w:p>
+      <w:pPr>
+        <w:spacing w:before="40" w:after="80"/>
+        <w:jc w:val="center"/>
+      </w:pPr>
+      <w:r>
+        <w:rPr>
+          <w:rFonts w:ascii="Times New Roman" w:hAnsi="Times New Roman"/>
+          <w:sz w:val="16"/>
+        </w:rPr>
+        <w:t xml:space="preserve">Fig. 1. Proposed adaptive LLM routing loop with contextual-bandit feedback (dashed: the updated statistics drive future routing decisions).</w:t>
+      </w:r>
+    </w:p>
     <w:p>
       <w:pPr>
         <w:keepNext/>
@@ -927,6 +895,21 @@
           <w:sz w:val="20"/>
         </w:rPr>
         <w:t xml:space="preserve">Because every query is run on every model, each policy is replayed on the same query stream and sees only the logged outcome of the model it selects; this also makes the oracle in Eq. (2) computable [15]. Learning policies are first warmed up on the 90 development queries (unscored) and then evaluated on the 210 held-out queries. Each policy is run with five seeds (0-4) that change the query order and the random choices, and results are reported as mean ± standard deviation across seeds [24]. The main comparison uses α = 1.0 and λ = 1.0. Metrics are mean quality, mean and p95 latency, cost per request, failure rate, cumulative reward, regret, and the model-selection distribution. The sweeps vary one factor at a time with α = 0.25 unless stated: reward weights (E2), feature groups (E4), the exploration coefficient α (E6), and three bandit variants (linear Thompson sampling, ε-greedy ridge regression with ε = 0.1, and sliding-window LinUCB with a window of 200). Workload shift (E5) and multi-category analysis (E3) require more than one task category and are left to the full study.</w:t>
+      </w:r>
+    </w:p>
+    <w:p>
+      <w:pPr>
+        <w:keepNext w:val="0"/>
+        <w:spacing w:before="0" w:after="20" w:line="240" w:lineRule="auto"/>
+        <w:ind w:firstLine="216"/>
+        <w:jc w:val="both"/>
+      </w:pPr>
+      <w:r>
+        <w:rPr>
+          <w:rFonts w:ascii="Times New Roman" w:hAnsi="Times New Roman"/>
+          <w:sz w:val="20"/>
+        </w:rPr>
+        <w:t xml:space="preserve">The pilot is run by one script. For each model in turn it starts a vLLM server with a 4,096-token context and 90% GPU-memory utilization, polls the server until it answers, sends all 300 problems through the collector, and stops the server so that the next model has the whole GPU. The collector writes one record per query-model pair and skips pairs that are already logged, so an interrupted run resumes where it stopped. When all three models are done, the script runs the replay comparison with seeds 0-4 and writes the tables and reward traces used in Section VI.</w:t>
       </w:r>
     </w:p>
     <w:p>
@@ -2726,92 +2709,60 @@
         <w:t xml:space="preserve">Table II and Fig. 2 report the main comparison. Under the default weights the cost and latency penalties outweigh the small accuracy gains of the larger models, so the 4B model is the best fixed choice. LinUCB learns this: it routes 98.2% of test queries to Qwen3-4B (Table I), reaches the same mean quality (0.948), and costs 1.460 per request, 69% less than large-only routing (4.706) at 0.4 percentage points lower accuracy. Its cumulative reward of 175.6 ± 0.1 is 35.7 higher than large-only and 20.4 higher than random routing. It does not beat small-only or rule-based routing (176.0); its residual exploration of the larger models (1.8% of queries) costs 0.4 reward units, i.e., 0.002 per query. The rule-based policy coincides with small-only because the pilot has a single category whose best development model is Qwen3-4B. Regret against the per-query oracle stays at 8.9 even for the best fixed policy because, with binary quality, the oracle also knows which model happened to be right on each problem. RQ2 is therefore answered negatively for this workload: LinUCB matches but does not exceed the best fixed policy, which is expected when one model dominates and no context separates the queries.</w:t>
       </w:r>
     </w:p>
-    <w:tbl>
-      <w:tblPr>
-        <w:tblpPr w:leftFromText="0" w:rightFromText="0" w:topFromText="0" w:bottomFromText="200" w:vertAnchor="margin" w:horzAnchor="margin" w:tblpXSpec="center" w:tblpYSpec="top"/>
-        <w:tblOverlap w:val="never"/>
-        <w:tblW w:type="dxa" w:w="10123"/>
-        <w:tblBorders>
-          <w:top w:val="nil"/>
-          <w:left w:val="nil"/>
-          <w:bottom w:val="nil"/>
-          <w:right w:val="nil"/>
-          <w:insideH w:val="nil"/>
-          <w:insideV w:val="nil"/>
-        </w:tblBorders>
-        <w:tblLayout w:type="fixed"/>
-        <w:tblCellMar>
-          <w:left w:w="0" w:type="dxa"/>
-          <w:right w:w="0" w:type="dxa"/>
-        </w:tblCellMar>
-      </w:tblPr>
-      <w:tblGrid>
-        <w:gridCol w:w="10123"/>
-      </w:tblGrid>
-      <w:tr>
-        <w:trPr>
-          <w:cantSplit/>
-        </w:trPr>
-        <w:tc>
-          <w:tcPr>
-            <w:tcW w:type="dxa" w:w="10123"/>
-          </w:tcPr>
-          <w:p>
-            <w:pPr>
-              <w:spacing w:before="0" w:after="0" w:line="240" w:lineRule="auto"/>
-              <w:jc w:val="center"/>
-            </w:pPr>
-            <w:r>
-              <w:drawing>
-                <wp:inline xmlns:a="http://schemas.openxmlformats.org/drawingml/2006/main" xmlns:pic="http://schemas.openxmlformats.org/drawingml/2006/picture">
-                  <wp:extent cx="6309360" cy="3028493"/>
-                  <wp:docPr id="3" name="Picture 3"/>
-                  <wp:cNvGraphicFramePr>
-                    <a:graphicFrameLocks noChangeAspect="1"/>
-                  </wp:cNvGraphicFramePr>
-                  <a:graphic>
-                    <a:graphicData uri="http://schemas.openxmlformats.org/drawingml/2006/picture">
-                      <pic:pic>
-                        <pic:nvPicPr>
-                          <pic:cNvPr id="0" name="fig3.png"/>
-                          <pic:cNvPicPr/>
-                        </pic:nvPicPr>
-                        <pic:blipFill>
-                          <a:blip r:embed="rId11"/>
-                          <a:stretch>
-                            <a:fillRect/>
-                          </a:stretch>
-                        </pic:blipFill>
-                        <pic:spPr>
-                          <a:xfrm>
-                            <a:off x="0" y="0"/>
-                            <a:ext cx="6309360" cy="3028493"/>
-                          </a:xfrm>
-                          <a:prstGeom prst="rect"/>
-                        </pic:spPr>
-                      </pic:pic>
-                    </a:graphicData>
-                  </a:graphic>
-                </wp:inline>
-              </w:drawing>
-            </w:r>
-          </w:p>
-          <w:p>
-            <w:pPr>
-              <w:spacing w:before="40" w:after="0"/>
-              <w:jc w:val="center"/>
-            </w:pPr>
-            <w:r>
-              <w:rPr>
-                <w:rFonts w:ascii="Times New Roman" w:hAnsi="Times New Roman"/>
-                <w:sz w:val="16"/>
-              </w:rPr>
-              <w:t xml:space="preserve">Fig. 2. GSM8K pilot on the held-out split: (a) cumulative reward of each policy over the 210-query stream; (b) accuracy versus cost per request (error bars: SD over 5 seeds).</w:t>
-            </w:r>
-          </w:p>
-        </w:tc>
-      </w:tr>
-    </w:tbl>
+    <w:p>
+      <w:pPr>
+        <w:keepNext/>
+        <w:spacing w:before="80" w:after="0"/>
+        <w:jc w:val="center"/>
+      </w:pPr>
+      <w:r>
+        <w:drawing>
+          <wp:inline xmlns:a="http://schemas.openxmlformats.org/drawingml/2006/main" xmlns:pic="http://schemas.openxmlformats.org/drawingml/2006/picture">
+            <wp:extent cx="3063240" cy="3798418"/>
+            <wp:docPr id="3" name="Picture 3"/>
+            <wp:cNvGraphicFramePr>
+              <a:graphicFrameLocks noChangeAspect="1"/>
+            </wp:cNvGraphicFramePr>
+            <a:graphic>
+              <a:graphicData uri="http://schemas.openxmlformats.org/drawingml/2006/picture">
+                <pic:pic>
+                  <pic:nvPicPr>
+                    <pic:cNvPr id="0" name="fig3.png"/>
+                    <pic:cNvPicPr/>
+                  </pic:nvPicPr>
+                  <pic:blipFill>
+                    <a:blip r:embed="rId11"/>
+                    <a:stretch>
+                      <a:fillRect/>
+                    </a:stretch>
+                  </pic:blipFill>
+                  <pic:spPr>
+                    <a:xfrm>
+                      <a:off x="0" y="0"/>
+                      <a:ext cx="3063240" cy="3798418"/>
+                    </a:xfrm>
+                    <a:prstGeom prst="rect"/>
+                  </pic:spPr>
+                </pic:pic>
+              </a:graphicData>
+            </a:graphic>
+          </wp:inline>
+        </w:drawing>
+      </w:r>
+    </w:p>
+    <w:p>
+      <w:pPr>
+        <w:spacing w:before="40" w:after="80"/>
+        <w:jc w:val="center"/>
+      </w:pPr>
+      <w:r>
+        <w:rPr>
+          <w:rFonts w:ascii="Times New Roman" w:hAnsi="Times New Roman"/>
+          <w:sz w:val="16"/>
+        </w:rPr>
+        <w:t xml:space="preserve">Fig. 2. GSM8K pilot on the held-out split: (a) cumulative reward of each policy over the 210-query stream; (b) accuracy versus cost per request (error bars: SD over 5 seeds).</w:t>
+      </w:r>
+    </w:p>
     <w:p>
       <w:pPr>
         <w:keepNext/>
@@ -4980,7 +4931,53 @@
           <w:rFonts w:ascii="Times New Roman" w:hAnsi="Times New Roman"/>
           <w:sz w:val="20"/>
         </w:rPr>
-        <w:t xml:space="preserve">Table III reports the sweeps. Reward weights (E2, RQ3): with no cost or latency penalty the best fixed policy is large-only (mean reward 0.952), yet LinUCB still selects only Qwen3-4B and reaches 0.948: initial score ties are broken toward the first model, and once Qwen3-4B has accumulated positive reward during warm-up the bonus at α = 0.25 is too small to try the larger models. For every non-zero weight setting small-only is the best fixed policy, and LinUCB matches it except at β_c = 0.6, γ_l = 0.4, where it shifted 20% of queries to Qwen3-8B and lost 0.042 per query. Exploration (E6): α ≤ 0.25 is equivalent to always choosing the 4B model; larger α buys at most 0.5 percentage points of accuracy (0.953 at α = 2.0) at 37% higher cost and lower reward, and the effect is not monotone (α = 0.5 is worse than α = 1.0), reflecting seed-to-seed variation on a small test set. Feature ablation (E4, RQ1): removing length, category, cue, or difficulty features, or keeping only the bias term, leaves every metric unchanged (mean reward 0.838), so on a single-category workload the features carry no routing signal. Bandit variants: sliding-window LinUCB equals LinUCB on this stationary stream, while linear Thompson sampling and ε-greedy explore more and lose 0.015 and 0.028 mean reward.</w:t>
+        <w:t xml:space="preserve">Table III reports the sweeps. Reward weights (E2, RQ3): with no cost or latency penalty the best fixed policy is large-only (mean reward 0.952), yet LinUCB still selects only Qwen3-4B and reaches 0.948: initial score ties are broken toward the first model, and once Qwen3-4B has accumulated positive reward during warm-up the bonus at α = 0.25 is too small to try the larger models. For every non-zero weight setting small-only is the best fixed policy, and LinUCB matches it except at β_c = 0.6, γ_l = 0.4, where it shifted 20% of queries to Qwen3-8B and lost 0.042 per query. Exploration (E6): α ≤ 0.25 is equivalent to always choosing the 4B model; larger α buys at most 0.5 percentage points of accuracy (0.953 at α = 2.0) at 37% higher cost and lower reward, and the effect is not monotone (α = 0.5 is worse than α = 1.0), reflecting seed-to-seed variation on a small test set. Feature ablation (E4, RQ1): removing length, category, cue, or difficulty features, or keeping only the bias term, leaves every metric unchanged (mean reward 0.838), so on a single-category workload the features carry no routing signal. The reason is visible in the inputs: the shared prompt template contains 'solve' and 'step by step', so the reasoning cue is 1 for all 300 prompts; the code cue fires on only 5; the category one-hot is constant; and the difficulty prior is a single value (0.133, from Qwen3-4B's 86.7% development accuracy). Prompt length is the only feature that varies, and it does not separate the problems the small model gets wrong. Bandit variants: sliding-window LinUCB equals LinUCB on this stationary stream, while linear Thompson sampling and ε-greedy explore more and lose 0.015 and 0.028 mean reward.</w:t>
+      </w:r>
+    </w:p>
+    <w:p>
+      <w:pPr>
+        <w:keepNext/>
+        <w:spacing w:before="60" w:after="20"/>
+        <w:jc w:val="left"/>
+      </w:pPr>
+      <w:r>
+        <w:rPr>
+          <w:rFonts w:ascii="Times New Roman" w:hAnsi="Times New Roman"/>
+          <w:b w:val="0"/>
+          <w:i/>
+          <w:sz w:val="20"/>
+        </w:rPr>
+        <w:t xml:space="preserve">D. Headroom and Learning Dynamics</w:t>
+      </w:r>
+    </w:p>
+    <w:p>
+      <w:pPr>
+        <w:keepNext w:val="0"/>
+        <w:spacing w:before="0" w:after="20" w:line="240" w:lineRule="auto"/>
+        <w:ind w:firstLine="216"/>
+        <w:jc w:val="both"/>
+      </w:pPr>
+      <w:r>
+        <w:rPr>
+          <w:rFonts w:ascii="Times New Roman" w:hAnsi="Times New Roman"/>
+          <w:sz w:val="20"/>
+        </w:rPr>
+        <w:t xml:space="preserve">How much could any router gain on this data? The per-query oracle, which picks the model with the highest logged reward for each test problem, reaches a cumulative reward of 184.9, only 8.9 (5.1%) above small-only routing. It does so by sending 195 problems to Qwen3-4B, 13 to Qwen3-8B, and 2 to Qwen3-14B, which yields 99.5% accuracy at a cost of 1.54 per request. A cost-first oracle that calls the cheapest model that answers correctly reaches the same 99.5% at 1.51 per request, using Qwen3-4B for 200 problems, Qwen3-8B for 9, and Qwen3-14B for 1. The gap between 94.8% and 99.5% accuracy is therefore real and cheap to close in hindsight, but closing it requires knowing in advance which 10 problems the small model will miss.</w:t>
+      </w:r>
+    </w:p>
+    <w:p>
+      <w:pPr>
+        <w:keepNext w:val="0"/>
+        <w:spacing w:before="0" w:after="20" w:line="240" w:lineRule="auto"/>
+        <w:ind w:firstLine="216"/>
+        <w:jc w:val="both"/>
+      </w:pPr>
+      <w:r>
+        <w:rPr>
+          <w:rFonts w:ascii="Times New Roman" w:hAnsi="Times New Roman"/>
+          <w:sz w:val="20"/>
+        </w:rPr>
+        <w:t xml:space="preserve">The warm-up phase shows how LinUCB arrives at its choice. With α = 1.0, the router spent the 90 development queries on Qwen3-4B 49 times, Qwen3-14B 27 times, and Qwen3-8B 14 times, while the mean development rewards of the three models were 0.748, 0.692, and 0.644 for the 4B, 8B, and 14B models. Averaged over the test queries, the learned estimate θ_aᵀx is 0.758 for Qwen3-4B against 0.605 and 0.633 for the larger models, and the exploration bonuses are 0.166, 0.284, and 0.213. The bonus of the less-tried models narrows but does not close the gap in estimated reward, so the 4B model wins almost every comparison, and the remaining 1.8% of larger-model calls are the bonus occasionally tipping a close decision.</w:t>
       </w:r>
     </w:p>
     <w:p>
@@ -5058,6 +5055,36 @@
           <w:sz w:val="20"/>
         </w:rPr>
         <w:t xml:space="preserve">The pilot supports two conclusions. First, the reward definition, not the algorithm, decides the outcome: when larger models add one or two correct answers per 210 problems at two to three times the cost, any reasonable cost weight makes the small model the right choice, and a learned router can at best match it. Second, LinUCB found that choice from 90 warm-up queries without hand-written rules, and its cost of exploration was small (0.002 reward per query). The situations in which per-query routing should pay off, namely several task categories with different best models and features that predict when the small model fails, are absent from this pilot by construction.</w:t>
+      </w:r>
+    </w:p>
+    <w:p>
+      <w:pPr>
+        <w:keepNext w:val="0"/>
+        <w:spacing w:before="0" w:after="20" w:line="240" w:lineRule="auto"/>
+        <w:ind w:firstLine="216"/>
+        <w:jc w:val="both"/>
+      </w:pPr>
+      <w:r>
+        <w:rPr>
+          <w:rFonts w:ascii="Times New Roman" w:hAnsi="Times New Roman"/>
+          <w:sz w:val="20"/>
+        </w:rPr>
+        <w:t xml:space="preserve">The size of the required accuracy gain makes this concrete. Because quality enters the reward with weight 1, the mean reward of a model equals its accuracy minus its mean cost and latency penalty. On the held-out split that penalty is 0.110 for Qwen3-4B, 0.216 for Qwen3-8B, and 0.286 for Qwen3-14B. A larger model therefore breaks even with the small one only if it is more accurate by the difference: 10.7 percentage points for Qwen3-8B and 17.7 points for Qwen3-14B. The measured gains are 0.9 and 0.4 points. On harder categories such as multi-step coding, where small models fail far more often, gaps of this size are plausible, which is why the full evaluation is needed before judging the method.</w:t>
+      </w:r>
+    </w:p>
+    <w:p>
+      <w:pPr>
+        <w:keepNext w:val="0"/>
+        <w:spacing w:before="0" w:after="20" w:line="240" w:lineRule="auto"/>
+        <w:ind w:firstLine="216"/>
+        <w:jc w:val="both"/>
+      </w:pPr>
+      <w:r>
+        <w:rPr>
+          <w:rFonts w:ascii="Times New Roman" w:hAnsi="Times New Roman"/>
+          <w:sz w:val="20"/>
+        </w:rPr>
+        <w:t xml:space="preserve">The replay protocol also deserves a caveat. Because decoding is greedy with a fixed seed, a model's answer to a problem is the same whether it is called during collection or during an online run, so replaying the logged outcome reproduces the quality an online router would see. Latency is different: it depends on server load and on which other requests are in flight, so the replayed latencies describe a lightly loaded single-GPU server rather than a production deployment.</w:t>
       </w:r>
     </w:p>
     <w:p>

</xml_diff>

<commit_message>
Paper: keep the author edits from main; remove Word lock file
The 'edit' commit on main changed the author block in the .docx (Sanjay.S,
Mr. Yuvaraj G; email and title lines removed). Apply the same changes to
the generated document so the rebuild keeps them, and delete the
~$aptive...docx Word owner/lock file that was committed with it.

Co-Authored-By: Claude Opus 5.5 <noreply@anthropic.com>
Claude-Session: https://claude.ai/code/session_01AcTDn63VcP6Nv3uyNpnTqr
</commit_message>
<xml_diff>
--- a/paper/Adaptive_LLM_Model_Routing_IEEE_Paper.docx
+++ b/paper/Adaptive_LLM_Model_Routing_IEEE_Paper.docx
@@ -52,7 +52,7 @@
                 <w:i w:val="0"/>
                 <w:sz w:val="21"/>
               </w:rPr>
-              <w:t>Rishi Vel. A</w:t>
+              <w:t xml:space="preserve">Sanjay.S</w:t>
             </w:r>
           </w:p>
           <w:p>
@@ -115,21 +115,6 @@
               <w:t>Chennai, Tamil Nadu, India</w:t>
             </w:r>
           </w:p>
-          <w:p>
-            <w:pPr>
-              <w:spacing w:before="0" w:after="0" w:line="240" w:lineRule="auto"/>
-              <w:jc w:val="center"/>
-            </w:pPr>
-            <w:r>
-              <w:rPr>
-                <w:rFonts w:ascii="Times New Roman" w:hAnsi="Times New Roman"/>
-                <w:b w:val="0"/>
-                <w:i w:val="0"/>
-                <w:sz w:val="16"/>
-              </w:rPr>
-              <w:t>sec22cj027@sairamtap.edu.in</w:t>
-            </w:r>
-          </w:p>
         </w:tc>
         <w:tc>
           <w:tcPr>
@@ -156,22 +141,7 @@
                 <w:i w:val="0"/>
                 <w:sz w:val="21"/>
               </w:rPr>
-              <w:t>Mrs. Kayalvizhi C</w:t>
-            </w:r>
-          </w:p>
-          <w:p>
-            <w:pPr>
-              <w:spacing w:before="0" w:after="0" w:line="240" w:lineRule="auto"/>
-              <w:jc w:val="center"/>
-            </w:pPr>
-            <w:r>
-              <w:rPr>
-                <w:rFonts w:ascii="Times New Roman" w:hAnsi="Times New Roman"/>
-                <w:b w:val="0"/>
-                <w:i/>
-                <w:sz w:val="16"/>
-              </w:rPr>
-              <w:t>Assistant Professor</w:t>
+              <w:t xml:space="preserve">Mr. Yuvaraj G</w:t>
             </w:r>
           </w:p>
           <w:p>

</xml_diff>

<commit_message>
Paper: fill the gap on page 2
Fig. 1 did not fit in the space left on page 2's right column, so it moved
to page 3 and left that column partly empty. Place the figure later in the
flow (after the policy descriptions) so the text fills page 2, and restore
the fuller run-procedure paragraph so page 3's left column fills too.

Co-Authored-By: Claude Opus 5.5 <noreply@anthropic.com>
Claude-Session: https://claude.ai/code/session_01AcTDn63VcP6Nv3uyNpnTqr
</commit_message>
<xml_diff>
--- a/paper/Adaptive_LLM_Model_Routing_IEEE_Paper.docx
+++ b/paper/Adaptive_LLM_Model_Routing_IEEE_Paper.docx
@@ -595,60 +595,6 @@
     <w:p>
       <w:pPr>
         <w:keepNext/>
-        <w:spacing w:before="80" w:after="0"/>
-        <w:jc w:val="center"/>
-      </w:pPr>
-      <w:r>
-        <w:drawing>
-          <wp:inline xmlns:a="http://schemas.openxmlformats.org/drawingml/2006/main" xmlns:pic="http://schemas.openxmlformats.org/drawingml/2006/picture">
-            <wp:extent cx="3063240" cy="3461461"/>
-            <wp:docPr id="1" name="Picture 1"/>
-            <wp:cNvGraphicFramePr>
-              <a:graphicFrameLocks noChangeAspect="1"/>
-            </wp:cNvGraphicFramePr>
-            <a:graphic>
-              <a:graphicData uri="http://schemas.openxmlformats.org/drawingml/2006/picture">
-                <pic:pic>
-                  <pic:nvPicPr>
-                    <pic:cNvPr id="0" name="fig1.png"/>
-                    <pic:cNvPicPr/>
-                  </pic:nvPicPr>
-                  <pic:blipFill>
-                    <a:blip r:embed="rId9"/>
-                    <a:stretch>
-                      <a:fillRect/>
-                    </a:stretch>
-                  </pic:blipFill>
-                  <pic:spPr>
-                    <a:xfrm>
-                      <a:off x="0" y="0"/>
-                      <a:ext cx="3063240" cy="3461461"/>
-                    </a:xfrm>
-                    <a:prstGeom prst="rect"/>
-                  </pic:spPr>
-                </pic:pic>
-              </a:graphicData>
-            </a:graphic>
-          </wp:inline>
-        </w:drawing>
-      </w:r>
-    </w:p>
-    <w:p>
-      <w:pPr>
-        <w:spacing w:before="40" w:after="80"/>
-        <w:jc w:val="center"/>
-      </w:pPr>
-      <w:r>
-        <w:rPr>
-          <w:rFonts w:ascii="Times New Roman" w:hAnsi="Times New Roman"/>
-          <w:sz w:val="16"/>
-        </w:rPr>
-        <w:t xml:space="preserve">Fig. 1. Proposed adaptive LLM routing loop with contextual-bandit feedback (dashed: the updated statistics drive future routing decisions).</w:t>
-      </w:r>
-    </w:p>
-    <w:p>
-      <w:pPr>
-        <w:keepNext/>
         <w:spacing w:before="60" w:after="20"/>
         <w:jc w:val="left"/>
       </w:pPr>
@@ -725,6 +671,60 @@
     </w:p>
     <w:p>
       <w:pPr>
+        <w:keepNext/>
+        <w:spacing w:before="80" w:after="0"/>
+        <w:jc w:val="center"/>
+      </w:pPr>
+      <w:r>
+        <w:drawing>
+          <wp:inline xmlns:a="http://schemas.openxmlformats.org/drawingml/2006/main" xmlns:pic="http://schemas.openxmlformats.org/drawingml/2006/picture">
+            <wp:extent cx="3063240" cy="3461461"/>
+            <wp:docPr id="1" name="Picture 1"/>
+            <wp:cNvGraphicFramePr>
+              <a:graphicFrameLocks noChangeAspect="1"/>
+            </wp:cNvGraphicFramePr>
+            <a:graphic>
+              <a:graphicData uri="http://schemas.openxmlformats.org/drawingml/2006/picture">
+                <pic:pic>
+                  <pic:nvPicPr>
+                    <pic:cNvPr id="0" name="fig1.png"/>
+                    <pic:cNvPicPr/>
+                  </pic:nvPicPr>
+                  <pic:blipFill>
+                    <a:blip r:embed="rId9"/>
+                    <a:stretch>
+                      <a:fillRect/>
+                    </a:stretch>
+                  </pic:blipFill>
+                  <pic:spPr>
+                    <a:xfrm>
+                      <a:off x="0" y="0"/>
+                      <a:ext cx="3063240" cy="3461461"/>
+                    </a:xfrm>
+                    <a:prstGeom prst="rect"/>
+                  </pic:spPr>
+                </pic:pic>
+              </a:graphicData>
+            </a:graphic>
+          </wp:inline>
+        </w:drawing>
+      </w:r>
+    </w:p>
+    <w:p>
+      <w:pPr>
+        <w:spacing w:before="40" w:after="80"/>
+        <w:jc w:val="center"/>
+      </w:pPr>
+      <w:r>
+        <w:rPr>
+          <w:rFonts w:ascii="Times New Roman" w:hAnsi="Times New Roman"/>
+          <w:sz w:val="16"/>
+        </w:rPr>
+        <w:t xml:space="preserve">Fig. 1. Proposed adaptive LLM routing loop with contextual-bandit feedback (dashed: the updated statistics drive future routing decisions).</w:t>
+      </w:r>
+    </w:p>
+    <w:p>
+      <w:pPr>
         <w:keepNext w:val="0"/>
         <w:spacing w:before="0" w:after="20" w:line="240" w:lineRule="auto"/>
         <w:ind w:firstLine="216"/>
@@ -750,7 +750,7 @@
           <w:rFonts w:ascii="Times New Roman" w:hAnsi="Times New Roman"/>
           <w:sz w:val="20"/>
         </w:rPr>
-        <w:t xml:space="preserve">One script runs the pilot: it serves each model in turn with vLLM, sends all 300 problems through a resumable collector, frees the GPU for the next model, and finally runs the replay with seeds 0-4.</w:t>
+        <w:t xml:space="preserve">One script runs the pilot. For each model in turn it starts a vLLM server with a 4,096-token context and 90% GPU-memory utilization, waits until the server answers, sends all 300 problems through the collector, and stops the server so that the next model has the whole GPU. The collector writes one record per query-model pair and skips pairs that are already logged, so an interrupted run resumes where it stopped. When all three models are done, the script runs the replay comparison with seeds 0-4.</w:t>
       </w:r>
     </w:p>
     <w:p>

</xml_diff>